<commit_message>
docs: redactar capitulo 1 del informe
</commit_message>
<xml_diff>
--- a/docs/informe/Informe_Primer_Avance_SalvemosLaComida.docx
+++ b/docs/informe/Informe_Primer_Avance_SalvemosLaComida.docx
@@ -719,14 +719,7 @@
                 <w:rStyle w:val="Hyperlink"/>
                 <w:noProof/>
               </w:rPr>
-              <w:t>1.2.</w:t>
-            </w:r>
-            <w:r>
-              <w:rPr>
-                <w:rStyle w:val="Hyperlink"/>
-                <w:noProof/>
-              </w:rPr>
-              <w:t>1</w:t>
+              <w:t>1.2.1</w:t>
             </w:r>
             <w:r>
               <w:rPr>
@@ -2465,7 +2458,40 @@
       </w:r>
       <w:bookmarkEnd w:id="1"/>
     </w:p>
-    <w:p/>
+    <w:p>
+      <w:pPr>
+        <w:pStyle w:val="NormalWeb"/>
+        <w:jc w:val="both"/>
+      </w:pPr>
+      <w:r>
+        <w:t>Al finalizar la jornada comercial, numerosos restaurantes, panaderías, cafeterías, supermercados y otros establecimientos de alimentos conservan productos preparados o próximos a vencer que no lograron venderse. Aunque parte de estos alimentos todavía puede encontrarse en condiciones adecuadas para el consumo dentro de un periodo determinado, termina siendo retirada o descartada.</w:t>
+      </w:r>
+    </w:p>
+    <w:p>
+      <w:pPr>
+        <w:pStyle w:val="NormalWeb"/>
+        <w:jc w:val="both"/>
+      </w:pPr>
+      <w:r>
+        <w:t>Esta situación se produce porque los establecimientos no pueden anticipar con exactitud la demanda diaria. Como consecuencia, pueden preparar o mantener una cantidad mayor de productos que la finalmente vendida. A ello se suman factores como la corta duración de ciertos alimentos, los horarios de cierre y las políticas internas de inventario.</w:t>
+      </w:r>
+    </w:p>
+    <w:p>
+      <w:pPr>
+        <w:pStyle w:val="NormalWeb"/>
+        <w:jc w:val="both"/>
+      </w:pPr>
+      <w:r>
+        <w:t>El desperdicio ocasiona pérdidas económicas para los comercios, debido a que no recuperan lo invertido en ingredientes, preparación, almacenamiento y trabajo. Asimismo, representa el desaprovechamiento de alimentos y recursos que podrían beneficiar a consumidores interesados en acceder a opciones de menor precio. Por esta razón, existe la necesidad de contar con un medio que conecte oportunamente a los establecimientos que poseen excedentes con personas dispuestas a adquirirlos y recogerlos antes de que termine su periodo adecuado de consumo.</w:t>
+      </w:r>
+    </w:p>
+    <w:p>
+      <w:pPr>
+        <w:rPr>
+          <w:lang w:val="es-PE"/>
+        </w:rPr>
+      </w:pPr>
+    </w:p>
     <w:p>
       <w:pPr>
         <w:pStyle w:val="Heading2"/>
@@ -2506,7 +2532,22 @@
       </w:r>
       <w:bookmarkEnd w:id="3"/>
     </w:p>
-    <w:p/>
+    <w:p>
+      <w:pPr>
+        <w:pStyle w:val="NormalWeb"/>
+        <w:jc w:val="both"/>
+      </w:pPr>
+      <w:r>
+        <w:t>Diseñar y desarrollar una plataforma web mobile-first que conecte a establecimientos de alimentos con excedentes aptos para el consumo y a consumidores interesados en adquirirlos mediante packs sorpresa a precios reducidos, facilitando su publicación, compra y recojo presencial para contribuir a la disminución del desperdicio alimentario.</w:t>
+      </w:r>
+    </w:p>
+    <w:p>
+      <w:pPr>
+        <w:rPr>
+          <w:lang w:val="es-PE"/>
+        </w:rPr>
+      </w:pPr>
+    </w:p>
     <w:p>
       <w:pPr>
         <w:pStyle w:val="Heading3"/>
@@ -2517,7 +2558,113 @@
       </w:r>
       <w:bookmarkEnd w:id="4"/>
     </w:p>
-    <w:p/>
+    <w:p>
+      <w:pPr>
+        <w:pStyle w:val="NormalWeb"/>
+        <w:numPr>
+          <w:ilvl w:val="0"/>
+          <w:numId w:val="4"/>
+        </w:numPr>
+        <w:jc w:val="both"/>
+      </w:pPr>
+      <w:r>
+        <w:t>Analizar y definir los requisitos, actores, procesos y clases de dominio necesarios para representar el funcionamiento de la plataforma.</w:t>
+      </w:r>
+    </w:p>
+    <w:p>
+      <w:pPr>
+        <w:pStyle w:val="NormalWeb"/>
+        <w:numPr>
+          <w:ilvl w:val="0"/>
+          <w:numId w:val="4"/>
+        </w:numPr>
+        <w:jc w:val="both"/>
+      </w:pPr>
+      <w:r>
+        <w:t>Diseñar una interfaz web mobile-first que permita a los usuarios utilizar las funciones principales desde celulares, tabletas y computadoras.</w:t>
+      </w:r>
+    </w:p>
+    <w:p>
+      <w:pPr>
+        <w:pStyle w:val="NormalWeb"/>
+        <w:numPr>
+          <w:ilvl w:val="0"/>
+          <w:numId w:val="4"/>
+        </w:numPr>
+        <w:jc w:val="both"/>
+      </w:pPr>
+      <w:r>
+        <w:t>Implementar la gestión de usuarios, empresas y establecimientos, incluyendo el registro, la revisión documental manual y la aprobación independiente de cada local.</w:t>
+      </w:r>
+    </w:p>
+    <w:p>
+      <w:pPr>
+        <w:pStyle w:val="NormalWeb"/>
+        <w:numPr>
+          <w:ilvl w:val="0"/>
+          <w:numId w:val="4"/>
+        </w:numPr>
+        <w:jc w:val="both"/>
+      </w:pPr>
+      <w:r>
+        <w:t>Desarrollar la publicación de packs sorpresa mediante ofertas con variantes de tamaño, precio, stock y horarios de recojo configurables.</w:t>
+      </w:r>
+    </w:p>
+    <w:p>
+      <w:pPr>
+        <w:pStyle w:val="NormalWeb"/>
+        <w:numPr>
+          <w:ilvl w:val="0"/>
+          <w:numId w:val="4"/>
+        </w:numPr>
+        <w:jc w:val="both"/>
+      </w:pPr>
+      <w:r>
+        <w:t>Permitir que los consumidores busquen establecimientos, consulten la información de los packs y realicen compras mediante pagos simulados.</w:t>
+      </w:r>
+    </w:p>
+    <w:p>
+      <w:pPr>
+        <w:pStyle w:val="NormalWeb"/>
+        <w:numPr>
+          <w:ilvl w:val="0"/>
+          <w:numId w:val="4"/>
+        </w:numPr>
+        <w:jc w:val="both"/>
+      </w:pPr>
+      <w:r>
+        <w:t xml:space="preserve">Gestionar las reservas, cancelaciones, reembolsos simulados y </w:t>
+      </w:r>
+      <w:proofErr w:type="spellStart"/>
+      <w:r>
+        <w:t>recojos</w:t>
+      </w:r>
+      <w:proofErr w:type="spellEnd"/>
+      <w:r>
+        <w:t xml:space="preserve"> presenciales mediante un código único de identificación.</w:t>
+      </w:r>
+    </w:p>
+    <w:p>
+      <w:pPr>
+        <w:pStyle w:val="NormalWeb"/>
+        <w:numPr>
+          <w:ilvl w:val="0"/>
+          <w:numId w:val="4"/>
+        </w:numPr>
+        <w:jc w:val="both"/>
+      </w:pPr>
+      <w:r>
+        <w:lastRenderedPageBreak/>
+        <w:t>Incorporar reseñas e indicadores que permitan consultar los resultados comerciales y representar el impacto generado por la recuperación de alimentos.</w:t>
+      </w:r>
+    </w:p>
+    <w:p>
+      <w:pPr>
+        <w:rPr>
+          <w:lang w:val="es-PE"/>
+        </w:rPr>
+      </w:pPr>
+    </w:p>
     <w:p>
       <w:pPr>
         <w:pStyle w:val="Heading2"/>
@@ -2534,7 +2681,82 @@
       </w:r>
       <w:bookmarkEnd w:id="5"/>
     </w:p>
-    <w:p/>
+    <w:p>
+      <w:pPr>
+        <w:pStyle w:val="NormalWeb"/>
+        <w:jc w:val="both"/>
+      </w:pPr>
+      <w:r>
+        <w:t>El proyecto abarcará el análisis, diseño y desarrollo de una plataforma web mobile-first orientada a la reducción del desperdicio de alimentos preparados y productos próximos a vencer. El sistema permitirá la participación de consumidores, propietarios de empresas, personal de establecimientos y administradores de la plataforma.</w:t>
+      </w:r>
+    </w:p>
+    <w:p>
+      <w:pPr>
+        <w:pStyle w:val="NormalWeb"/>
+        <w:jc w:val="both"/>
+      </w:pPr>
+      <w:r>
+        <w:t>Los propietarios podrán registrar una empresa con varios establecimientos físicos. Cada local tendrá una ubicación, documentación, proceso de aprobación y cuenta operativa propios. Los administradores revisarán manualmente los documentos presentados y podrán aprobar, rechazar o suspender un establecimiento según su situación documental.</w:t>
+      </w:r>
+    </w:p>
+    <w:p>
+      <w:pPr>
+        <w:pStyle w:val="NormalWeb"/>
+        <w:jc w:val="both"/>
+      </w:pPr>
+      <w:r>
+        <w:t>Los establecimientos aprobados podrán publicar un pack sorpresa mediante una oferta activa con diferentes tamaños, precios, cantidades disponibles y horarios de recojo. Los consumidores podrán buscar establecimientos mediante filtros de ubicación textual, precio y calificación; consultar la información disponible del pack; seleccionar una variante; y realizar una compra mediante pagos simulados con tarjeta de débito o Yape.</w:t>
+      </w:r>
+    </w:p>
+    <w:p>
+      <w:pPr>
+        <w:pStyle w:val="NormalWeb"/>
+        <w:jc w:val="both"/>
+      </w:pPr>
+      <w:r>
+        <w:t>La plataforma también contemplará el acceso presencial mediante un código QR ubicado en el establecimiento, donde se habilitará adicionalmente el pago en efectivo. Después de confirmar una compra, el sistema generará una boleta simulada y un código de recojo. Asimismo, se gestionarán las cancelaciones permitidas, los reembolsos simulados, las comisiones, la confirmación del recojo, las reseñas posteriores y el registro conceptual del impacto generado.</w:t>
+      </w:r>
+    </w:p>
+    <w:p>
+      <w:pPr>
+        <w:pStyle w:val="NormalWeb"/>
+        <w:jc w:val="both"/>
+      </w:pPr>
+      <w:r>
+        <w:t xml:space="preserve">La solución se implementará como una aplicación web responsive, con un </w:t>
+      </w:r>
+      <w:proofErr w:type="spellStart"/>
+      <w:r>
+        <w:t>backend</w:t>
+      </w:r>
+      <w:proofErr w:type="spellEnd"/>
+      <w:r>
+        <w:t xml:space="preserve"> desarrollado en Java 21 y Spring Boot, un </w:t>
+      </w:r>
+      <w:proofErr w:type="spellStart"/>
+      <w:r>
+        <w:t>frontend</w:t>
+      </w:r>
+      <w:proofErr w:type="spellEnd"/>
+      <w:r>
+        <w:t xml:space="preserve"> basado en HTML, CSS, JavaScript y </w:t>
+      </w:r>
+      <w:proofErr w:type="spellStart"/>
+      <w:r>
+        <w:t>Tailwind</w:t>
+      </w:r>
+      <w:proofErr w:type="spellEnd"/>
+      <w:r>
+        <w:t xml:space="preserve"> CSS, y una base de datos MySQL gestionada mediante Spring Data JPA.</w:t>
+      </w:r>
+    </w:p>
+    <w:p>
+      <w:pPr>
+        <w:rPr>
+          <w:lang w:val="es-PE"/>
+        </w:rPr>
+      </w:pPr>
+    </w:p>
     <w:p>
       <w:pPr>
         <w:pStyle w:val="Heading2"/>
@@ -2551,7 +2773,318 @@
       </w:r>
       <w:bookmarkEnd w:id="6"/>
     </w:p>
-    <w:p/>
+    <w:p>
+      <w:pPr>
+        <w:jc w:val="both"/>
+        <w:rPr>
+          <w:lang w:val="es-PE"/>
+        </w:rPr>
+      </w:pPr>
+      <w:r>
+        <w:rPr>
+          <w:lang w:val="es-PE"/>
+        </w:rPr>
+        <w:t>Debido al tiempo disponible, los recursos académicos y el nivel de desarrollo previsto, la primera versión de la plataforma presentará las siguientes limitaciones:</w:t>
+      </w:r>
+    </w:p>
+    <w:p>
+      <w:pPr>
+        <w:numPr>
+          <w:ilvl w:val="0"/>
+          <w:numId w:val="3"/>
+        </w:numPr>
+        <w:jc w:val="both"/>
+        <w:rPr>
+          <w:lang w:val="es-PE"/>
+        </w:rPr>
+      </w:pPr>
+      <w:r>
+        <w:rPr>
+          <w:lang w:val="es-PE"/>
+        </w:rPr>
+        <w:t>Los pagos con tarjeta de débito y Yape serán simulados, por lo que no existirá conexión con bancos, billeteras digitales ni pasarelas de pago reales.</w:t>
+      </w:r>
+    </w:p>
+    <w:p>
+      <w:pPr>
+        <w:numPr>
+          <w:ilvl w:val="0"/>
+          <w:numId w:val="3"/>
+        </w:numPr>
+        <w:jc w:val="both"/>
+        <w:rPr>
+          <w:lang w:val="es-PE"/>
+        </w:rPr>
+      </w:pPr>
+      <w:r>
+        <w:rPr>
+          <w:lang w:val="es-PE"/>
+        </w:rPr>
+        <w:t xml:space="preserve">La plataforma no ofrecerá servicio de </w:t>
+      </w:r>
+      <w:proofErr w:type="spellStart"/>
+      <w:r>
+        <w:rPr>
+          <w:lang w:val="es-PE"/>
+        </w:rPr>
+        <w:t>delivery</w:t>
+      </w:r>
+      <w:proofErr w:type="spellEnd"/>
+      <w:r>
+        <w:rPr>
+          <w:lang w:val="es-PE"/>
+        </w:rPr>
+        <w:t>. El consumidor deberá acudir personalmente al establecimiento para recoger su compra.</w:t>
+      </w:r>
+    </w:p>
+    <w:p>
+      <w:pPr>
+        <w:numPr>
+          <w:ilvl w:val="0"/>
+          <w:numId w:val="3"/>
+        </w:numPr>
+        <w:jc w:val="both"/>
+        <w:rPr>
+          <w:lang w:val="es-PE"/>
+        </w:rPr>
+      </w:pPr>
+      <w:r>
+        <w:rPr>
+          <w:lang w:val="es-PE"/>
+        </w:rPr>
+        <w:t>La búsqueda de establecimientos utilizará información textual, como distrito y dirección. No se incorporarán GPS, mapas interactivos ni seguimiento de ubicación en tiempo real.</w:t>
+      </w:r>
+    </w:p>
+    <w:p>
+      <w:pPr>
+        <w:numPr>
+          <w:ilvl w:val="0"/>
+          <w:numId w:val="3"/>
+        </w:numPr>
+        <w:jc w:val="both"/>
+        <w:rPr>
+          <w:lang w:val="es-PE"/>
+        </w:rPr>
+      </w:pPr>
+      <w:r>
+        <w:rPr>
+          <w:lang w:val="es-PE"/>
+        </w:rPr>
+        <w:lastRenderedPageBreak/>
+        <w:t>La revisión de los documentos presentados por cada establecimiento será realizada manualmente por un administrador. No se utilizará reconocimiento óptico de caracteres ni validación automática mediante OCR.</w:t>
+      </w:r>
+    </w:p>
+    <w:p>
+      <w:pPr>
+        <w:numPr>
+          <w:ilvl w:val="0"/>
+          <w:numId w:val="3"/>
+        </w:numPr>
+        <w:jc w:val="both"/>
+        <w:rPr>
+          <w:lang w:val="es-PE"/>
+        </w:rPr>
+      </w:pPr>
+      <w:r>
+        <w:rPr>
+          <w:lang w:val="es-PE"/>
+        </w:rPr>
+        <w:t>La plataforma revisará el estado y la vigencia de los documentos proporcionados, pero no actuará como una autoridad sanitaria ni emitirá certificaciones propias.</w:t>
+      </w:r>
+    </w:p>
+    <w:p>
+      <w:pPr>
+        <w:numPr>
+          <w:ilvl w:val="0"/>
+          <w:numId w:val="3"/>
+        </w:numPr>
+        <w:jc w:val="both"/>
+        <w:rPr>
+          <w:lang w:val="es-PE"/>
+        </w:rPr>
+      </w:pPr>
+      <w:r>
+        <w:rPr>
+          <w:lang w:val="es-PE"/>
+        </w:rPr>
+        <w:t>Cada establecimiento utilizará una cuenta operativa compartida. Por ello, la primera versión no permitirá identificar individualmente al trabajador que realizó cada operación.</w:t>
+      </w:r>
+    </w:p>
+    <w:p>
+      <w:pPr>
+        <w:numPr>
+          <w:ilvl w:val="0"/>
+          <w:numId w:val="3"/>
+        </w:numPr>
+        <w:jc w:val="both"/>
+        <w:rPr>
+          <w:lang w:val="es-PE"/>
+        </w:rPr>
+      </w:pPr>
+      <w:r>
+        <w:rPr>
+          <w:lang w:val="es-PE"/>
+        </w:rPr>
+        <w:t>Cada establecimiento podrá mantener únicamente una oferta activa de pack sorpresa al mismo tiempo, aunque dicha oferta podrá incluir diferentes tamaños, precios y cantidades disponibles.</w:t>
+      </w:r>
+    </w:p>
+    <w:p>
+      <w:pPr>
+        <w:numPr>
+          <w:ilvl w:val="0"/>
+          <w:numId w:val="3"/>
+        </w:numPr>
+        <w:jc w:val="both"/>
+        <w:rPr>
+          <w:lang w:val="es-PE"/>
+        </w:rPr>
+      </w:pPr>
+      <w:r>
+        <w:rPr>
+          <w:lang w:val="es-PE"/>
+        </w:rPr>
+        <w:t>La solución será una aplicación web responsive y no contará inicialmente con aplicaciones móviles nativas para Android o iOS.</w:t>
+      </w:r>
+    </w:p>
+    <w:p>
+      <w:pPr>
+        <w:numPr>
+          <w:ilvl w:val="0"/>
+          <w:numId w:val="3"/>
+        </w:numPr>
+        <w:jc w:val="both"/>
+        <w:rPr>
+          <w:lang w:val="es-PE"/>
+        </w:rPr>
+      </w:pPr>
+      <w:r>
+        <w:rPr>
+          <w:lang w:val="es-PE"/>
+        </w:rPr>
+        <w:t>El inicio de sesión mediante servicios externos, como Google, no será funcional durante esta versión.</w:t>
+      </w:r>
+    </w:p>
+    <w:p>
+      <w:pPr>
+        <w:numPr>
+          <w:ilvl w:val="0"/>
+          <w:numId w:val="3"/>
+        </w:numPr>
+        <w:jc w:val="both"/>
+        <w:rPr>
+          <w:lang w:val="es-PE"/>
+        </w:rPr>
+      </w:pPr>
+      <w:r>
+        <w:rPr>
+          <w:lang w:val="es-PE"/>
+        </w:rPr>
+        <w:t>El cálculo del alimento recuperado y del CO₂ evitado será representado de forma conceptual, ya que la fórmula y los factores de conversión exactos se definirán en una etapa posterior.</w:t>
+      </w:r>
+    </w:p>
+    <w:p>
+      <w:pPr>
+        <w:jc w:val="both"/>
+        <w:rPr>
+          <w:lang w:val="es-PE"/>
+        </w:rPr>
+      </w:pPr>
+      <w:r>
+        <w:rPr>
+          <w:lang w:val="es-PE"/>
+        </w:rPr>
+        <w:t xml:space="preserve">Estas limitaciones </w:t>
+      </w:r>
+      <w:r>
+        <w:rPr>
+          <w:lang w:val="es-PE"/>
+        </w:rPr>
+        <w:t xml:space="preserve">nos </w:t>
+      </w:r>
+      <w:r>
+        <w:rPr>
+          <w:lang w:val="es-PE"/>
+        </w:rPr>
+        <w:t>permiten concentrar el desarrollo en las funciones principales del marketplace y mantener un alcance viable para el periodo académico establecido.</w:t>
+      </w:r>
+    </w:p>
+    <w:p>
+      <w:pPr>
+        <w:rPr>
+          <w:lang w:val="es-PE"/>
+        </w:rPr>
+      </w:pPr>
+    </w:p>
+    <w:p>
+      <w:pPr>
+        <w:rPr>
+          <w:lang w:val="es-PE"/>
+        </w:rPr>
+      </w:pPr>
+    </w:p>
+    <w:p>
+      <w:pPr>
+        <w:rPr>
+          <w:lang w:val="es-PE"/>
+        </w:rPr>
+      </w:pPr>
+    </w:p>
+    <w:p>
+      <w:pPr>
+        <w:rPr>
+          <w:lang w:val="es-PE"/>
+        </w:rPr>
+      </w:pPr>
+    </w:p>
+    <w:p>
+      <w:pPr>
+        <w:rPr>
+          <w:lang w:val="es-PE"/>
+        </w:rPr>
+      </w:pPr>
+    </w:p>
+    <w:p>
+      <w:pPr>
+        <w:rPr>
+          <w:lang w:val="es-PE"/>
+        </w:rPr>
+      </w:pPr>
+    </w:p>
+    <w:p>
+      <w:pPr>
+        <w:rPr>
+          <w:lang w:val="es-PE"/>
+        </w:rPr>
+      </w:pPr>
+    </w:p>
+    <w:p>
+      <w:pPr>
+        <w:rPr>
+          <w:lang w:val="es-PE"/>
+        </w:rPr>
+      </w:pPr>
+    </w:p>
+    <w:p>
+      <w:pPr>
+        <w:rPr>
+          <w:lang w:val="es-PE"/>
+        </w:rPr>
+      </w:pPr>
+    </w:p>
+    <w:p>
+      <w:pPr>
+        <w:rPr>
+          <w:lang w:val="es-PE"/>
+        </w:rPr>
+      </w:pPr>
+    </w:p>
+    <w:p>
+      <w:pPr>
+        <w:rPr>
+          <w:lang w:val="es-PE"/>
+        </w:rPr>
+      </w:pPr>
+    </w:p>
     <w:p>
       <w:pPr>
         <w:pStyle w:val="Heading1"/>
@@ -2568,6 +3101,7 @@
         <w:rPr>
           <w:rFonts w:cs="Times New Roman"/>
         </w:rPr>
+        <w:lastRenderedPageBreak/>
         <w:t>CAPITULO 2 MARCO TEÓRICO</w:t>
       </w:r>
       <w:bookmarkEnd w:id="7"/>
@@ -2753,7 +3287,6 @@
         <w:rPr>
           <w:rFonts w:cs="Times New Roman"/>
         </w:rPr>
-        <w:lastRenderedPageBreak/>
         <w:t>Diagrama de clases</w:t>
       </w:r>
       <w:bookmarkEnd w:id="17"/>
@@ -2819,6 +3352,7 @@
         <w:rPr>
           <w:rFonts w:cs="Times New Roman"/>
         </w:rPr>
+        <w:lastRenderedPageBreak/>
         <w:t>Diagrama ER de base de datos</w:t>
       </w:r>
       <w:bookmarkEnd w:id="18"/>
@@ -3066,7 +3600,6 @@
           <w:i/>
           <w:iCs/>
         </w:rPr>
-        <w:lastRenderedPageBreak/>
         <w:t xml:space="preserve">Adjuntar </w:t>
       </w:r>
       <w:r>
@@ -3282,6 +3815,268 @@
 <file path=word/numbering.xml><?xml version="1.0" encoding="utf-8"?>
 <w:numbering xmlns:wpc="http://schemas.microsoft.com/office/word/2010/wordprocessingCanvas" xmlns:cx="http://schemas.microsoft.com/office/drawing/2014/chartex" xmlns:cx1="http://schemas.microsoft.com/office/drawing/2015/9/8/chartex" xmlns:cx2="http://schemas.microsoft.com/office/drawing/2015/10/21/chartex" xmlns:cx3="http://schemas.microsoft.com/office/drawing/2016/5/9/chartex" xmlns:cx4="http://schemas.microsoft.com/office/drawing/2016/5/10/chartex" xmlns:cx5="http://schemas.microsoft.com/office/drawing/2016/5/11/chartex" xmlns:cx6="http://schemas.microsoft.com/office/drawing/2016/5/12/chartex" xmlns:cx7="http://schemas.microsoft.com/office/drawing/2016/5/13/chartex" xmlns:cx8="http://schemas.microsoft.com/office/drawing/2016/5/14/chartex" xmlns:mc="http://schemas.openxmlformats.org/markup-compatibility/2006" xmlns:aink="http://schemas.microsoft.com/office/drawing/2016/ink" xmlns:am3d="http://schemas.microsoft.com/office/drawing/2017/model3d" xmlns:o="urn:schemas-microsoft-com:office:office" xmlns:oel="http://schemas.microsoft.com/office/2019/extlst" xmlns:r="http://schemas.openxmlformats.org/officeDocument/2006/relationships" xmlns:m="http://schemas.openxmlformats.org/officeDocument/2006/math" xmlns:v="urn:schemas-microsoft-com:vml" xmlns:wp14="http://schemas.microsoft.com/office/word/2010/wordprocessingDrawing" xmlns:wp="http://schemas.openxmlformats.org/drawingml/2006/wordprocessingDrawing" xmlns:w10="urn:schemas-microsoft-com:office:word" xmlns:w="http://schemas.openxmlformats.org/wordprocessingml/2006/main" xmlns:w14="http://schemas.microsoft.com/office/word/2010/wordml" xmlns:w15="http://schemas.microsoft.com/office/word/2012/wordml" xmlns:w16cex="http://schemas.microsoft.com/office/word/2018/wordml/cex" xmlns:w16cid="http://schemas.microsoft.com/office/word/2016/wordml/cid" xmlns:w16="http://schemas.microsoft.com/office/word/2018/wordml" xmlns:w16du="http://schemas.microsoft.com/office/word/2023/wordml/word16du" xmlns:w16sdtdh="http://schemas.microsoft.com/office/word/2020/wordml/sdtdatahash" xmlns:w16sdtfl="http://schemas.microsoft.com/office/word/2024/wordml/sdtformatlock" xmlns:w16se="http://schemas.microsoft.com/office/word/2015/wordml/symex" xmlns:wpg="http://schemas.microsoft.com/office/word/2010/wordprocessingGroup" xmlns:wpi="http://schemas.microsoft.com/office/word/2010/wordprocessingInk" xmlns:wne="http://schemas.microsoft.com/office/word/2006/wordml" xmlns:wps="http://schemas.microsoft.com/office/word/2010/wordprocessingShape" mc:Ignorable="w14 w15 w16se w16cid w16 w16cex w16sdtdh w16sdtfl w16du wp14">
   <w:abstractNum w:abstractNumId="0" w15:restartNumberingAfterBreak="0">
+    <w:nsid w:val="36727132"/>
+    <w:multiLevelType w:val="multilevel"/>
+    <w:tmpl w:val="A4802CF2"/>
+    <w:lvl w:ilvl="0">
+      <w:start w:val="1"/>
+      <w:numFmt w:val="bullet"/>
+      <w:lvlText w:val=""/>
+      <w:lvlJc w:val="left"/>
+      <w:pPr>
+        <w:tabs>
+          <w:tab w:val="num" w:pos="720"/>
+        </w:tabs>
+        <w:ind w:left="720" w:hanging="360"/>
+      </w:pPr>
+      <w:rPr>
+        <w:rFonts w:ascii="Symbol" w:hAnsi="Symbol" w:hint="default"/>
+        <w:sz w:val="20"/>
+      </w:rPr>
+    </w:lvl>
+    <w:lvl w:ilvl="1" w:tentative="1">
+      <w:start w:val="1"/>
+      <w:numFmt w:val="bullet"/>
+      <w:lvlText w:val="o"/>
+      <w:lvlJc w:val="left"/>
+      <w:pPr>
+        <w:tabs>
+          <w:tab w:val="num" w:pos="1440"/>
+        </w:tabs>
+        <w:ind w:left="1440" w:hanging="360"/>
+      </w:pPr>
+      <w:rPr>
+        <w:rFonts w:ascii="Courier New" w:hAnsi="Courier New" w:hint="default"/>
+        <w:sz w:val="20"/>
+      </w:rPr>
+    </w:lvl>
+    <w:lvl w:ilvl="2" w:tentative="1">
+      <w:start w:val="1"/>
+      <w:numFmt w:val="bullet"/>
+      <w:lvlText w:val=""/>
+      <w:lvlJc w:val="left"/>
+      <w:pPr>
+        <w:tabs>
+          <w:tab w:val="num" w:pos="2160"/>
+        </w:tabs>
+        <w:ind w:left="2160" w:hanging="360"/>
+      </w:pPr>
+      <w:rPr>
+        <w:rFonts w:ascii="Wingdings" w:hAnsi="Wingdings" w:hint="default"/>
+        <w:sz w:val="20"/>
+      </w:rPr>
+    </w:lvl>
+    <w:lvl w:ilvl="3" w:tentative="1">
+      <w:start w:val="1"/>
+      <w:numFmt w:val="bullet"/>
+      <w:lvlText w:val=""/>
+      <w:lvlJc w:val="left"/>
+      <w:pPr>
+        <w:tabs>
+          <w:tab w:val="num" w:pos="2880"/>
+        </w:tabs>
+        <w:ind w:left="2880" w:hanging="360"/>
+      </w:pPr>
+      <w:rPr>
+        <w:rFonts w:ascii="Wingdings" w:hAnsi="Wingdings" w:hint="default"/>
+        <w:sz w:val="20"/>
+      </w:rPr>
+    </w:lvl>
+    <w:lvl w:ilvl="4" w:tentative="1">
+      <w:start w:val="1"/>
+      <w:numFmt w:val="bullet"/>
+      <w:lvlText w:val=""/>
+      <w:lvlJc w:val="left"/>
+      <w:pPr>
+        <w:tabs>
+          <w:tab w:val="num" w:pos="3600"/>
+        </w:tabs>
+        <w:ind w:left="3600" w:hanging="360"/>
+      </w:pPr>
+      <w:rPr>
+        <w:rFonts w:ascii="Wingdings" w:hAnsi="Wingdings" w:hint="default"/>
+        <w:sz w:val="20"/>
+      </w:rPr>
+    </w:lvl>
+    <w:lvl w:ilvl="5" w:tentative="1">
+      <w:start w:val="1"/>
+      <w:numFmt w:val="bullet"/>
+      <w:lvlText w:val=""/>
+      <w:lvlJc w:val="left"/>
+      <w:pPr>
+        <w:tabs>
+          <w:tab w:val="num" w:pos="4320"/>
+        </w:tabs>
+        <w:ind w:left="4320" w:hanging="360"/>
+      </w:pPr>
+      <w:rPr>
+        <w:rFonts w:ascii="Wingdings" w:hAnsi="Wingdings" w:hint="default"/>
+        <w:sz w:val="20"/>
+      </w:rPr>
+    </w:lvl>
+    <w:lvl w:ilvl="6" w:tentative="1">
+      <w:start w:val="1"/>
+      <w:numFmt w:val="bullet"/>
+      <w:lvlText w:val=""/>
+      <w:lvlJc w:val="left"/>
+      <w:pPr>
+        <w:tabs>
+          <w:tab w:val="num" w:pos="5040"/>
+        </w:tabs>
+        <w:ind w:left="5040" w:hanging="360"/>
+      </w:pPr>
+      <w:rPr>
+        <w:rFonts w:ascii="Wingdings" w:hAnsi="Wingdings" w:hint="default"/>
+        <w:sz w:val="20"/>
+      </w:rPr>
+    </w:lvl>
+    <w:lvl w:ilvl="7" w:tentative="1">
+      <w:start w:val="1"/>
+      <w:numFmt w:val="bullet"/>
+      <w:lvlText w:val=""/>
+      <w:lvlJc w:val="left"/>
+      <w:pPr>
+        <w:tabs>
+          <w:tab w:val="num" w:pos="5760"/>
+        </w:tabs>
+        <w:ind w:left="5760" w:hanging="360"/>
+      </w:pPr>
+      <w:rPr>
+        <w:rFonts w:ascii="Wingdings" w:hAnsi="Wingdings" w:hint="default"/>
+        <w:sz w:val="20"/>
+      </w:rPr>
+    </w:lvl>
+    <w:lvl w:ilvl="8" w:tentative="1">
+      <w:start w:val="1"/>
+      <w:numFmt w:val="bullet"/>
+      <w:lvlText w:val=""/>
+      <w:lvlJc w:val="left"/>
+      <w:pPr>
+        <w:tabs>
+          <w:tab w:val="num" w:pos="6480"/>
+        </w:tabs>
+        <w:ind w:left="6480" w:hanging="360"/>
+      </w:pPr>
+      <w:rPr>
+        <w:rFonts w:ascii="Wingdings" w:hAnsi="Wingdings" w:hint="default"/>
+        <w:sz w:val="20"/>
+      </w:rPr>
+    </w:lvl>
+  </w:abstractNum>
+  <w:abstractNum w:abstractNumId="1" w15:restartNumberingAfterBreak="0">
+    <w:nsid w:val="4EDD4128"/>
+    <w:multiLevelType w:val="multilevel"/>
+    <w:tmpl w:val="CB4A7778"/>
+    <w:lvl w:ilvl="0">
+      <w:start w:val="1"/>
+      <w:numFmt w:val="decimal"/>
+      <w:lvlText w:val="%1."/>
+      <w:lvlJc w:val="left"/>
+      <w:pPr>
+        <w:tabs>
+          <w:tab w:val="num" w:pos="720"/>
+        </w:tabs>
+        <w:ind w:left="720" w:hanging="360"/>
+      </w:pPr>
+    </w:lvl>
+    <w:lvl w:ilvl="1" w:tentative="1">
+      <w:start w:val="1"/>
+      <w:numFmt w:val="decimal"/>
+      <w:lvlText w:val="%2."/>
+      <w:lvlJc w:val="left"/>
+      <w:pPr>
+        <w:tabs>
+          <w:tab w:val="num" w:pos="1440"/>
+        </w:tabs>
+        <w:ind w:left="1440" w:hanging="360"/>
+      </w:pPr>
+    </w:lvl>
+    <w:lvl w:ilvl="2" w:tentative="1">
+      <w:start w:val="1"/>
+      <w:numFmt w:val="decimal"/>
+      <w:lvlText w:val="%3."/>
+      <w:lvlJc w:val="left"/>
+      <w:pPr>
+        <w:tabs>
+          <w:tab w:val="num" w:pos="2160"/>
+        </w:tabs>
+        <w:ind w:left="2160" w:hanging="360"/>
+      </w:pPr>
+    </w:lvl>
+    <w:lvl w:ilvl="3" w:tentative="1">
+      <w:start w:val="1"/>
+      <w:numFmt w:val="decimal"/>
+      <w:lvlText w:val="%4."/>
+      <w:lvlJc w:val="left"/>
+      <w:pPr>
+        <w:tabs>
+          <w:tab w:val="num" w:pos="2880"/>
+        </w:tabs>
+        <w:ind w:left="2880" w:hanging="360"/>
+      </w:pPr>
+    </w:lvl>
+    <w:lvl w:ilvl="4" w:tentative="1">
+      <w:start w:val="1"/>
+      <w:numFmt w:val="decimal"/>
+      <w:lvlText w:val="%5."/>
+      <w:lvlJc w:val="left"/>
+      <w:pPr>
+        <w:tabs>
+          <w:tab w:val="num" w:pos="3600"/>
+        </w:tabs>
+        <w:ind w:left="3600" w:hanging="360"/>
+      </w:pPr>
+    </w:lvl>
+    <w:lvl w:ilvl="5" w:tentative="1">
+      <w:start w:val="1"/>
+      <w:numFmt w:val="decimal"/>
+      <w:lvlText w:val="%6."/>
+      <w:lvlJc w:val="left"/>
+      <w:pPr>
+        <w:tabs>
+          <w:tab w:val="num" w:pos="4320"/>
+        </w:tabs>
+        <w:ind w:left="4320" w:hanging="360"/>
+      </w:pPr>
+    </w:lvl>
+    <w:lvl w:ilvl="6" w:tentative="1">
+      <w:start w:val="1"/>
+      <w:numFmt w:val="decimal"/>
+      <w:lvlText w:val="%7."/>
+      <w:lvlJc w:val="left"/>
+      <w:pPr>
+        <w:tabs>
+          <w:tab w:val="num" w:pos="5040"/>
+        </w:tabs>
+        <w:ind w:left="5040" w:hanging="360"/>
+      </w:pPr>
+    </w:lvl>
+    <w:lvl w:ilvl="7" w:tentative="1">
+      <w:start w:val="1"/>
+      <w:numFmt w:val="decimal"/>
+      <w:lvlText w:val="%8."/>
+      <w:lvlJc w:val="left"/>
+      <w:pPr>
+        <w:tabs>
+          <w:tab w:val="num" w:pos="5760"/>
+        </w:tabs>
+        <w:ind w:left="5760" w:hanging="360"/>
+      </w:pPr>
+    </w:lvl>
+    <w:lvl w:ilvl="8" w:tentative="1">
+      <w:start w:val="1"/>
+      <w:numFmt w:val="decimal"/>
+      <w:lvlText w:val="%9."/>
+      <w:lvlJc w:val="left"/>
+      <w:pPr>
+        <w:tabs>
+          <w:tab w:val="num" w:pos="6480"/>
+        </w:tabs>
+        <w:ind w:left="6480" w:hanging="360"/>
+      </w:pPr>
+    </w:lvl>
+  </w:abstractNum>
+  <w:abstractNum w:abstractNumId="2" w15:restartNumberingAfterBreak="0">
     <w:nsid w:val="55014280"/>
     <w:multiLevelType w:val="multilevel"/>
     <w:tmpl w:val="151E8C76"/>
@@ -3379,7 +4174,7 @@
       </w:pPr>
     </w:lvl>
   </w:abstractNum>
-  <w:abstractNum w:abstractNumId="1" w15:restartNumberingAfterBreak="0">
+  <w:abstractNum w:abstractNumId="3" w15:restartNumberingAfterBreak="0">
     <w:nsid w:val="60863327"/>
     <w:multiLevelType w:val="hybridMultilevel"/>
     <w:tmpl w:val="CC126FE2"/>
@@ -3493,9 +4288,15 @@
     </w:lvl>
   </w:abstractNum>
   <w:num w:numId="1" w16cid:durableId="1226794499">
+    <w:abstractNumId w:val="2"/>
+  </w:num>
+  <w:num w:numId="2" w16cid:durableId="1713000286">
+    <w:abstractNumId w:val="3"/>
+  </w:num>
+  <w:num w:numId="3" w16cid:durableId="1176849368">
     <w:abstractNumId w:val="0"/>
   </w:num>
-  <w:num w:numId="2" w16cid:durableId="1713000286">
+  <w:num w:numId="4" w16cid:durableId="1734425577">
     <w:abstractNumId w:val="1"/>
   </w:num>
   <w:numIdMacAtCleanup w:val="2"/>
@@ -4707,6 +5508,23 @@
       </w:tcPr>
     </w:tblStylePr>
   </w:style>
+  <w:style w:type="paragraph" w:styleId="NormalWeb">
+    <w:name w:val="Normal (Web)"/>
+    <w:basedOn w:val="Normal"/>
+    <w:uiPriority w:val="99"/>
+    <w:semiHidden/>
+    <w:unhideWhenUsed/>
+    <w:rsid w:val="001B6276"/>
+    <w:pPr>
+      <w:spacing w:before="100" w:beforeAutospacing="1" w:after="100" w:afterAutospacing="1" w:line="240" w:lineRule="auto"/>
+    </w:pPr>
+    <w:rPr>
+      <w:rFonts w:eastAsia="Times New Roman" w:cs="Times New Roman"/>
+      <w:kern w:val="0"/>
+      <w:lang w:val="es-PE" w:eastAsia="es-PE"/>
+      <w14:ligatures w14:val="none"/>
+    </w:rPr>
+  </w:style>
 </w:styles>
 </file>
 

</xml_diff>

<commit_message>
doc: parte de Emanuel finalizada
</commit_message>
<xml_diff>
--- a/docs/informe/Informe_Primer_Avance_SalvemosLaComida.docx
+++ b/docs/informe/Informe_Primer_Avance_SalvemosLaComida.docx
@@ -173,7 +173,6 @@
           <w:rFonts w:cs="Times New Roman"/>
           <w:b/>
           <w:bCs/>
-          <w:sz w:val="36"/>
         </w:rPr>
       </w:pPr>
       <w:r>
@@ -183,18 +182,8 @@
           <w:bCs/>
           <w:sz w:val="36"/>
         </w:rPr>
-        <w:t>“Salvemos la comida”</w:t>
-      </w:r>
-    </w:p>
-    <w:p>
-      <w:pPr>
-        <w:jc w:val="center"/>
-        <w:rPr>
-          <w:rFonts w:cs="Times New Roman"/>
-          <w:b/>
-          <w:bCs/>
-        </w:rPr>
-      </w:pPr>
+        <w:t>“MealFlow - Lo bueno sigue fluyendo”</w:t>
+      </w:r>
     </w:p>
     <w:p>
       <w:pPr>
@@ -412,7 +401,7 @@
       <w:sdtContent>
         <w:p>
           <w:pPr>
-            <w:pStyle w:val="TOCHeading"/>
+            <w:pStyle w:val="TtuloTDC"/>
             <w:rPr>
               <w:rFonts w:ascii="Times New Roman" w:hAnsi="Times New Roman" w:cs="Times New Roman"/>
             </w:rPr>
@@ -427,7 +416,7 @@
         </w:p>
         <w:p>
           <w:pPr>
-            <w:pStyle w:val="TOC1"/>
+            <w:pStyle w:val="TDC1"/>
             <w:tabs>
               <w:tab w:val="right" w:leader="dot" w:pos="8494"/>
             </w:tabs>
@@ -455,10 +444,10 @@
             </w:rPr>
             <w:fldChar w:fldCharType="separate"/>
           </w:r>
-          <w:hyperlink w:anchor="_Toc239675846" w:history="1">
-            <w:r>
-              <w:rPr>
-                <w:rStyle w:val="Hyperlink"/>
+          <w:hyperlink w:anchor="_Toc239694136" w:history="1">
+            <w:r>
+              <w:rPr>
+                <w:rStyle w:val="Hipervnculo"/>
                 <w:rFonts w:cs="Times New Roman"/>
                 <w:noProof/>
               </w:rPr>
@@ -483,7 +472,7 @@
                 <w:noProof/>
                 <w:webHidden/>
               </w:rPr>
-              <w:instrText xml:space="preserve"> PAGEREF _Toc239675846 \h </w:instrText>
+              <w:instrText xml:space="preserve"> PAGEREF _Toc239694136 \h </w:instrText>
             </w:r>
             <w:r>
               <w:rPr>
@@ -516,7 +505,7 @@
         </w:p>
         <w:p>
           <w:pPr>
-            <w:pStyle w:val="TOC2"/>
+            <w:pStyle w:val="TDC2"/>
             <w:tabs>
               <w:tab w:val="left" w:pos="960"/>
               <w:tab w:val="right" w:leader="dot" w:pos="8494"/>
@@ -527,10 +516,10 @@
               <w:lang w:val="es-PE" w:eastAsia="es-PE"/>
             </w:rPr>
           </w:pPr>
-          <w:hyperlink w:anchor="_Toc239675847" w:history="1">
-            <w:r>
-              <w:rPr>
-                <w:rStyle w:val="Hyperlink"/>
+          <w:hyperlink w:anchor="_Toc239694137" w:history="1">
+            <w:r>
+              <w:rPr>
+                <w:rStyle w:val="Hipervnculo"/>
                 <w:rFonts w:cs="Times New Roman"/>
                 <w:noProof/>
               </w:rPr>
@@ -546,7 +535,7 @@
             </w:r>
             <w:r>
               <w:rPr>
-                <w:rStyle w:val="Hyperlink"/>
+                <w:rStyle w:val="Hipervnculo"/>
                 <w:rFonts w:cs="Times New Roman"/>
                 <w:noProof/>
               </w:rPr>
@@ -571,7 +560,7 @@
                 <w:noProof/>
                 <w:webHidden/>
               </w:rPr>
-              <w:instrText xml:space="preserve"> PAGEREF _Toc239675847 \h </w:instrText>
+              <w:instrText xml:space="preserve"> PAGEREF _Toc239694137 \h </w:instrText>
             </w:r>
             <w:r>
               <w:rPr>
@@ -604,7 +593,7 @@
         </w:p>
         <w:p>
           <w:pPr>
-            <w:pStyle w:val="TOC2"/>
+            <w:pStyle w:val="TDC2"/>
             <w:tabs>
               <w:tab w:val="left" w:pos="960"/>
               <w:tab w:val="right" w:leader="dot" w:pos="8494"/>
@@ -615,10 +604,10 @@
               <w:lang w:val="es-PE" w:eastAsia="es-PE"/>
             </w:rPr>
           </w:pPr>
-          <w:hyperlink w:anchor="_Toc239675848" w:history="1">
-            <w:r>
-              <w:rPr>
-                <w:rStyle w:val="Hyperlink"/>
+          <w:hyperlink w:anchor="_Toc239694138" w:history="1">
+            <w:r>
+              <w:rPr>
+                <w:rStyle w:val="Hipervnculo"/>
                 <w:rFonts w:cs="Times New Roman"/>
                 <w:bCs/>
                 <w:noProof/>
@@ -635,7 +624,7 @@
             </w:r>
             <w:r>
               <w:rPr>
-                <w:rStyle w:val="Hyperlink"/>
+                <w:rStyle w:val="Hipervnculo"/>
                 <w:rFonts w:cs="Times New Roman"/>
                 <w:noProof/>
               </w:rPr>
@@ -643,7 +632,7 @@
             </w:r>
             <w:r>
               <w:rPr>
-                <w:rStyle w:val="Hyperlink"/>
+                <w:rStyle w:val="Hipervnculo"/>
                 <w:rFonts w:cs="Times New Roman"/>
                 <w:bCs/>
                 <w:noProof/>
@@ -669,7 +658,7 @@
                 <w:noProof/>
                 <w:webHidden/>
               </w:rPr>
-              <w:instrText xml:space="preserve"> PAGEREF _Toc239675848 \h </w:instrText>
+              <w:instrText xml:space="preserve"> PAGEREF _Toc239694138 \h </w:instrText>
             </w:r>
             <w:r>
               <w:rPr>
@@ -702,7 +691,7 @@
         </w:p>
         <w:p>
           <w:pPr>
-            <w:pStyle w:val="TOC3"/>
+            <w:pStyle w:val="TDC3"/>
             <w:tabs>
               <w:tab w:val="left" w:pos="1440"/>
               <w:tab w:val="right" w:leader="dot" w:pos="8494"/>
@@ -713,10 +702,10 @@
               <w:lang w:val="es-PE" w:eastAsia="es-PE"/>
             </w:rPr>
           </w:pPr>
-          <w:hyperlink w:anchor="_Toc239675849" w:history="1">
-            <w:r>
-              <w:rPr>
-                <w:rStyle w:val="Hyperlink"/>
+          <w:hyperlink w:anchor="_Toc239694139" w:history="1">
+            <w:r>
+              <w:rPr>
+                <w:rStyle w:val="Hipervnculo"/>
                 <w:noProof/>
               </w:rPr>
               <w:t>1.2.1</w:t>
@@ -731,7 +720,7 @@
             </w:r>
             <w:r>
               <w:rPr>
-                <w:rStyle w:val="Hyperlink"/>
+                <w:rStyle w:val="Hipervnculo"/>
                 <w:noProof/>
               </w:rPr>
               <w:t>Objetivo General</w:t>
@@ -755,7 +744,7 @@
                 <w:noProof/>
                 <w:webHidden/>
               </w:rPr>
-              <w:instrText xml:space="preserve"> PAGEREF _Toc239675849 \h </w:instrText>
+              <w:instrText xml:space="preserve"> PAGEREF _Toc239694139 \h </w:instrText>
             </w:r>
             <w:r>
               <w:rPr>
@@ -788,7 +777,7 @@
         </w:p>
         <w:p>
           <w:pPr>
-            <w:pStyle w:val="TOC3"/>
+            <w:pStyle w:val="TDC3"/>
             <w:tabs>
               <w:tab w:val="left" w:pos="1440"/>
               <w:tab w:val="right" w:leader="dot" w:pos="8494"/>
@@ -799,10 +788,10 @@
               <w:lang w:val="es-PE" w:eastAsia="es-PE"/>
             </w:rPr>
           </w:pPr>
-          <w:hyperlink w:anchor="_Toc239675850" w:history="1">
-            <w:r>
-              <w:rPr>
-                <w:rStyle w:val="Hyperlink"/>
+          <w:hyperlink w:anchor="_Toc239694140" w:history="1">
+            <w:r>
+              <w:rPr>
+                <w:rStyle w:val="Hipervnculo"/>
                 <w:noProof/>
               </w:rPr>
               <w:t>1.2.2</w:t>
@@ -817,7 +806,7 @@
             </w:r>
             <w:r>
               <w:rPr>
-                <w:rStyle w:val="Hyperlink"/>
+                <w:rStyle w:val="Hipervnculo"/>
                 <w:noProof/>
               </w:rPr>
               <w:t>Objetivos Específicos</w:t>
@@ -841,7 +830,7 @@
                 <w:noProof/>
                 <w:webHidden/>
               </w:rPr>
-              <w:instrText xml:space="preserve"> PAGEREF _Toc239675850 \h </w:instrText>
+              <w:instrText xml:space="preserve"> PAGEREF _Toc239694140 \h </w:instrText>
             </w:r>
             <w:r>
               <w:rPr>
@@ -874,7 +863,7 @@
         </w:p>
         <w:p>
           <w:pPr>
-            <w:pStyle w:val="TOC2"/>
+            <w:pStyle w:val="TDC2"/>
             <w:tabs>
               <w:tab w:val="left" w:pos="960"/>
               <w:tab w:val="right" w:leader="dot" w:pos="8494"/>
@@ -885,10 +874,10 @@
               <w:lang w:val="es-PE" w:eastAsia="es-PE"/>
             </w:rPr>
           </w:pPr>
-          <w:hyperlink w:anchor="_Toc239675851" w:history="1">
-            <w:r>
-              <w:rPr>
-                <w:rStyle w:val="Hyperlink"/>
+          <w:hyperlink w:anchor="_Toc239694141" w:history="1">
+            <w:r>
+              <w:rPr>
+                <w:rStyle w:val="Hipervnculo"/>
                 <w:rFonts w:cs="Times New Roman"/>
                 <w:noProof/>
               </w:rPr>
@@ -904,7 +893,7 @@
             </w:r>
             <w:r>
               <w:rPr>
-                <w:rStyle w:val="Hyperlink"/>
+                <w:rStyle w:val="Hipervnculo"/>
                 <w:rFonts w:cs="Times New Roman"/>
                 <w:noProof/>
               </w:rPr>
@@ -929,7 +918,7 @@
                 <w:noProof/>
                 <w:webHidden/>
               </w:rPr>
-              <w:instrText xml:space="preserve"> PAGEREF _Toc239675851 \h </w:instrText>
+              <w:instrText xml:space="preserve"> PAGEREF _Toc239694141 \h </w:instrText>
             </w:r>
             <w:r>
               <w:rPr>
@@ -949,7 +938,7 @@
                 <w:noProof/>
                 <w:webHidden/>
               </w:rPr>
-              <w:t>3</w:t>
+              <w:t>4</w:t>
             </w:r>
             <w:r>
               <w:rPr>
@@ -962,7 +951,7 @@
         </w:p>
         <w:p>
           <w:pPr>
-            <w:pStyle w:val="TOC2"/>
+            <w:pStyle w:val="TDC2"/>
             <w:tabs>
               <w:tab w:val="left" w:pos="960"/>
               <w:tab w:val="right" w:leader="dot" w:pos="8494"/>
@@ -973,10 +962,10 @@
               <w:lang w:val="es-PE" w:eastAsia="es-PE"/>
             </w:rPr>
           </w:pPr>
-          <w:hyperlink w:anchor="_Toc239675852" w:history="1">
-            <w:r>
-              <w:rPr>
-                <w:rStyle w:val="Hyperlink"/>
+          <w:hyperlink w:anchor="_Toc239694142" w:history="1">
+            <w:r>
+              <w:rPr>
+                <w:rStyle w:val="Hipervnculo"/>
                 <w:rFonts w:cs="Times New Roman"/>
                 <w:noProof/>
               </w:rPr>
@@ -992,7 +981,7 @@
             </w:r>
             <w:r>
               <w:rPr>
-                <w:rStyle w:val="Hyperlink"/>
+                <w:rStyle w:val="Hipervnculo"/>
                 <w:rFonts w:cs="Times New Roman"/>
                 <w:noProof/>
               </w:rPr>
@@ -1017,7 +1006,7 @@
                 <w:noProof/>
                 <w:webHidden/>
               </w:rPr>
-              <w:instrText xml:space="preserve"> PAGEREF _Toc239675852 \h </w:instrText>
+              <w:instrText xml:space="preserve"> PAGEREF _Toc239694142 \h </w:instrText>
             </w:r>
             <w:r>
               <w:rPr>
@@ -1037,7 +1026,7 @@
                 <w:noProof/>
                 <w:webHidden/>
               </w:rPr>
-              <w:t>3</w:t>
+              <w:t>4</w:t>
             </w:r>
             <w:r>
               <w:rPr>
@@ -1050,7 +1039,7 @@
         </w:p>
         <w:p>
           <w:pPr>
-            <w:pStyle w:val="TOC1"/>
+            <w:pStyle w:val="TDC1"/>
             <w:tabs>
               <w:tab w:val="right" w:leader="dot" w:pos="8494"/>
             </w:tabs>
@@ -1060,10 +1049,10 @@
               <w:lang w:val="es-PE" w:eastAsia="es-PE"/>
             </w:rPr>
           </w:pPr>
-          <w:hyperlink w:anchor="_Toc239675853" w:history="1">
-            <w:r>
-              <w:rPr>
-                <w:rStyle w:val="Hyperlink"/>
+          <w:hyperlink w:anchor="_Toc239694143" w:history="1">
+            <w:r>
+              <w:rPr>
+                <w:rStyle w:val="Hipervnculo"/>
                 <w:rFonts w:cs="Times New Roman"/>
                 <w:noProof/>
               </w:rPr>
@@ -1088,7 +1077,7 @@
                 <w:noProof/>
                 <w:webHidden/>
               </w:rPr>
-              <w:instrText xml:space="preserve"> PAGEREF _Toc239675853 \h </w:instrText>
+              <w:instrText xml:space="preserve"> PAGEREF _Toc239694143 \h </w:instrText>
             </w:r>
             <w:r>
               <w:rPr>
@@ -1108,7 +1097,7 @@
                 <w:noProof/>
                 <w:webHidden/>
               </w:rPr>
-              <w:t>3</w:t>
+              <w:t>6</w:t>
             </w:r>
             <w:r>
               <w:rPr>
@@ -1121,7 +1110,7 @@
         </w:p>
         <w:p>
           <w:pPr>
-            <w:pStyle w:val="TOC2"/>
+            <w:pStyle w:val="TDC2"/>
             <w:tabs>
               <w:tab w:val="left" w:pos="960"/>
               <w:tab w:val="right" w:leader="dot" w:pos="8494"/>
@@ -1132,10 +1121,10 @@
               <w:lang w:val="es-PE" w:eastAsia="es-PE"/>
             </w:rPr>
           </w:pPr>
-          <w:hyperlink w:anchor="_Toc239675855" w:history="1">
-            <w:r>
-              <w:rPr>
-                <w:rStyle w:val="Hyperlink"/>
+          <w:hyperlink w:anchor="_Toc239694145" w:history="1">
+            <w:r>
+              <w:rPr>
+                <w:rStyle w:val="Hipervnculo"/>
                 <w:noProof/>
               </w:rPr>
               <w:t>2.1</w:t>
@@ -1150,7 +1139,7 @@
             </w:r>
             <w:r>
               <w:rPr>
-                <w:rStyle w:val="Hyperlink"/>
+                <w:rStyle w:val="Hipervnculo"/>
                 <w:noProof/>
               </w:rPr>
               <w:t>Antecedentes</w:t>
@@ -1174,7 +1163,7 @@
                 <w:noProof/>
                 <w:webHidden/>
               </w:rPr>
-              <w:instrText xml:space="preserve"> PAGEREF _Toc239675855 \h </w:instrText>
+              <w:instrText xml:space="preserve"> PAGEREF _Toc239694145 \h </w:instrText>
             </w:r>
             <w:r>
               <w:rPr>
@@ -1194,7 +1183,7 @@
                 <w:noProof/>
                 <w:webHidden/>
               </w:rPr>
-              <w:t>3</w:t>
+              <w:t>6</w:t>
             </w:r>
             <w:r>
               <w:rPr>
@@ -1207,7 +1196,7 @@
         </w:p>
         <w:p>
           <w:pPr>
-            <w:pStyle w:val="TOC2"/>
+            <w:pStyle w:val="TDC2"/>
             <w:tabs>
               <w:tab w:val="left" w:pos="960"/>
               <w:tab w:val="right" w:leader="dot" w:pos="8494"/>
@@ -1218,10 +1207,10 @@
               <w:lang w:val="es-PE" w:eastAsia="es-PE"/>
             </w:rPr>
           </w:pPr>
-          <w:hyperlink w:anchor="_Toc239675856" w:history="1">
-            <w:r>
-              <w:rPr>
-                <w:rStyle w:val="Hyperlink"/>
+          <w:hyperlink w:anchor="_Toc239694146" w:history="1">
+            <w:r>
+              <w:rPr>
+                <w:rStyle w:val="Hipervnculo"/>
                 <w:rFonts w:cs="Times New Roman"/>
                 <w:noProof/>
               </w:rPr>
@@ -1237,7 +1226,7 @@
             </w:r>
             <w:r>
               <w:rPr>
-                <w:rStyle w:val="Hyperlink"/>
+                <w:rStyle w:val="Hipervnculo"/>
                 <w:rFonts w:cs="Times New Roman"/>
                 <w:noProof/>
               </w:rPr>
@@ -1262,7 +1251,7 @@
                 <w:noProof/>
                 <w:webHidden/>
               </w:rPr>
-              <w:instrText xml:space="preserve"> PAGEREF _Toc239675856 \h </w:instrText>
+              <w:instrText xml:space="preserve"> PAGEREF _Toc239694146 \h </w:instrText>
             </w:r>
             <w:r>
               <w:rPr>
@@ -1282,7 +1271,7 @@
                 <w:noProof/>
                 <w:webHidden/>
               </w:rPr>
-              <w:t>3</w:t>
+              <w:t>6</w:t>
             </w:r>
             <w:r>
               <w:rPr>
@@ -1295,7 +1284,7 @@
         </w:p>
         <w:p>
           <w:pPr>
-            <w:pStyle w:val="TOC1"/>
+            <w:pStyle w:val="TDC1"/>
             <w:tabs>
               <w:tab w:val="right" w:leader="dot" w:pos="8494"/>
             </w:tabs>
@@ -1305,10 +1294,10 @@
               <w:lang w:val="es-PE" w:eastAsia="es-PE"/>
             </w:rPr>
           </w:pPr>
-          <w:hyperlink w:anchor="_Toc239675857" w:history="1">
-            <w:r>
-              <w:rPr>
-                <w:rStyle w:val="Hyperlink"/>
+          <w:hyperlink w:anchor="_Toc239694147" w:history="1">
+            <w:r>
+              <w:rPr>
+                <w:rStyle w:val="Hipervnculo"/>
                 <w:rFonts w:cs="Times New Roman"/>
                 <w:noProof/>
               </w:rPr>
@@ -1333,7 +1322,7 @@
                 <w:noProof/>
                 <w:webHidden/>
               </w:rPr>
-              <w:instrText xml:space="preserve"> PAGEREF _Toc239675857 \h </w:instrText>
+              <w:instrText xml:space="preserve"> PAGEREF _Toc239694147 \h </w:instrText>
             </w:r>
             <w:r>
               <w:rPr>
@@ -1353,7 +1342,7 @@
                 <w:noProof/>
                 <w:webHidden/>
               </w:rPr>
-              <w:t>3</w:t>
+              <w:t>6</w:t>
             </w:r>
             <w:r>
               <w:rPr>
@@ -1366,7 +1355,7 @@
         </w:p>
         <w:p>
           <w:pPr>
-            <w:pStyle w:val="TOC2"/>
+            <w:pStyle w:val="TDC2"/>
             <w:tabs>
               <w:tab w:val="left" w:pos="960"/>
               <w:tab w:val="right" w:leader="dot" w:pos="8494"/>
@@ -1377,10 +1366,10 @@
               <w:lang w:val="es-PE" w:eastAsia="es-PE"/>
             </w:rPr>
           </w:pPr>
-          <w:hyperlink w:anchor="_Toc239675859" w:history="1">
-            <w:r>
-              <w:rPr>
-                <w:rStyle w:val="Hyperlink"/>
+          <w:hyperlink w:anchor="_Toc239694149" w:history="1">
+            <w:r>
+              <w:rPr>
+                <w:rStyle w:val="Hipervnculo"/>
                 <w:noProof/>
               </w:rPr>
               <w:t>3.1</w:t>
@@ -1395,7 +1384,7 @@
             </w:r>
             <w:r>
               <w:rPr>
-                <w:rStyle w:val="Hyperlink"/>
+                <w:rStyle w:val="Hipervnculo"/>
                 <w:noProof/>
               </w:rPr>
               <w:t>Requerimientos funcionales</w:t>
@@ -1419,7 +1408,7 @@
                 <w:noProof/>
                 <w:webHidden/>
               </w:rPr>
-              <w:instrText xml:space="preserve"> PAGEREF _Toc239675859 \h </w:instrText>
+              <w:instrText xml:space="preserve"> PAGEREF _Toc239694149 \h </w:instrText>
             </w:r>
             <w:r>
               <w:rPr>
@@ -1439,7 +1428,7 @@
                 <w:noProof/>
                 <w:webHidden/>
               </w:rPr>
-              <w:t>3</w:t>
+              <w:t>6</w:t>
             </w:r>
             <w:r>
               <w:rPr>
@@ -1452,7 +1441,7 @@
         </w:p>
         <w:p>
           <w:pPr>
-            <w:pStyle w:val="TOC2"/>
+            <w:pStyle w:val="TDC2"/>
             <w:tabs>
               <w:tab w:val="left" w:pos="960"/>
               <w:tab w:val="right" w:leader="dot" w:pos="8494"/>
@@ -1463,10 +1452,10 @@
               <w:lang w:val="es-PE" w:eastAsia="es-PE"/>
             </w:rPr>
           </w:pPr>
-          <w:hyperlink w:anchor="_Toc239675860" w:history="1">
-            <w:r>
-              <w:rPr>
-                <w:rStyle w:val="Hyperlink"/>
+          <w:hyperlink w:anchor="_Toc239694150" w:history="1">
+            <w:r>
+              <w:rPr>
+                <w:rStyle w:val="Hipervnculo"/>
                 <w:rFonts w:cs="Times New Roman"/>
                 <w:noProof/>
               </w:rPr>
@@ -1482,7 +1471,7 @@
             </w:r>
             <w:r>
               <w:rPr>
-                <w:rStyle w:val="Hyperlink"/>
+                <w:rStyle w:val="Hipervnculo"/>
                 <w:rFonts w:cs="Times New Roman"/>
                 <w:noProof/>
               </w:rPr>
@@ -1507,7 +1496,7 @@
                 <w:noProof/>
                 <w:webHidden/>
               </w:rPr>
-              <w:instrText xml:space="preserve"> PAGEREF _Toc239675860 \h </w:instrText>
+              <w:instrText xml:space="preserve"> PAGEREF _Toc239694150 \h </w:instrText>
             </w:r>
             <w:r>
               <w:rPr>
@@ -1527,7 +1516,7 @@
                 <w:noProof/>
                 <w:webHidden/>
               </w:rPr>
-              <w:t>3</w:t>
+              <w:t>6</w:t>
             </w:r>
             <w:r>
               <w:rPr>
@@ -1540,7 +1529,7 @@
         </w:p>
         <w:p>
           <w:pPr>
-            <w:pStyle w:val="TOC2"/>
+            <w:pStyle w:val="TDC2"/>
             <w:tabs>
               <w:tab w:val="left" w:pos="960"/>
               <w:tab w:val="right" w:leader="dot" w:pos="8494"/>
@@ -1551,10 +1540,10 @@
               <w:lang w:val="es-PE" w:eastAsia="es-PE"/>
             </w:rPr>
           </w:pPr>
-          <w:hyperlink w:anchor="_Toc239675861" w:history="1">
-            <w:r>
-              <w:rPr>
-                <w:rStyle w:val="Hyperlink"/>
+          <w:hyperlink w:anchor="_Toc239694151" w:history="1">
+            <w:r>
+              <w:rPr>
+                <w:rStyle w:val="Hipervnculo"/>
                 <w:rFonts w:cs="Times New Roman"/>
                 <w:noProof/>
               </w:rPr>
@@ -1570,7 +1559,7 @@
             </w:r>
             <w:r>
               <w:rPr>
-                <w:rStyle w:val="Hyperlink"/>
+                <w:rStyle w:val="Hipervnculo"/>
                 <w:rFonts w:cs="Times New Roman"/>
                 <w:noProof/>
               </w:rPr>
@@ -1595,7 +1584,7 @@
                 <w:noProof/>
                 <w:webHidden/>
               </w:rPr>
-              <w:instrText xml:space="preserve"> PAGEREF _Toc239675861 \h </w:instrText>
+              <w:instrText xml:space="preserve"> PAGEREF _Toc239694151 \h </w:instrText>
             </w:r>
             <w:r>
               <w:rPr>
@@ -1615,7 +1604,7 @@
                 <w:noProof/>
                 <w:webHidden/>
               </w:rPr>
-              <w:t>3</w:t>
+              <w:t>6</w:t>
             </w:r>
             <w:r>
               <w:rPr>
@@ -1628,7 +1617,7 @@
         </w:p>
         <w:p>
           <w:pPr>
-            <w:pStyle w:val="TOC2"/>
+            <w:pStyle w:val="TDC2"/>
             <w:tabs>
               <w:tab w:val="left" w:pos="960"/>
               <w:tab w:val="right" w:leader="dot" w:pos="8494"/>
@@ -1639,10 +1628,10 @@
               <w:lang w:val="es-PE" w:eastAsia="es-PE"/>
             </w:rPr>
           </w:pPr>
-          <w:hyperlink w:anchor="_Toc239675862" w:history="1">
-            <w:r>
-              <w:rPr>
-                <w:rStyle w:val="Hyperlink"/>
+          <w:hyperlink w:anchor="_Toc239694152" w:history="1">
+            <w:r>
+              <w:rPr>
+                <w:rStyle w:val="Hipervnculo"/>
                 <w:rFonts w:cs="Times New Roman"/>
                 <w:noProof/>
               </w:rPr>
@@ -1658,7 +1647,7 @@
             </w:r>
             <w:r>
               <w:rPr>
-                <w:rStyle w:val="Hyperlink"/>
+                <w:rStyle w:val="Hipervnculo"/>
                 <w:rFonts w:cs="Times New Roman"/>
                 <w:noProof/>
               </w:rPr>
@@ -1683,7 +1672,7 @@
                 <w:noProof/>
                 <w:webHidden/>
               </w:rPr>
-              <w:instrText xml:space="preserve"> PAGEREF _Toc239675862 \h </w:instrText>
+              <w:instrText xml:space="preserve"> PAGEREF _Toc239694152 \h </w:instrText>
             </w:r>
             <w:r>
               <w:rPr>
@@ -1703,7 +1692,7 @@
                 <w:noProof/>
                 <w:webHidden/>
               </w:rPr>
-              <w:t>4</w:t>
+              <w:t>7</w:t>
             </w:r>
             <w:r>
               <w:rPr>
@@ -1716,7 +1705,7 @@
         </w:p>
         <w:p>
           <w:pPr>
-            <w:pStyle w:val="TOC2"/>
+            <w:pStyle w:val="TDC2"/>
             <w:tabs>
               <w:tab w:val="left" w:pos="960"/>
               <w:tab w:val="right" w:leader="dot" w:pos="8494"/>
@@ -1727,10 +1716,10 @@
               <w:lang w:val="es-PE" w:eastAsia="es-PE"/>
             </w:rPr>
           </w:pPr>
-          <w:hyperlink w:anchor="_Toc239675863" w:history="1">
-            <w:r>
-              <w:rPr>
-                <w:rStyle w:val="Hyperlink"/>
+          <w:hyperlink w:anchor="_Toc239694153" w:history="1">
+            <w:r>
+              <w:rPr>
+                <w:rStyle w:val="Hipervnculo"/>
                 <w:rFonts w:cs="Times New Roman"/>
                 <w:noProof/>
               </w:rPr>
@@ -1746,7 +1735,7 @@
             </w:r>
             <w:r>
               <w:rPr>
-                <w:rStyle w:val="Hyperlink"/>
+                <w:rStyle w:val="Hipervnculo"/>
                 <w:rFonts w:cs="Times New Roman"/>
                 <w:noProof/>
               </w:rPr>
@@ -1771,7 +1760,7 @@
                 <w:noProof/>
                 <w:webHidden/>
               </w:rPr>
-              <w:instrText xml:space="preserve"> PAGEREF _Toc239675863 \h </w:instrText>
+              <w:instrText xml:space="preserve"> PAGEREF _Toc239694153 \h </w:instrText>
             </w:r>
             <w:r>
               <w:rPr>
@@ -1791,7 +1780,7 @@
                 <w:noProof/>
                 <w:webHidden/>
               </w:rPr>
-              <w:t>4</w:t>
+              <w:t>7</w:t>
             </w:r>
             <w:r>
               <w:rPr>
@@ -1804,7 +1793,7 @@
         </w:p>
         <w:p>
           <w:pPr>
-            <w:pStyle w:val="TOC2"/>
+            <w:pStyle w:val="TDC2"/>
             <w:tabs>
               <w:tab w:val="left" w:pos="960"/>
               <w:tab w:val="right" w:leader="dot" w:pos="8494"/>
@@ -1815,10 +1804,10 @@
               <w:lang w:val="es-PE" w:eastAsia="es-PE"/>
             </w:rPr>
           </w:pPr>
-          <w:hyperlink w:anchor="_Toc239675864" w:history="1">
-            <w:r>
-              <w:rPr>
-                <w:rStyle w:val="Hyperlink"/>
+          <w:hyperlink w:anchor="_Toc239694154" w:history="1">
+            <w:r>
+              <w:rPr>
+                <w:rStyle w:val="Hipervnculo"/>
                 <w:rFonts w:cs="Times New Roman"/>
                 <w:noProof/>
               </w:rPr>
@@ -1834,7 +1823,7 @@
             </w:r>
             <w:r>
               <w:rPr>
-                <w:rStyle w:val="Hyperlink"/>
+                <w:rStyle w:val="Hipervnculo"/>
                 <w:rFonts w:cs="Times New Roman"/>
                 <w:noProof/>
               </w:rPr>
@@ -1859,7 +1848,7 @@
                 <w:noProof/>
                 <w:webHidden/>
               </w:rPr>
-              <w:instrText xml:space="preserve"> PAGEREF _Toc239675864 \h </w:instrText>
+              <w:instrText xml:space="preserve"> PAGEREF _Toc239694154 \h </w:instrText>
             </w:r>
             <w:r>
               <w:rPr>
@@ -1879,7 +1868,7 @@
                 <w:noProof/>
                 <w:webHidden/>
               </w:rPr>
-              <w:t>4</w:t>
+              <w:t>7</w:t>
             </w:r>
             <w:r>
               <w:rPr>
@@ -1892,7 +1881,7 @@
         </w:p>
         <w:p>
           <w:pPr>
-            <w:pStyle w:val="TOC2"/>
+            <w:pStyle w:val="TDC2"/>
             <w:tabs>
               <w:tab w:val="left" w:pos="960"/>
               <w:tab w:val="right" w:leader="dot" w:pos="8494"/>
@@ -1903,10 +1892,10 @@
               <w:lang w:val="es-PE" w:eastAsia="es-PE"/>
             </w:rPr>
           </w:pPr>
-          <w:hyperlink w:anchor="_Toc239675865" w:history="1">
-            <w:r>
-              <w:rPr>
-                <w:rStyle w:val="Hyperlink"/>
+          <w:hyperlink w:anchor="_Toc239694155" w:history="1">
+            <w:r>
+              <w:rPr>
+                <w:rStyle w:val="Hipervnculo"/>
                 <w:rFonts w:cs="Times New Roman"/>
                 <w:noProof/>
               </w:rPr>
@@ -1922,7 +1911,7 @@
             </w:r>
             <w:r>
               <w:rPr>
-                <w:rStyle w:val="Hyperlink"/>
+                <w:rStyle w:val="Hipervnculo"/>
                 <w:rFonts w:cs="Times New Roman"/>
                 <w:noProof/>
               </w:rPr>
@@ -1947,7 +1936,7 @@
                 <w:noProof/>
                 <w:webHidden/>
               </w:rPr>
-              <w:instrText xml:space="preserve"> PAGEREF _Toc239675865 \h </w:instrText>
+              <w:instrText xml:space="preserve"> PAGEREF _Toc239694155 \h </w:instrText>
             </w:r>
             <w:r>
               <w:rPr>
@@ -1967,7 +1956,7 @@
                 <w:noProof/>
                 <w:webHidden/>
               </w:rPr>
-              <w:t>4</w:t>
+              <w:t>7</w:t>
             </w:r>
             <w:r>
               <w:rPr>
@@ -1980,7 +1969,7 @@
         </w:p>
         <w:p>
           <w:pPr>
-            <w:pStyle w:val="TOC2"/>
+            <w:pStyle w:val="TDC2"/>
             <w:tabs>
               <w:tab w:val="left" w:pos="960"/>
               <w:tab w:val="right" w:leader="dot" w:pos="8494"/>
@@ -1991,10 +1980,10 @@
               <w:lang w:val="es-PE" w:eastAsia="es-PE"/>
             </w:rPr>
           </w:pPr>
-          <w:hyperlink w:anchor="_Toc239675866" w:history="1">
-            <w:r>
-              <w:rPr>
-                <w:rStyle w:val="Hyperlink"/>
+          <w:hyperlink w:anchor="_Toc239694156" w:history="1">
+            <w:r>
+              <w:rPr>
+                <w:rStyle w:val="Hipervnculo"/>
                 <w:rFonts w:cs="Times New Roman"/>
                 <w:noProof/>
               </w:rPr>
@@ -2010,7 +1999,7 @@
             </w:r>
             <w:r>
               <w:rPr>
-                <w:rStyle w:val="Hyperlink"/>
+                <w:rStyle w:val="Hipervnculo"/>
                 <w:rFonts w:cs="Times New Roman"/>
                 <w:noProof/>
               </w:rPr>
@@ -2035,7 +2024,7 @@
                 <w:noProof/>
                 <w:webHidden/>
               </w:rPr>
-              <w:instrText xml:space="preserve"> PAGEREF _Toc239675866 \h </w:instrText>
+              <w:instrText xml:space="preserve"> PAGEREF _Toc239694156 \h </w:instrText>
             </w:r>
             <w:r>
               <w:rPr>
@@ -2055,7 +2044,7 @@
                 <w:noProof/>
                 <w:webHidden/>
               </w:rPr>
-              <w:t>4</w:t>
+              <w:t>7</w:t>
             </w:r>
             <w:r>
               <w:rPr>
@@ -2068,7 +2057,7 @@
         </w:p>
         <w:p>
           <w:pPr>
-            <w:pStyle w:val="TOC1"/>
+            <w:pStyle w:val="TDC1"/>
             <w:tabs>
               <w:tab w:val="right" w:leader="dot" w:pos="8494"/>
             </w:tabs>
@@ -2078,10 +2067,10 @@
               <w:lang w:val="es-PE" w:eastAsia="es-PE"/>
             </w:rPr>
           </w:pPr>
-          <w:hyperlink w:anchor="_Toc239675867" w:history="1">
-            <w:r>
-              <w:rPr>
-                <w:rStyle w:val="Hyperlink"/>
+          <w:hyperlink w:anchor="_Toc239694157" w:history="1">
+            <w:r>
+              <w:rPr>
+                <w:rStyle w:val="Hipervnculo"/>
                 <w:rFonts w:cs="Times New Roman"/>
                 <w:noProof/>
               </w:rPr>
@@ -2106,7 +2095,7 @@
                 <w:noProof/>
                 <w:webHidden/>
               </w:rPr>
-              <w:instrText xml:space="preserve"> PAGEREF _Toc239675867 \h </w:instrText>
+              <w:instrText xml:space="preserve"> PAGEREF _Toc239694157 \h </w:instrText>
             </w:r>
             <w:r>
               <w:rPr>
@@ -2126,7 +2115,7 @@
                 <w:noProof/>
                 <w:webHidden/>
               </w:rPr>
-              <w:t>4</w:t>
+              <w:t>7</w:t>
             </w:r>
             <w:r>
               <w:rPr>
@@ -2139,7 +2128,7 @@
         </w:p>
         <w:p>
           <w:pPr>
-            <w:pStyle w:val="TOC2"/>
+            <w:pStyle w:val="TDC2"/>
             <w:tabs>
               <w:tab w:val="left" w:pos="960"/>
               <w:tab w:val="right" w:leader="dot" w:pos="8494"/>
@@ -2150,10 +2139,10 @@
               <w:lang w:val="es-PE" w:eastAsia="es-PE"/>
             </w:rPr>
           </w:pPr>
-          <w:hyperlink w:anchor="_Toc239675869" w:history="1">
-            <w:r>
-              <w:rPr>
-                <w:rStyle w:val="Hyperlink"/>
+          <w:hyperlink w:anchor="_Toc239694159" w:history="1">
+            <w:r>
+              <w:rPr>
+                <w:rStyle w:val="Hipervnculo"/>
                 <w:noProof/>
               </w:rPr>
               <w:t>4.1</w:t>
@@ -2168,7 +2157,7 @@
             </w:r>
             <w:r>
               <w:rPr>
-                <w:rStyle w:val="Hyperlink"/>
+                <w:rStyle w:val="Hipervnculo"/>
                 <w:noProof/>
               </w:rPr>
               <w:t>Conclusiones</w:t>
@@ -2192,7 +2181,7 @@
                 <w:noProof/>
                 <w:webHidden/>
               </w:rPr>
-              <w:instrText xml:space="preserve"> PAGEREF _Toc239675869 \h </w:instrText>
+              <w:instrText xml:space="preserve"> PAGEREF _Toc239694159 \h </w:instrText>
             </w:r>
             <w:r>
               <w:rPr>
@@ -2212,7 +2201,7 @@
                 <w:noProof/>
                 <w:webHidden/>
               </w:rPr>
-              <w:t>4</w:t>
+              <w:t>7</w:t>
             </w:r>
             <w:r>
               <w:rPr>
@@ -2225,7 +2214,7 @@
         </w:p>
         <w:p>
           <w:pPr>
-            <w:pStyle w:val="TOC2"/>
+            <w:pStyle w:val="TDC2"/>
             <w:tabs>
               <w:tab w:val="left" w:pos="960"/>
               <w:tab w:val="right" w:leader="dot" w:pos="8494"/>
@@ -2236,10 +2225,10 @@
               <w:lang w:val="es-PE" w:eastAsia="es-PE"/>
             </w:rPr>
           </w:pPr>
-          <w:hyperlink w:anchor="_Toc239675870" w:history="1">
-            <w:r>
-              <w:rPr>
-                <w:rStyle w:val="Hyperlink"/>
+          <w:hyperlink w:anchor="_Toc239694160" w:history="1">
+            <w:r>
+              <w:rPr>
+                <w:rStyle w:val="Hipervnculo"/>
                 <w:rFonts w:cs="Times New Roman"/>
                 <w:noProof/>
               </w:rPr>
@@ -2255,7 +2244,7 @@
             </w:r>
             <w:r>
               <w:rPr>
-                <w:rStyle w:val="Hyperlink"/>
+                <w:rStyle w:val="Hipervnculo"/>
                 <w:rFonts w:cs="Times New Roman"/>
                 <w:noProof/>
               </w:rPr>
@@ -2280,7 +2269,7 @@
                 <w:noProof/>
                 <w:webHidden/>
               </w:rPr>
-              <w:instrText xml:space="preserve"> PAGEREF _Toc239675870 \h </w:instrText>
+              <w:instrText xml:space="preserve"> PAGEREF _Toc239694160 \h </w:instrText>
             </w:r>
             <w:r>
               <w:rPr>
@@ -2300,7 +2289,7 @@
                 <w:noProof/>
                 <w:webHidden/>
               </w:rPr>
-              <w:t>4</w:t>
+              <w:t>7</w:t>
             </w:r>
             <w:r>
               <w:rPr>
@@ -2313,7 +2302,7 @@
         </w:p>
         <w:p>
           <w:pPr>
-            <w:pStyle w:val="TOC1"/>
+            <w:pStyle w:val="TDC1"/>
             <w:tabs>
               <w:tab w:val="right" w:leader="dot" w:pos="8494"/>
             </w:tabs>
@@ -2323,12 +2312,84 @@
               <w:lang w:val="es-PE" w:eastAsia="es-PE"/>
             </w:rPr>
           </w:pPr>
-          <w:hyperlink w:anchor="_Toc239675871" w:history="1">
-            <w:r>
-              <w:rPr>
-                <w:rStyle w:val="Hyperlink"/>
+          <w:hyperlink w:anchor="_Toc239694161" w:history="1">
+            <w:r>
+              <w:rPr>
+                <w:rStyle w:val="Hipervnculo"/>
                 <w:rFonts w:cs="Times New Roman"/>
                 <w:noProof/>
+                <w:lang w:val="en-US"/>
+              </w:rPr>
+              <w:t>REFERENCIAS BIBLIOGRÁFICAS</w:t>
+            </w:r>
+            <w:r>
+              <w:rPr>
+                <w:noProof/>
+                <w:webHidden/>
+              </w:rPr>
+              <w:tab/>
+            </w:r>
+            <w:r>
+              <w:rPr>
+                <w:noProof/>
+                <w:webHidden/>
+              </w:rPr>
+              <w:fldChar w:fldCharType="begin"/>
+            </w:r>
+            <w:r>
+              <w:rPr>
+                <w:noProof/>
+                <w:webHidden/>
+              </w:rPr>
+              <w:instrText xml:space="preserve"> PAGEREF _Toc239694161 \h </w:instrText>
+            </w:r>
+            <w:r>
+              <w:rPr>
+                <w:noProof/>
+                <w:webHidden/>
+              </w:rPr>
+            </w:r>
+            <w:r>
+              <w:rPr>
+                <w:noProof/>
+                <w:webHidden/>
+              </w:rPr>
+              <w:fldChar w:fldCharType="separate"/>
+            </w:r>
+            <w:r>
+              <w:rPr>
+                <w:noProof/>
+                <w:webHidden/>
+              </w:rPr>
+              <w:t>8</w:t>
+            </w:r>
+            <w:r>
+              <w:rPr>
+                <w:noProof/>
+                <w:webHidden/>
+              </w:rPr>
+              <w:fldChar w:fldCharType="end"/>
+            </w:r>
+          </w:hyperlink>
+        </w:p>
+        <w:p>
+          <w:pPr>
+            <w:pStyle w:val="TDC1"/>
+            <w:tabs>
+              <w:tab w:val="right" w:leader="dot" w:pos="8494"/>
+            </w:tabs>
+            <w:rPr>
+              <w:rFonts w:asciiTheme="minorHAnsi" w:eastAsiaTheme="minorEastAsia" w:hAnsiTheme="minorHAnsi"/>
+              <w:noProof/>
+              <w:lang w:val="es-PE" w:eastAsia="es-PE"/>
+            </w:rPr>
+          </w:pPr>
+          <w:hyperlink w:anchor="_Toc239694162" w:history="1">
+            <w:r>
+              <w:rPr>
+                <w:rStyle w:val="Hipervnculo"/>
+                <w:rFonts w:cs="Times New Roman"/>
+                <w:noProof/>
               </w:rPr>
               <w:t>ANEXOS</w:t>
             </w:r>
@@ -2351,7 +2412,7 @@
                 <w:noProof/>
                 <w:webHidden/>
               </w:rPr>
-              <w:instrText xml:space="preserve"> PAGEREF _Toc239675871 \h </w:instrText>
+              <w:instrText xml:space="preserve"> PAGEREF _Toc239694162 \h </w:instrText>
             </w:r>
             <w:r>
               <w:rPr>
@@ -2371,7 +2432,7 @@
                 <w:noProof/>
                 <w:webHidden/>
               </w:rPr>
-              <w:t>4</w:t>
+              <w:t>8</w:t>
             </w:r>
             <w:r>
               <w:rPr>
@@ -2417,7 +2478,7 @@
     </w:p>
     <w:p>
       <w:pPr>
-        <w:pStyle w:val="Heading1"/>
+        <w:pStyle w:val="Ttulo1"/>
         <w:numPr>
           <w:ilvl w:val="0"/>
           <w:numId w:val="0"/>
@@ -2426,7 +2487,7 @@
           <w:rFonts w:cs="Times New Roman"/>
         </w:rPr>
       </w:pPr>
-      <w:bookmarkStart w:id="0" w:name="_Toc239675846"/>
+      <w:bookmarkStart w:id="0" w:name="_Toc239694136"/>
       <w:r>
         <w:rPr>
           <w:rFonts w:cs="Times New Roman"/>
@@ -2444,12 +2505,12 @@
     </w:p>
     <w:p>
       <w:pPr>
-        <w:pStyle w:val="Heading2"/>
-        <w:rPr>
-          <w:rFonts w:cs="Times New Roman"/>
-        </w:rPr>
-      </w:pPr>
-      <w:bookmarkStart w:id="1" w:name="_Toc239675847"/>
+        <w:pStyle w:val="Ttulo2"/>
+        <w:rPr>
+          <w:rFonts w:cs="Times New Roman"/>
+        </w:rPr>
+      </w:pPr>
+      <w:bookmarkStart w:id="1" w:name="_Toc239694137"/>
       <w:r>
         <w:rPr>
           <w:rFonts w:cs="Times New Roman"/>
@@ -2494,13 +2555,13 @@
     </w:p>
     <w:p>
       <w:pPr>
-        <w:pStyle w:val="Heading2"/>
+        <w:pStyle w:val="Ttulo2"/>
         <w:rPr>
           <w:rFonts w:cs="Times New Roman"/>
           <w:bCs/>
         </w:rPr>
       </w:pPr>
-      <w:bookmarkStart w:id="2" w:name="_Toc239675848"/>
+      <w:bookmarkStart w:id="2" w:name="_Toc239694138"/>
       <w:r>
         <w:rPr>
           <w:rFonts w:cs="Times New Roman"/>
@@ -2524,9 +2585,9 @@
     </w:p>
     <w:p>
       <w:pPr>
-        <w:pStyle w:val="Heading3"/>
-      </w:pPr>
-      <w:bookmarkStart w:id="3" w:name="_Toc239675849"/>
+        <w:pStyle w:val="Ttulo3"/>
+      </w:pPr>
+      <w:bookmarkStart w:id="3" w:name="_Toc239694139"/>
       <w:r>
         <w:t>Objetivo General</w:t>
       </w:r>
@@ -2550,9 +2611,9 @@
     </w:p>
     <w:p>
       <w:pPr>
-        <w:pStyle w:val="Heading3"/>
-      </w:pPr>
-      <w:bookmarkStart w:id="4" w:name="_Toc239675850"/>
+        <w:pStyle w:val="Ttulo3"/>
+      </w:pPr>
+      <w:bookmarkStart w:id="4" w:name="_Toc239694140"/>
       <w:r>
         <w:t>Objetivos Específicos</w:t>
       </w:r>
@@ -2667,12 +2728,12 @@
     </w:p>
     <w:p>
       <w:pPr>
-        <w:pStyle w:val="Heading2"/>
-        <w:rPr>
-          <w:rFonts w:cs="Times New Roman"/>
-        </w:rPr>
-      </w:pPr>
-      <w:bookmarkStart w:id="5" w:name="_Toc239675851"/>
+        <w:pStyle w:val="Ttulo2"/>
+        <w:rPr>
+          <w:rFonts w:cs="Times New Roman"/>
+        </w:rPr>
+      </w:pPr>
+      <w:bookmarkStart w:id="5" w:name="_Toc239694141"/>
       <w:r>
         <w:rPr>
           <w:rFonts w:cs="Times New Roman"/>
@@ -2739,15 +2800,7 @@
       </w:r>
       <w:proofErr w:type="spellEnd"/>
       <w:r>
-        <w:t xml:space="preserve"> basado en HTML, CSS, JavaScript y </w:t>
-      </w:r>
-      <w:proofErr w:type="spellStart"/>
-      <w:r>
-        <w:t>Tailwind</w:t>
-      </w:r>
-      <w:proofErr w:type="spellEnd"/>
-      <w:r>
-        <w:t xml:space="preserve"> CSS, y una base de datos MySQL gestionada mediante Spring Data JPA.</w:t>
+        <w:t xml:space="preserve"> basado en HTML, CSS, JavaScript y Tailwind CSS, y una base de datos MySQL gestionada mediante Spring Data JPA.</w:t>
       </w:r>
     </w:p>
     <w:p>
@@ -2759,12 +2812,12 @@
     </w:p>
     <w:p>
       <w:pPr>
-        <w:pStyle w:val="Heading2"/>
-        <w:rPr>
-          <w:rFonts w:cs="Times New Roman"/>
-        </w:rPr>
-      </w:pPr>
-      <w:bookmarkStart w:id="6" w:name="_Toc239675852"/>
+        <w:pStyle w:val="Ttulo2"/>
+        <w:rPr>
+          <w:rFonts w:cs="Times New Roman"/>
+        </w:rPr>
+      </w:pPr>
+      <w:bookmarkStart w:id="6" w:name="_Toc239694142"/>
       <w:r>
         <w:rPr>
           <w:rFonts w:cs="Times New Roman"/>
@@ -3087,7 +3140,7 @@
     </w:p>
     <w:p>
       <w:pPr>
-        <w:pStyle w:val="Heading1"/>
+        <w:pStyle w:val="Ttulo1"/>
         <w:numPr>
           <w:ilvl w:val="0"/>
           <w:numId w:val="0"/>
@@ -3096,7 +3149,7 @@
           <w:rFonts w:cs="Times New Roman"/>
         </w:rPr>
       </w:pPr>
-      <w:bookmarkStart w:id="7" w:name="_Toc239675853"/>
+      <w:bookmarkStart w:id="7" w:name="_Toc239694143"/>
       <w:r>
         <w:rPr>
           <w:rFonts w:cs="Times New Roman"/>
@@ -3108,7 +3161,7 @@
     </w:p>
     <w:p>
       <w:pPr>
-        <w:pStyle w:val="ListParagraph"/>
+        <w:pStyle w:val="Prrafodelista"/>
         <w:keepNext/>
         <w:keepLines/>
         <w:numPr>
@@ -3128,40 +3181,106 @@
       </w:pPr>
       <w:bookmarkStart w:id="8" w:name="_Toc237517134"/>
       <w:bookmarkStart w:id="9" w:name="_Toc239675854"/>
+      <w:bookmarkStart w:id="10" w:name="_Toc239694144"/>
       <w:bookmarkEnd w:id="8"/>
       <w:bookmarkEnd w:id="9"/>
-    </w:p>
-    <w:p>
-      <w:pPr>
-        <w:pStyle w:val="Heading2"/>
-      </w:pPr>
-      <w:bookmarkStart w:id="10" w:name="_Toc239675855"/>
+      <w:bookmarkEnd w:id="10"/>
+    </w:p>
+    <w:p>
+      <w:pPr>
+        <w:pStyle w:val="Ttulo2"/>
+      </w:pPr>
+      <w:bookmarkStart w:id="11" w:name="_Toc239694145"/>
       <w:r>
         <w:t>Antecedentes</w:t>
       </w:r>
-      <w:bookmarkEnd w:id="10"/>
+      <w:bookmarkEnd w:id="11"/>
+    </w:p>
+    <w:p>
+      <w:pPr>
+        <w:pStyle w:val="Prrafodelista"/>
+        <w:numPr>
+          <w:ilvl w:val="0"/>
+          <w:numId w:val="5"/>
+        </w:numPr>
+        <w:ind w:hanging="720"/>
+        <w:rPr>
+          <w:b/>
+          <w:bCs/>
+        </w:rPr>
+      </w:pPr>
+      <w:r>
+        <w:rPr>
+          <w:b/>
+          <w:bCs/>
+        </w:rPr>
+        <w:t>Too Good To God</w:t>
+      </w:r>
+    </w:p>
+    <w:p>
+      <w:pPr>
+        <w:pStyle w:val="NormalWeb"/>
+        <w:jc w:val="both"/>
+      </w:pPr>
+      <w:r>
+        <w:t>Too Good To Go es una empresa fundada en Copenhague, Dinamarca, en 2016, cuyo propósito es contribuir a la reducción del desperdicio de alimentos. Su aplicación conecta a restaurantes, panaderías, cafeterías, supermercados y otros comercios que poseen productos no vendidos con consumidores interesados en adquirirlos a precios reducidos. Actualmente, la empresa señala que opera en 21 países y cuenta con una amplia red de usuarios y establecimientos asociados [1].</w:t>
+      </w:r>
+    </w:p>
+    <w:p>
+      <w:pPr>
+        <w:pStyle w:val="NormalWeb"/>
+        <w:jc w:val="both"/>
+      </w:pPr>
+      <w:r>
+        <w:t>Mediante la aplicación, los consumidores pueden localizar comercios cercanos, aplicar filtros de búsqueda y reservar una “bolsa sorpresa” que contiene alimentos excedentes. El contenido exacto no se conoce antes de la compra y debe recogerse presencialmente dentro del horario establecido por el comercio. La plataforma también permite registrar el ahorro económico y estimar el impacto ambiental producido por los alimentos recuperados [2].</w:t>
+      </w:r>
+    </w:p>
+    <w:p>
+      <w:pPr>
+        <w:pStyle w:val="NormalWeb"/>
+        <w:jc w:val="both"/>
+      </w:pPr>
+      <w:r>
+        <w:t xml:space="preserve">Esta solución constituye el antecedente más cercano a </w:t>
+      </w:r>
+      <w:r>
+        <w:t>MealFlow</w:t>
+      </w:r>
+      <w:r>
+        <w:t xml:space="preserve">, debido a que ambos proyectos proponen comercializar excedentes alimentarios mediante packs sorpresa con descuento y recojo presencial. Sin embargo, </w:t>
+      </w:r>
+      <w:r>
+        <w:t>MealFlow</w:t>
+      </w:r>
+      <w:r>
+        <w:t xml:space="preserve"> plantea una implementación adaptada a su primera versión académica y al contexto peruano, incorporando el registro de empresas con múltiples establecimientos, la revisión manual de documentos por cada local, pagos simulados mediante tarjeta de débito y Yape, pago presencial en efectivo mediante código QR y la confirmación del recojo mediante un código incluido en una boleta simulada.</w:t>
+      </w:r>
+    </w:p>
+    <w:p>
+      <w:pPr>
+        <w:pStyle w:val="Prrafodelista"/>
+      </w:pPr>
+    </w:p>
+    <w:p>
+      <w:pPr>
+        <w:pStyle w:val="Ttulo2"/>
+        <w:rPr>
+          <w:rFonts w:cs="Times New Roman"/>
+        </w:rPr>
+      </w:pPr>
+      <w:bookmarkStart w:id="12" w:name="_Toc239694146"/>
+      <w:r>
+        <w:rPr>
+          <w:rFonts w:cs="Times New Roman"/>
+        </w:rPr>
+        <w:t>Fundamento</w:t>
+      </w:r>
+      <w:bookmarkEnd w:id="12"/>
     </w:p>
     <w:p/>
     <w:p>
       <w:pPr>
-        <w:pStyle w:val="Heading2"/>
-        <w:rPr>
-          <w:rFonts w:cs="Times New Roman"/>
-        </w:rPr>
-      </w:pPr>
-      <w:bookmarkStart w:id="11" w:name="_Toc239675856"/>
-      <w:r>
-        <w:rPr>
-          <w:rFonts w:cs="Times New Roman"/>
-        </w:rPr>
-        <w:t>Fundamento</w:t>
-      </w:r>
-      <w:bookmarkEnd w:id="11"/>
-    </w:p>
-    <w:p/>
-    <w:p>
-      <w:pPr>
-        <w:pStyle w:val="Heading1"/>
+        <w:pStyle w:val="Ttulo1"/>
         <w:numPr>
           <w:ilvl w:val="0"/>
           <w:numId w:val="0"/>
@@ -3171,7 +3290,7 @@
           <w:rFonts w:cs="Times New Roman"/>
         </w:rPr>
       </w:pPr>
-      <w:bookmarkStart w:id="12" w:name="_Toc239675857"/>
+      <w:bookmarkStart w:id="13" w:name="_Toc239694147"/>
       <w:r>
         <w:rPr>
           <w:rFonts w:cs="Times New Roman"/>
@@ -3196,11 +3315,11 @@
         </w:rPr>
         <w:t>DESARROLLO DE LA SOLUCION</w:t>
       </w:r>
-      <w:bookmarkEnd w:id="12"/>
-    </w:p>
-    <w:p>
-      <w:pPr>
-        <w:pStyle w:val="ListParagraph"/>
+      <w:bookmarkEnd w:id="13"/>
+    </w:p>
+    <w:p>
+      <w:pPr>
+        <w:pStyle w:val="Prrafodelista"/>
         <w:keepNext/>
         <w:keepLines/>
         <w:numPr>
@@ -3218,31 +3337,33 @@
           <w:szCs w:val="40"/>
         </w:rPr>
       </w:pPr>
-      <w:bookmarkStart w:id="13" w:name="_Toc239675858"/>
-      <w:bookmarkEnd w:id="13"/>
-    </w:p>
-    <w:p>
-      <w:pPr>
-        <w:pStyle w:val="Heading2"/>
-      </w:pPr>
-      <w:bookmarkStart w:id="14" w:name="_Toc239675859"/>
+      <w:bookmarkStart w:id="14" w:name="_Toc239675858"/>
+      <w:bookmarkStart w:id="15" w:name="_Toc239694148"/>
+      <w:bookmarkEnd w:id="14"/>
+      <w:bookmarkEnd w:id="15"/>
+    </w:p>
+    <w:p>
+      <w:pPr>
+        <w:pStyle w:val="Ttulo2"/>
+      </w:pPr>
+      <w:bookmarkStart w:id="16" w:name="_Toc239694149"/>
       <w:r>
         <w:t>R</w:t>
       </w:r>
       <w:r>
         <w:t>equerimientos funcionales</w:t>
       </w:r>
-      <w:bookmarkEnd w:id="14"/>
+      <w:bookmarkEnd w:id="16"/>
     </w:p>
     <w:p/>
     <w:p>
       <w:pPr>
-        <w:pStyle w:val="Heading2"/>
-        <w:rPr>
-          <w:rFonts w:cs="Times New Roman"/>
-        </w:rPr>
-      </w:pPr>
-      <w:bookmarkStart w:id="15" w:name="_Toc239675860"/>
+        <w:pStyle w:val="Ttulo2"/>
+        <w:rPr>
+          <w:rFonts w:cs="Times New Roman"/>
+        </w:rPr>
+      </w:pPr>
+      <w:bookmarkStart w:id="17" w:name="_Toc239694150"/>
       <w:r>
         <w:rPr>
           <w:rFonts w:cs="Times New Roman"/>
@@ -3255,41 +3376,42 @@
         </w:rPr>
         <w:t>equerimientos no funcionales</w:t>
       </w:r>
-      <w:bookmarkEnd w:id="15"/>
+      <w:bookmarkEnd w:id="17"/>
     </w:p>
     <w:p/>
     <w:p>
       <w:pPr>
-        <w:pStyle w:val="Heading2"/>
-        <w:rPr>
-          <w:rFonts w:cs="Times New Roman"/>
-        </w:rPr>
-      </w:pPr>
-      <w:bookmarkStart w:id="16" w:name="_Toc239675861"/>
+        <w:pStyle w:val="Ttulo2"/>
+        <w:rPr>
+          <w:rFonts w:cs="Times New Roman"/>
+        </w:rPr>
+      </w:pPr>
+      <w:bookmarkStart w:id="18" w:name="_Toc239694151"/>
       <w:r>
         <w:rPr>
           <w:rFonts w:cs="Times New Roman"/>
         </w:rPr>
         <w:t>Diagrama de casos de uso</w:t>
       </w:r>
-      <w:bookmarkEnd w:id="16"/>
+      <w:bookmarkEnd w:id="18"/>
     </w:p>
     <w:p/>
     <w:p>
       <w:pPr>
-        <w:pStyle w:val="Heading2"/>
-        <w:rPr>
-          <w:rFonts w:cs="Times New Roman"/>
-        </w:rPr>
-      </w:pPr>
-      <w:bookmarkStart w:id="17" w:name="_Toc239675862"/>
-      <w:r>
-        <w:rPr>
-          <w:rFonts w:cs="Times New Roman"/>
-        </w:rPr>
+        <w:pStyle w:val="Ttulo2"/>
+        <w:rPr>
+          <w:rFonts w:cs="Times New Roman"/>
+        </w:rPr>
+      </w:pPr>
+      <w:bookmarkStart w:id="19" w:name="_Toc239694152"/>
+      <w:r>
+        <w:rPr>
+          <w:rFonts w:cs="Times New Roman"/>
+        </w:rPr>
+        <w:lastRenderedPageBreak/>
         <w:t>Diagrama de clases</w:t>
       </w:r>
-      <w:bookmarkEnd w:id="17"/>
+      <w:bookmarkEnd w:id="19"/>
     </w:p>
     <w:p>
       <w:r>
@@ -3342,36 +3464,35 @@
     </w:p>
     <w:p>
       <w:pPr>
-        <w:pStyle w:val="Heading2"/>
-        <w:rPr>
-          <w:rFonts w:cs="Times New Roman"/>
-        </w:rPr>
-      </w:pPr>
-      <w:bookmarkStart w:id="18" w:name="_Toc239675863"/>
-      <w:r>
-        <w:rPr>
-          <w:rFonts w:cs="Times New Roman"/>
-        </w:rPr>
-        <w:lastRenderedPageBreak/>
+        <w:pStyle w:val="Ttulo2"/>
+        <w:rPr>
+          <w:rFonts w:cs="Times New Roman"/>
+        </w:rPr>
+      </w:pPr>
+      <w:bookmarkStart w:id="20" w:name="_Toc239694153"/>
+      <w:r>
+        <w:rPr>
+          <w:rFonts w:cs="Times New Roman"/>
+        </w:rPr>
         <w:t>Diagrama ER de base de datos</w:t>
       </w:r>
-      <w:bookmarkEnd w:id="18"/>
-    </w:p>
-    <w:p>
-      <w:pPr>
-        <w:pStyle w:val="Heading2"/>
-        <w:rPr>
-          <w:rFonts w:cs="Times New Roman"/>
-        </w:rPr>
-      </w:pPr>
-      <w:bookmarkStart w:id="19" w:name="_Toc239675864"/>
+      <w:bookmarkEnd w:id="20"/>
+    </w:p>
+    <w:p>
+      <w:pPr>
+        <w:pStyle w:val="Ttulo2"/>
+        <w:rPr>
+          <w:rFonts w:cs="Times New Roman"/>
+        </w:rPr>
+      </w:pPr>
+      <w:bookmarkStart w:id="21" w:name="_Toc239694154"/>
       <w:r>
         <w:rPr>
           <w:rFonts w:cs="Times New Roman"/>
         </w:rPr>
         <w:t>Presentación del prototipo</w:t>
       </w:r>
-      <w:bookmarkEnd w:id="19"/>
+      <w:bookmarkEnd w:id="21"/>
       <w:r>
         <w:rPr>
           <w:rFonts w:cs="Times New Roman"/>
@@ -3381,35 +3502,35 @@
     </w:p>
     <w:p>
       <w:pPr>
-        <w:pStyle w:val="Heading2"/>
-        <w:rPr>
-          <w:rFonts w:cs="Times New Roman"/>
-        </w:rPr>
-      </w:pPr>
-      <w:bookmarkStart w:id="20" w:name="_Toc239675865"/>
+        <w:pStyle w:val="Ttulo2"/>
+        <w:rPr>
+          <w:rFonts w:cs="Times New Roman"/>
+        </w:rPr>
+      </w:pPr>
+      <w:bookmarkStart w:id="22" w:name="_Toc239694155"/>
       <w:r>
         <w:rPr>
           <w:rFonts w:cs="Times New Roman"/>
         </w:rPr>
         <w:t>Componentes de la aplicación</w:t>
       </w:r>
-      <w:bookmarkEnd w:id="20"/>
-    </w:p>
-    <w:p>
-      <w:pPr>
-        <w:pStyle w:val="Heading2"/>
-        <w:rPr>
-          <w:rFonts w:cs="Times New Roman"/>
-        </w:rPr>
-      </w:pPr>
-      <w:bookmarkStart w:id="21" w:name="_Toc239675866"/>
+      <w:bookmarkEnd w:id="22"/>
+    </w:p>
+    <w:p>
+      <w:pPr>
+        <w:pStyle w:val="Ttulo2"/>
+        <w:rPr>
+          <w:rFonts w:cs="Times New Roman"/>
+        </w:rPr>
+      </w:pPr>
+      <w:bookmarkStart w:id="23" w:name="_Toc239694156"/>
       <w:r>
         <w:rPr>
           <w:rFonts w:cs="Times New Roman"/>
         </w:rPr>
         <w:t>Interfaces, pantallas de ejecución y código</w:t>
       </w:r>
-      <w:bookmarkEnd w:id="21"/>
+      <w:bookmarkEnd w:id="23"/>
     </w:p>
     <w:p/>
     <w:p>
@@ -3421,7 +3542,7 @@
     </w:p>
     <w:p>
       <w:pPr>
-        <w:pStyle w:val="Heading1"/>
+        <w:pStyle w:val="Ttulo1"/>
         <w:numPr>
           <w:ilvl w:val="0"/>
           <w:numId w:val="0"/>
@@ -3431,7 +3552,7 @@
           <w:rFonts w:cs="Times New Roman"/>
         </w:rPr>
       </w:pPr>
-      <w:bookmarkStart w:id="22" w:name="_Toc239675867"/>
+      <w:bookmarkStart w:id="24" w:name="_Toc239694157"/>
       <w:r>
         <w:rPr>
           <w:rFonts w:cs="Times New Roman"/>
@@ -3444,11 +3565,11 @@
         </w:rPr>
         <w:t xml:space="preserve"> Y LECCIONES APRENDIDAS</w:t>
       </w:r>
-      <w:bookmarkEnd w:id="22"/>
-    </w:p>
-    <w:p>
-      <w:pPr>
-        <w:pStyle w:val="ListParagraph"/>
+      <w:bookmarkEnd w:id="24"/>
+    </w:p>
+    <w:p>
+      <w:pPr>
+        <w:pStyle w:val="Prrafodelista"/>
         <w:keepNext/>
         <w:keepLines/>
         <w:numPr>
@@ -3466,20 +3587,22 @@
           <w:szCs w:val="40"/>
         </w:rPr>
       </w:pPr>
-      <w:bookmarkStart w:id="23" w:name="_Toc237517148"/>
-      <w:bookmarkStart w:id="24" w:name="_Toc239675868"/>
-      <w:bookmarkEnd w:id="23"/>
-      <w:bookmarkEnd w:id="24"/>
-    </w:p>
-    <w:p>
-      <w:pPr>
-        <w:pStyle w:val="Heading2"/>
-      </w:pPr>
-      <w:bookmarkStart w:id="25" w:name="_Toc239675869"/>
+      <w:bookmarkStart w:id="25" w:name="_Toc237517148"/>
+      <w:bookmarkStart w:id="26" w:name="_Toc239675868"/>
+      <w:bookmarkStart w:id="27" w:name="_Toc239694158"/>
+      <w:bookmarkEnd w:id="25"/>
+      <w:bookmarkEnd w:id="26"/>
+      <w:bookmarkEnd w:id="27"/>
+    </w:p>
+    <w:p>
+      <w:pPr>
+        <w:pStyle w:val="Ttulo2"/>
+      </w:pPr>
+      <w:bookmarkStart w:id="28" w:name="_Toc239694159"/>
       <w:r>
         <w:t>Conclusiones</w:t>
       </w:r>
-      <w:bookmarkEnd w:id="25"/>
+      <w:bookmarkEnd w:id="28"/>
     </w:p>
     <w:p>
       <w:r>
@@ -3489,19 +3612,19 @@
     <w:p/>
     <w:p>
       <w:pPr>
-        <w:pStyle w:val="Heading2"/>
-        <w:rPr>
-          <w:rFonts w:cs="Times New Roman"/>
-        </w:rPr>
-      </w:pPr>
-      <w:bookmarkStart w:id="26" w:name="_Toc239675870"/>
+        <w:pStyle w:val="Ttulo2"/>
+        <w:rPr>
+          <w:rFonts w:cs="Times New Roman"/>
+        </w:rPr>
+      </w:pPr>
+      <w:bookmarkStart w:id="29" w:name="_Toc239694160"/>
       <w:r>
         <w:rPr>
           <w:rFonts w:cs="Times New Roman"/>
         </w:rPr>
         <w:t>Lecciones aprendidas</w:t>
       </w:r>
-      <w:bookmarkEnd w:id="26"/>
+      <w:bookmarkEnd w:id="29"/>
     </w:p>
     <w:p>
       <w:r>
@@ -3514,9 +3637,12 @@
         <w:t xml:space="preserve"> por cada integrante</w:t>
       </w:r>
     </w:p>
-    <w:p>
-      <w:pPr>
-        <w:pStyle w:val="Heading1"/>
+    <w:p/>
+    <w:p/>
+    <w:p/>
+    <w:p>
+      <w:pPr>
+        <w:pStyle w:val="Ttulo1"/>
         <w:numPr>
           <w:ilvl w:val="0"/>
           <w:numId w:val="0"/>
@@ -3526,20 +3652,219 @@
           <w:rFonts w:cs="Times New Roman"/>
           <w:b w:val="0"/>
           <w:bCs/>
-        </w:rPr>
-      </w:pPr>
-      <w:bookmarkStart w:id="27" w:name="_Toc239675871"/>
+          <w:lang w:val="en-US"/>
+        </w:rPr>
+      </w:pPr>
+      <w:bookmarkStart w:id="30" w:name="_Toc239694161"/>
+      <w:r>
+        <w:rPr>
+          <w:rFonts w:cs="Times New Roman"/>
+          <w:lang w:val="en-US"/>
+        </w:rPr>
+        <w:lastRenderedPageBreak/>
+        <w:t>REFERENCIAS BIBLIOGRÁFICAS</w:t>
+      </w:r>
+      <w:bookmarkEnd w:id="30"/>
+    </w:p>
+    <w:p>
+      <w:pPr>
+        <w:rPr>
+          <w:lang w:val="en-US"/>
+        </w:rPr>
+      </w:pPr>
+      <w:r>
+        <w:rPr>
+          <w:lang w:val="en-US"/>
+        </w:rPr>
+        <w:t xml:space="preserve">[1] Too Good </w:t>
+      </w:r>
+      <w:proofErr w:type="gramStart"/>
+      <w:r>
+        <w:rPr>
+          <w:lang w:val="en-US"/>
+        </w:rPr>
+        <w:t>To</w:t>
+      </w:r>
+      <w:proofErr w:type="gramEnd"/>
+      <w:r>
+        <w:rPr>
+          <w:lang w:val="en-US"/>
+        </w:rPr>
+        <w:t xml:space="preserve"> Go, “About us,” Too Good </w:t>
+      </w:r>
+      <w:proofErr w:type="gramStart"/>
+      <w:r>
+        <w:rPr>
+          <w:lang w:val="en-US"/>
+        </w:rPr>
+        <w:t>To</w:t>
+      </w:r>
+      <w:proofErr w:type="gramEnd"/>
+      <w:r>
+        <w:rPr>
+          <w:lang w:val="en-US"/>
+        </w:rPr>
+        <w:t xml:space="preserve"> Go. </w:t>
+      </w:r>
+      <w:r>
+        <w:rPr>
+          <w:lang w:val="es-PE"/>
+        </w:rPr>
+        <w:t xml:space="preserve">[En línea]. Disponible en: </w:t>
+      </w:r>
+      <w:hyperlink r:id="rId10" w:history="1">
+        <w:r>
+          <w:rPr>
+            <w:rStyle w:val="Hipervnculo"/>
+            <w:lang w:val="es-PE"/>
+          </w:rPr>
+          <w:t>https://www.toogoodtogo.com/en-us/about-us</w:t>
+        </w:r>
+      </w:hyperlink>
+      <w:r>
+        <w:rPr>
+          <w:lang w:val="es-PE"/>
+        </w:rPr>
+        <w:t xml:space="preserve">. </w:t>
+      </w:r>
+      <w:r>
+        <w:rPr>
+          <w:lang w:val="en-US"/>
+        </w:rPr>
+        <w:t>[</w:t>
+      </w:r>
+      <w:proofErr w:type="spellStart"/>
+      <w:r>
+        <w:rPr>
+          <w:lang w:val="en-US"/>
+        </w:rPr>
+        <w:t>Accedido</w:t>
+      </w:r>
+      <w:proofErr w:type="spellEnd"/>
+      <w:r>
+        <w:rPr>
+          <w:lang w:val="en-US"/>
+        </w:rPr>
+        <w:t>: 7-sep-2026].</w:t>
+      </w:r>
+    </w:p>
+    <w:p>
+      <w:pPr>
+        <w:rPr>
+          <w:lang w:val="es-PE"/>
+        </w:rPr>
+      </w:pPr>
+      <w:r>
+        <w:rPr>
+          <w:lang w:val="en-US"/>
+        </w:rPr>
+        <w:t xml:space="preserve">[2] Too Good </w:t>
+      </w:r>
+      <w:proofErr w:type="gramStart"/>
+      <w:r>
+        <w:rPr>
+          <w:lang w:val="en-US"/>
+        </w:rPr>
+        <w:t>To</w:t>
+      </w:r>
+      <w:proofErr w:type="gramEnd"/>
+      <w:r>
+        <w:rPr>
+          <w:lang w:val="en-US"/>
+        </w:rPr>
+        <w:t xml:space="preserve"> Go, “How does the Too Good </w:t>
+      </w:r>
+      <w:proofErr w:type="gramStart"/>
+      <w:r>
+        <w:rPr>
+          <w:lang w:val="en-US"/>
+        </w:rPr>
+        <w:t>To</w:t>
+      </w:r>
+      <w:proofErr w:type="gramEnd"/>
+      <w:r>
+        <w:rPr>
+          <w:lang w:val="en-US"/>
+        </w:rPr>
+        <w:t xml:space="preserve"> Go app </w:t>
+      </w:r>
+      <w:proofErr w:type="gramStart"/>
+      <w:r>
+        <w:rPr>
+          <w:lang w:val="en-US"/>
+        </w:rPr>
+        <w:t>work?,</w:t>
+      </w:r>
+      <w:proofErr w:type="gramEnd"/>
+      <w:r>
+        <w:rPr>
+          <w:lang w:val="en-US"/>
+        </w:rPr>
+        <w:t xml:space="preserve">” Too Good </w:t>
+      </w:r>
+      <w:proofErr w:type="gramStart"/>
+      <w:r>
+        <w:rPr>
+          <w:lang w:val="en-US"/>
+        </w:rPr>
+        <w:t>To</w:t>
+      </w:r>
+      <w:proofErr w:type="gramEnd"/>
+      <w:r>
+        <w:rPr>
+          <w:lang w:val="en-US"/>
+        </w:rPr>
+        <w:t xml:space="preserve"> Go. </w:t>
+      </w:r>
+      <w:r>
+        <w:rPr>
+          <w:lang w:val="es-PE"/>
+        </w:rPr>
+        <w:t xml:space="preserve">[En línea]. Disponible en: </w:t>
+      </w:r>
+      <w:hyperlink r:id="rId11" w:history="1">
+        <w:r>
+          <w:rPr>
+            <w:rStyle w:val="Hipervnculo"/>
+            <w:lang w:val="es-PE"/>
+          </w:rPr>
+          <w:t>https://www.toogoodtogo.com/en-us/how-does-the-app-work</w:t>
+        </w:r>
+      </w:hyperlink>
+      <w:r>
+        <w:rPr>
+          <w:lang w:val="es-PE"/>
+        </w:rPr>
+        <w:t>. [Accedido: 7-sep-2026].</w:t>
+      </w:r>
+    </w:p>
+    <w:p/>
+    <w:p>
+      <w:pPr>
+        <w:pStyle w:val="Ttulo1"/>
+        <w:numPr>
+          <w:ilvl w:val="0"/>
+          <w:numId w:val="0"/>
+        </w:numPr>
+        <w:ind w:left="432" w:hanging="432"/>
+        <w:rPr>
+          <w:rFonts w:cs="Times New Roman"/>
+          <w:b w:val="0"/>
+          <w:bCs/>
+        </w:rPr>
+      </w:pPr>
+      <w:bookmarkStart w:id="31" w:name="_Toc239694162"/>
       <w:r>
         <w:rPr>
           <w:rFonts w:cs="Times New Roman"/>
         </w:rPr>
         <w:t>ANEXOS</w:t>
       </w:r>
-      <w:bookmarkEnd w:id="27"/>
-    </w:p>
-    <w:p>
-      <w:pPr>
-        <w:pStyle w:val="ListParagraph"/>
+      <w:bookmarkEnd w:id="31"/>
+    </w:p>
+    <w:p>
+      <w:pPr>
+        <w:pStyle w:val="Prrafodelista"/>
         <w:numPr>
           <w:ilvl w:val="0"/>
           <w:numId w:val="2"/>
@@ -3561,7 +3886,7 @@
     </w:p>
     <w:p>
       <w:pPr>
-        <w:pStyle w:val="ListParagraph"/>
+        <w:pStyle w:val="Prrafodelista"/>
         <w:numPr>
           <w:ilvl w:val="0"/>
           <w:numId w:val="2"/>
@@ -3583,7 +3908,7 @@
     </w:p>
     <w:p>
       <w:pPr>
-        <w:pStyle w:val="ListParagraph"/>
+        <w:pStyle w:val="Prrafodelista"/>
         <w:numPr>
           <w:ilvl w:val="0"/>
           <w:numId w:val="2"/>
@@ -3613,7 +3938,7 @@
     </w:p>
     <w:p>
       <w:pPr>
-        <w:pStyle w:val="ListParagraph"/>
+        <w:pStyle w:val="Prrafodelista"/>
         <w:numPr>
           <w:ilvl w:val="0"/>
           <w:numId w:val="2"/>
@@ -3635,7 +3960,7 @@
     </w:p>
     <w:p>
       <w:pPr>
-        <w:pStyle w:val="ListParagraph"/>
+        <w:pStyle w:val="Prrafodelista"/>
         <w:numPr>
           <w:ilvl w:val="0"/>
           <w:numId w:val="2"/>
@@ -3657,7 +3982,7 @@
     </w:p>
     <w:p>
       <w:pPr>
-        <w:pStyle w:val="ListParagraph"/>
+        <w:pStyle w:val="Prrafodelista"/>
         <w:numPr>
           <w:ilvl w:val="0"/>
           <w:numId w:val="2"/>
@@ -3679,7 +4004,7 @@
     </w:p>
     <w:p>
       <w:pPr>
-        <w:pStyle w:val="ListParagraph"/>
+        <w:pStyle w:val="Prrafodelista"/>
         <w:numPr>
           <w:ilvl w:val="0"/>
           <w:numId w:val="2"/>
@@ -3707,7 +4032,7 @@
       </w:pPr>
     </w:p>
     <w:sectPr>
-      <w:footerReference w:type="default" r:id="rId10"/>
+      <w:footerReference w:type="default" r:id="rId12"/>
       <w:pgSz w:w="11906" w:h="16838" w:code="9"/>
       <w:pgMar w:top="1418" w:right="1701" w:bottom="1418" w:left="1701" w:header="709" w:footer="709" w:gutter="0"/>
       <w:cols w:space="708"/>
@@ -3755,7 +4080,7 @@
     <w:sdtContent>
       <w:p>
         <w:pPr>
-          <w:pStyle w:val="Footer"/>
+          <w:pStyle w:val="Piedepgina"/>
           <w:jc w:val="right"/>
         </w:pPr>
         <w:r>
@@ -3781,7 +4106,7 @@
   </w:sdt>
   <w:p>
     <w:pPr>
-      <w:pStyle w:val="Footer"/>
+      <w:pStyle w:val="Piedepgina"/>
     </w:pPr>
   </w:p>
 </w:ftr>
@@ -3815,6 +4140,95 @@
 <file path=word/numbering.xml><?xml version="1.0" encoding="utf-8"?>
 <w:numbering xmlns:wpc="http://schemas.microsoft.com/office/word/2010/wordprocessingCanvas" xmlns:cx="http://schemas.microsoft.com/office/drawing/2014/chartex" xmlns:cx1="http://schemas.microsoft.com/office/drawing/2015/9/8/chartex" xmlns:cx2="http://schemas.microsoft.com/office/drawing/2015/10/21/chartex" xmlns:cx3="http://schemas.microsoft.com/office/drawing/2016/5/9/chartex" xmlns:cx4="http://schemas.microsoft.com/office/drawing/2016/5/10/chartex" xmlns:cx5="http://schemas.microsoft.com/office/drawing/2016/5/11/chartex" xmlns:cx6="http://schemas.microsoft.com/office/drawing/2016/5/12/chartex" xmlns:cx7="http://schemas.microsoft.com/office/drawing/2016/5/13/chartex" xmlns:cx8="http://schemas.microsoft.com/office/drawing/2016/5/14/chartex" xmlns:mc="http://schemas.openxmlformats.org/markup-compatibility/2006" xmlns:aink="http://schemas.microsoft.com/office/drawing/2016/ink" xmlns:am3d="http://schemas.microsoft.com/office/drawing/2017/model3d" xmlns:o="urn:schemas-microsoft-com:office:office" xmlns:oel="http://schemas.microsoft.com/office/2019/extlst" xmlns:r="http://schemas.openxmlformats.org/officeDocument/2006/relationships" xmlns:m="http://schemas.openxmlformats.org/officeDocument/2006/math" xmlns:v="urn:schemas-microsoft-com:vml" xmlns:wp14="http://schemas.microsoft.com/office/word/2010/wordprocessingDrawing" xmlns:wp="http://schemas.openxmlformats.org/drawingml/2006/wordprocessingDrawing" xmlns:w10="urn:schemas-microsoft-com:office:word" xmlns:w="http://schemas.openxmlformats.org/wordprocessingml/2006/main" xmlns:w14="http://schemas.microsoft.com/office/word/2010/wordml" xmlns:w15="http://schemas.microsoft.com/office/word/2012/wordml" xmlns:w16cex="http://schemas.microsoft.com/office/word/2018/wordml/cex" xmlns:w16cid="http://schemas.microsoft.com/office/word/2016/wordml/cid" xmlns:w16="http://schemas.microsoft.com/office/word/2018/wordml" xmlns:w16du="http://schemas.microsoft.com/office/word/2023/wordml/word16du" xmlns:w16sdtdh="http://schemas.microsoft.com/office/word/2020/wordml/sdtdatahash" xmlns:w16sdtfl="http://schemas.microsoft.com/office/word/2024/wordml/sdtformatlock" xmlns:w16se="http://schemas.microsoft.com/office/word/2015/wordml/symex" xmlns:wpg="http://schemas.microsoft.com/office/word/2010/wordprocessingGroup" xmlns:wpi="http://schemas.microsoft.com/office/word/2010/wordprocessingInk" xmlns:wne="http://schemas.microsoft.com/office/word/2006/wordml" xmlns:wps="http://schemas.microsoft.com/office/word/2010/wordprocessingShape" mc:Ignorable="w14 w15 w16se w16cid w16 w16cex w16sdtdh w16sdtfl w16du wp14">
   <w:abstractNum w:abstractNumId="0" w15:restartNumberingAfterBreak="0">
+    <w:nsid w:val="2B4B16B6"/>
+    <w:multiLevelType w:val="hybridMultilevel"/>
+    <w:tmpl w:val="D3B200E8"/>
+    <w:lvl w:ilvl="0" w:tplc="E4529F28">
+      <w:start w:val="1"/>
+      <w:numFmt w:val="decimal"/>
+      <w:lvlText w:val="2.1.%1"/>
+      <w:lvlJc w:val="left"/>
+      <w:pPr>
+        <w:ind w:left="720" w:hanging="360"/>
+      </w:pPr>
+      <w:rPr>
+        <w:rFonts w:hint="default"/>
+      </w:rPr>
+    </w:lvl>
+    <w:lvl w:ilvl="1" w:tplc="280A0019" w:tentative="1">
+      <w:start w:val="1"/>
+      <w:numFmt w:val="lowerLetter"/>
+      <w:lvlText w:val="%2."/>
+      <w:lvlJc w:val="left"/>
+      <w:pPr>
+        <w:ind w:left="1440" w:hanging="360"/>
+      </w:pPr>
+    </w:lvl>
+    <w:lvl w:ilvl="2" w:tplc="280A001B" w:tentative="1">
+      <w:start w:val="1"/>
+      <w:numFmt w:val="lowerRoman"/>
+      <w:lvlText w:val="%3."/>
+      <w:lvlJc w:val="right"/>
+      <w:pPr>
+        <w:ind w:left="2160" w:hanging="180"/>
+      </w:pPr>
+    </w:lvl>
+    <w:lvl w:ilvl="3" w:tplc="280A000F" w:tentative="1">
+      <w:start w:val="1"/>
+      <w:numFmt w:val="decimal"/>
+      <w:lvlText w:val="%4."/>
+      <w:lvlJc w:val="left"/>
+      <w:pPr>
+        <w:ind w:left="2880" w:hanging="360"/>
+      </w:pPr>
+    </w:lvl>
+    <w:lvl w:ilvl="4" w:tplc="280A0019" w:tentative="1">
+      <w:start w:val="1"/>
+      <w:numFmt w:val="lowerLetter"/>
+      <w:lvlText w:val="%5."/>
+      <w:lvlJc w:val="left"/>
+      <w:pPr>
+        <w:ind w:left="3600" w:hanging="360"/>
+      </w:pPr>
+    </w:lvl>
+    <w:lvl w:ilvl="5" w:tplc="280A001B" w:tentative="1">
+      <w:start w:val="1"/>
+      <w:numFmt w:val="lowerRoman"/>
+      <w:lvlText w:val="%6."/>
+      <w:lvlJc w:val="right"/>
+      <w:pPr>
+        <w:ind w:left="4320" w:hanging="180"/>
+      </w:pPr>
+    </w:lvl>
+    <w:lvl w:ilvl="6" w:tplc="280A000F" w:tentative="1">
+      <w:start w:val="1"/>
+      <w:numFmt w:val="decimal"/>
+      <w:lvlText w:val="%7."/>
+      <w:lvlJc w:val="left"/>
+      <w:pPr>
+        <w:ind w:left="5040" w:hanging="360"/>
+      </w:pPr>
+    </w:lvl>
+    <w:lvl w:ilvl="7" w:tplc="280A0019" w:tentative="1">
+      <w:start w:val="1"/>
+      <w:numFmt w:val="lowerLetter"/>
+      <w:lvlText w:val="%8."/>
+      <w:lvlJc w:val="left"/>
+      <w:pPr>
+        <w:ind w:left="5760" w:hanging="360"/>
+      </w:pPr>
+    </w:lvl>
+    <w:lvl w:ilvl="8" w:tplc="280A001B" w:tentative="1">
+      <w:start w:val="1"/>
+      <w:numFmt w:val="lowerRoman"/>
+      <w:lvlText w:val="%9."/>
+      <w:lvlJc w:val="right"/>
+      <w:pPr>
+        <w:ind w:left="6480" w:hanging="180"/>
+      </w:pPr>
+    </w:lvl>
+  </w:abstractNum>
+  <w:abstractNum w:abstractNumId="1" w15:restartNumberingAfterBreak="0">
     <w:nsid w:val="36727132"/>
     <w:multiLevelType w:val="multilevel"/>
     <w:tmpl w:val="A4802CF2"/>
@@ -3963,7 +4377,7 @@
       </w:rPr>
     </w:lvl>
   </w:abstractNum>
-  <w:abstractNum w:abstractNumId="1" w15:restartNumberingAfterBreak="0">
+  <w:abstractNum w:abstractNumId="2" w15:restartNumberingAfterBreak="0">
     <w:nsid w:val="4EDD4128"/>
     <w:multiLevelType w:val="multilevel"/>
     <w:tmpl w:val="CB4A7778"/>
@@ -4076,14 +4490,14 @@
       </w:pPr>
     </w:lvl>
   </w:abstractNum>
-  <w:abstractNum w:abstractNumId="2" w15:restartNumberingAfterBreak="0">
+  <w:abstractNum w:abstractNumId="3" w15:restartNumberingAfterBreak="0">
     <w:nsid w:val="55014280"/>
     <w:multiLevelType w:val="multilevel"/>
     <w:tmpl w:val="151E8C76"/>
     <w:lvl w:ilvl="0">
       <w:start w:val="1"/>
       <w:numFmt w:val="decimal"/>
-      <w:pStyle w:val="Heading1"/>
+      <w:pStyle w:val="Ttulo1"/>
       <w:lvlText w:val="%1"/>
       <w:lvlJc w:val="left"/>
       <w:pPr>
@@ -4093,7 +4507,7 @@
     <w:lvl w:ilvl="1">
       <w:start w:val="1"/>
       <w:numFmt w:val="decimal"/>
-      <w:pStyle w:val="Heading2"/>
+      <w:pStyle w:val="Ttulo2"/>
       <w:lvlText w:val="%1.%2"/>
       <w:lvlJc w:val="left"/>
       <w:pPr>
@@ -4106,7 +4520,7 @@
     <w:lvl w:ilvl="2">
       <w:start w:val="1"/>
       <w:numFmt w:val="decimal"/>
-      <w:pStyle w:val="Heading3"/>
+      <w:pStyle w:val="Ttulo3"/>
       <w:lvlText w:val="%1.%2.%3"/>
       <w:lvlJc w:val="left"/>
       <w:pPr>
@@ -4116,7 +4530,7 @@
     <w:lvl w:ilvl="3">
       <w:start w:val="1"/>
       <w:numFmt w:val="decimal"/>
-      <w:pStyle w:val="Heading4"/>
+      <w:pStyle w:val="Ttulo4"/>
       <w:lvlText w:val="%1.%2.%3.%4"/>
       <w:lvlJc w:val="left"/>
       <w:pPr>
@@ -4126,7 +4540,7 @@
     <w:lvl w:ilvl="4">
       <w:start w:val="1"/>
       <w:numFmt w:val="decimal"/>
-      <w:pStyle w:val="Heading5"/>
+      <w:pStyle w:val="Ttulo5"/>
       <w:lvlText w:val="%1.%2.%3.%4.%5"/>
       <w:lvlJc w:val="left"/>
       <w:pPr>
@@ -4136,7 +4550,7 @@
     <w:lvl w:ilvl="5">
       <w:start w:val="1"/>
       <w:numFmt w:val="decimal"/>
-      <w:pStyle w:val="Heading6"/>
+      <w:pStyle w:val="Ttulo6"/>
       <w:lvlText w:val="%1.%2.%3.%4.%5.%6"/>
       <w:lvlJc w:val="left"/>
       <w:pPr>
@@ -4146,7 +4560,7 @@
     <w:lvl w:ilvl="6">
       <w:start w:val="1"/>
       <w:numFmt w:val="decimal"/>
-      <w:pStyle w:val="Heading7"/>
+      <w:pStyle w:val="Ttulo7"/>
       <w:lvlText w:val="%1.%2.%3.%4.%5.%6.%7"/>
       <w:lvlJc w:val="left"/>
       <w:pPr>
@@ -4156,7 +4570,7 @@
     <w:lvl w:ilvl="7">
       <w:start w:val="1"/>
       <w:numFmt w:val="decimal"/>
-      <w:pStyle w:val="Heading8"/>
+      <w:pStyle w:val="Ttulo8"/>
       <w:lvlText w:val="%1.%2.%3.%4.%5.%6.%7.%8"/>
       <w:lvlJc w:val="left"/>
       <w:pPr>
@@ -4166,7 +4580,7 @@
     <w:lvl w:ilvl="8">
       <w:start w:val="1"/>
       <w:numFmt w:val="decimal"/>
-      <w:pStyle w:val="Heading9"/>
+      <w:pStyle w:val="Ttulo9"/>
       <w:lvlText w:val="%1.%2.%3.%4.%5.%6.%7.%8.%9"/>
       <w:lvlJc w:val="left"/>
       <w:pPr>
@@ -4174,7 +4588,7 @@
       </w:pPr>
     </w:lvl>
   </w:abstractNum>
-  <w:abstractNum w:abstractNumId="3" w15:restartNumberingAfterBreak="0">
+  <w:abstractNum w:abstractNumId="4" w15:restartNumberingAfterBreak="0">
     <w:nsid w:val="60863327"/>
     <w:multiLevelType w:val="hybridMultilevel"/>
     <w:tmpl w:val="CC126FE2"/>
@@ -4288,16 +4702,19 @@
     </w:lvl>
   </w:abstractNum>
   <w:num w:numId="1" w16cid:durableId="1226794499">
+    <w:abstractNumId w:val="3"/>
+  </w:num>
+  <w:num w:numId="2" w16cid:durableId="1713000286">
+    <w:abstractNumId w:val="4"/>
+  </w:num>
+  <w:num w:numId="3" w16cid:durableId="1176849368">
+    <w:abstractNumId w:val="1"/>
+  </w:num>
+  <w:num w:numId="4" w16cid:durableId="1734425577">
     <w:abstractNumId w:val="2"/>
   </w:num>
-  <w:num w:numId="2" w16cid:durableId="1713000286">
-    <w:abstractNumId w:val="3"/>
-  </w:num>
-  <w:num w:numId="3" w16cid:durableId="1176849368">
+  <w:num w:numId="5" w16cid:durableId="700980336">
     <w:abstractNumId w:val="0"/>
-  </w:num>
-  <w:num w:numId="4" w16cid:durableId="1734425577">
-    <w:abstractNumId w:val="1"/>
   </w:num>
   <w:numIdMacAtCleanup w:val="2"/>
 </w:numbering>
@@ -4704,11 +5121,11 @@
     <w:name w:val="Normal"/>
     <w:qFormat/>
   </w:style>
-  <w:style w:type="paragraph" w:styleId="Heading1">
+  <w:style w:type="paragraph" w:styleId="Ttulo1">
     <w:name w:val="heading 1"/>
     <w:basedOn w:val="Normal"/>
     <w:next w:val="Normal"/>
-    <w:link w:val="Heading1Char"/>
+    <w:link w:val="Ttulo1Car"/>
     <w:uiPriority w:val="9"/>
     <w:qFormat/>
     <w:rsid w:val="00E45456"/>
@@ -4728,11 +5145,11 @@
       <w:szCs w:val="40"/>
     </w:rPr>
   </w:style>
-  <w:style w:type="paragraph" w:styleId="Heading2">
+  <w:style w:type="paragraph" w:styleId="Ttulo2">
     <w:name w:val="heading 2"/>
     <w:basedOn w:val="Normal"/>
     <w:next w:val="Normal"/>
-    <w:link w:val="Heading2Char"/>
+    <w:link w:val="Ttulo2Car"/>
     <w:uiPriority w:val="9"/>
     <w:unhideWhenUsed/>
     <w:qFormat/>
@@ -4753,11 +5170,11 @@
       <w:szCs w:val="32"/>
     </w:rPr>
   </w:style>
-  <w:style w:type="paragraph" w:styleId="Heading3">
+  <w:style w:type="paragraph" w:styleId="Ttulo3">
     <w:name w:val="heading 3"/>
     <w:basedOn w:val="Normal"/>
     <w:next w:val="Normal"/>
-    <w:link w:val="Heading3Char"/>
+    <w:link w:val="Ttulo3Car"/>
     <w:uiPriority w:val="9"/>
     <w:unhideWhenUsed/>
     <w:qFormat/>
@@ -4778,11 +5195,11 @@
       <w:szCs w:val="28"/>
     </w:rPr>
   </w:style>
-  <w:style w:type="paragraph" w:styleId="Heading4">
+  <w:style w:type="paragraph" w:styleId="Ttulo4">
     <w:name w:val="heading 4"/>
     <w:basedOn w:val="Normal"/>
     <w:next w:val="Normal"/>
-    <w:link w:val="Heading4Char"/>
+    <w:link w:val="Ttulo4Car"/>
     <w:uiPriority w:val="9"/>
     <w:semiHidden/>
     <w:unhideWhenUsed/>
@@ -4805,11 +5222,11 @@
       <w:color w:val="0F4761" w:themeColor="accent1" w:themeShade="BF"/>
     </w:rPr>
   </w:style>
-  <w:style w:type="paragraph" w:styleId="Heading5">
+  <w:style w:type="paragraph" w:styleId="Ttulo5">
     <w:name w:val="heading 5"/>
     <w:basedOn w:val="Normal"/>
     <w:next w:val="Normal"/>
-    <w:link w:val="Heading5Char"/>
+    <w:link w:val="Ttulo5Car"/>
     <w:uiPriority w:val="9"/>
     <w:semiHidden/>
     <w:unhideWhenUsed/>
@@ -4830,11 +5247,11 @@
       <w:color w:val="0F4761" w:themeColor="accent1" w:themeShade="BF"/>
     </w:rPr>
   </w:style>
-  <w:style w:type="paragraph" w:styleId="Heading6">
+  <w:style w:type="paragraph" w:styleId="Ttulo6">
     <w:name w:val="heading 6"/>
     <w:basedOn w:val="Normal"/>
     <w:next w:val="Normal"/>
-    <w:link w:val="Heading6Char"/>
+    <w:link w:val="Ttulo6Car"/>
     <w:uiPriority w:val="9"/>
     <w:semiHidden/>
     <w:unhideWhenUsed/>
@@ -4857,11 +5274,11 @@
       <w:color w:val="595959" w:themeColor="text1" w:themeTint="A6"/>
     </w:rPr>
   </w:style>
-  <w:style w:type="paragraph" w:styleId="Heading7">
+  <w:style w:type="paragraph" w:styleId="Ttulo7">
     <w:name w:val="heading 7"/>
     <w:basedOn w:val="Normal"/>
     <w:next w:val="Normal"/>
-    <w:link w:val="Heading7Char"/>
+    <w:link w:val="Ttulo7Car"/>
     <w:uiPriority w:val="9"/>
     <w:semiHidden/>
     <w:unhideWhenUsed/>
@@ -4882,11 +5299,11 @@
       <w:color w:val="595959" w:themeColor="text1" w:themeTint="A6"/>
     </w:rPr>
   </w:style>
-  <w:style w:type="paragraph" w:styleId="Heading8">
+  <w:style w:type="paragraph" w:styleId="Ttulo8">
     <w:name w:val="heading 8"/>
     <w:basedOn w:val="Normal"/>
     <w:next w:val="Normal"/>
-    <w:link w:val="Heading8Char"/>
+    <w:link w:val="Ttulo8Car"/>
     <w:uiPriority w:val="9"/>
     <w:semiHidden/>
     <w:unhideWhenUsed/>
@@ -4909,11 +5326,11 @@
       <w:color w:val="272727" w:themeColor="text1" w:themeTint="D8"/>
     </w:rPr>
   </w:style>
-  <w:style w:type="paragraph" w:styleId="Heading9">
+  <w:style w:type="paragraph" w:styleId="Ttulo9">
     <w:name w:val="heading 9"/>
     <w:basedOn w:val="Normal"/>
     <w:next w:val="Normal"/>
-    <w:link w:val="Heading9Char"/>
+    <w:link w:val="Ttulo9Car"/>
     <w:uiPriority w:val="9"/>
     <w:semiHidden/>
     <w:unhideWhenUsed/>
@@ -4934,12 +5351,12 @@
       <w:color w:val="272727" w:themeColor="text1" w:themeTint="D8"/>
     </w:rPr>
   </w:style>
-  <w:style w:type="character" w:default="1" w:styleId="DefaultParagraphFont">
+  <w:style w:type="character" w:default="1" w:styleId="Fuentedeprrafopredeter">
     <w:name w:val="Default Paragraph Font"/>
     <w:uiPriority w:val="1"/>
     <w:unhideWhenUsed/>
   </w:style>
-  <w:style w:type="table" w:default="1" w:styleId="TableNormal">
+  <w:style w:type="table" w:default="1" w:styleId="Tablanormal">
     <w:name w:val="Normal Table"/>
     <w:uiPriority w:val="99"/>
     <w:semiHidden/>
@@ -4954,16 +5371,16 @@
       </w:tblCellMar>
     </w:tblPr>
   </w:style>
-  <w:style w:type="numbering" w:default="1" w:styleId="NoList">
+  <w:style w:type="numbering" w:default="1" w:styleId="Sinlista">
     <w:name w:val="No List"/>
     <w:uiPriority w:val="99"/>
     <w:semiHidden/>
     <w:unhideWhenUsed/>
   </w:style>
-  <w:style w:type="character" w:customStyle="1" w:styleId="Heading1Char">
-    <w:name w:val="Heading 1 Char"/>
-    <w:basedOn w:val="DefaultParagraphFont"/>
-    <w:link w:val="Heading1"/>
+  <w:style w:type="character" w:customStyle="1" w:styleId="Ttulo1Car">
+    <w:name w:val="Título 1 Car"/>
+    <w:basedOn w:val="Fuentedeprrafopredeter"/>
+    <w:link w:val="Ttulo1"/>
     <w:uiPriority w:val="9"/>
     <w:rsid w:val="00E45456"/>
     <w:rPr>
@@ -4973,10 +5390,10 @@
       <w:szCs w:val="40"/>
     </w:rPr>
   </w:style>
-  <w:style w:type="character" w:customStyle="1" w:styleId="Heading2Char">
-    <w:name w:val="Heading 2 Char"/>
-    <w:basedOn w:val="DefaultParagraphFont"/>
-    <w:link w:val="Heading2"/>
+  <w:style w:type="character" w:customStyle="1" w:styleId="Ttulo2Car">
+    <w:name w:val="Título 2 Car"/>
+    <w:basedOn w:val="Fuentedeprrafopredeter"/>
+    <w:link w:val="Ttulo2"/>
     <w:uiPriority w:val="9"/>
     <w:rsid w:val="00E45456"/>
     <w:rPr>
@@ -4985,10 +5402,10 @@
       <w:szCs w:val="32"/>
     </w:rPr>
   </w:style>
-  <w:style w:type="character" w:customStyle="1" w:styleId="Heading3Char">
-    <w:name w:val="Heading 3 Char"/>
-    <w:basedOn w:val="DefaultParagraphFont"/>
-    <w:link w:val="Heading3"/>
+  <w:style w:type="character" w:customStyle="1" w:styleId="Ttulo3Car">
+    <w:name w:val="Título 3 Car"/>
+    <w:basedOn w:val="Fuentedeprrafopredeter"/>
+    <w:link w:val="Ttulo3"/>
     <w:uiPriority w:val="9"/>
     <w:rsid w:val="00381D2B"/>
     <w:rPr>
@@ -4997,10 +5414,10 @@
       <w:szCs w:val="28"/>
     </w:rPr>
   </w:style>
-  <w:style w:type="character" w:customStyle="1" w:styleId="Heading4Char">
-    <w:name w:val="Heading 4 Char"/>
-    <w:basedOn w:val="DefaultParagraphFont"/>
-    <w:link w:val="Heading4"/>
+  <w:style w:type="character" w:customStyle="1" w:styleId="Ttulo4Car">
+    <w:name w:val="Título 4 Car"/>
+    <w:basedOn w:val="Fuentedeprrafopredeter"/>
+    <w:link w:val="Ttulo4"/>
     <w:uiPriority w:val="9"/>
     <w:semiHidden/>
     <w:rsid w:val="00123A8E"/>
@@ -5011,10 +5428,10 @@
       <w:color w:val="0F4761" w:themeColor="accent1" w:themeShade="BF"/>
     </w:rPr>
   </w:style>
-  <w:style w:type="character" w:customStyle="1" w:styleId="Heading5Char">
-    <w:name w:val="Heading 5 Char"/>
-    <w:basedOn w:val="DefaultParagraphFont"/>
-    <w:link w:val="Heading5"/>
+  <w:style w:type="character" w:customStyle="1" w:styleId="Ttulo5Car">
+    <w:name w:val="Título 5 Car"/>
+    <w:basedOn w:val="Fuentedeprrafopredeter"/>
+    <w:link w:val="Ttulo5"/>
     <w:uiPriority w:val="9"/>
     <w:semiHidden/>
     <w:rsid w:val="00123A8E"/>
@@ -5023,10 +5440,10 @@
       <w:color w:val="0F4761" w:themeColor="accent1" w:themeShade="BF"/>
     </w:rPr>
   </w:style>
-  <w:style w:type="character" w:customStyle="1" w:styleId="Heading6Char">
-    <w:name w:val="Heading 6 Char"/>
-    <w:basedOn w:val="DefaultParagraphFont"/>
-    <w:link w:val="Heading6"/>
+  <w:style w:type="character" w:customStyle="1" w:styleId="Ttulo6Car">
+    <w:name w:val="Título 6 Car"/>
+    <w:basedOn w:val="Fuentedeprrafopredeter"/>
+    <w:link w:val="Ttulo6"/>
     <w:uiPriority w:val="9"/>
     <w:semiHidden/>
     <w:rsid w:val="00123A8E"/>
@@ -5037,10 +5454,10 @@
       <w:color w:val="595959" w:themeColor="text1" w:themeTint="A6"/>
     </w:rPr>
   </w:style>
-  <w:style w:type="character" w:customStyle="1" w:styleId="Heading7Char">
-    <w:name w:val="Heading 7 Char"/>
-    <w:basedOn w:val="DefaultParagraphFont"/>
-    <w:link w:val="Heading7"/>
+  <w:style w:type="character" w:customStyle="1" w:styleId="Ttulo7Car">
+    <w:name w:val="Título 7 Car"/>
+    <w:basedOn w:val="Fuentedeprrafopredeter"/>
+    <w:link w:val="Ttulo7"/>
     <w:uiPriority w:val="9"/>
     <w:semiHidden/>
     <w:rsid w:val="00123A8E"/>
@@ -5049,10 +5466,10 @@
       <w:color w:val="595959" w:themeColor="text1" w:themeTint="A6"/>
     </w:rPr>
   </w:style>
-  <w:style w:type="character" w:customStyle="1" w:styleId="Heading8Char">
-    <w:name w:val="Heading 8 Char"/>
-    <w:basedOn w:val="DefaultParagraphFont"/>
-    <w:link w:val="Heading8"/>
+  <w:style w:type="character" w:customStyle="1" w:styleId="Ttulo8Car">
+    <w:name w:val="Título 8 Car"/>
+    <w:basedOn w:val="Fuentedeprrafopredeter"/>
+    <w:link w:val="Ttulo8"/>
     <w:uiPriority w:val="9"/>
     <w:semiHidden/>
     <w:rsid w:val="00123A8E"/>
@@ -5063,10 +5480,10 @@
       <w:color w:val="272727" w:themeColor="text1" w:themeTint="D8"/>
     </w:rPr>
   </w:style>
-  <w:style w:type="character" w:customStyle="1" w:styleId="Heading9Char">
-    <w:name w:val="Heading 9 Char"/>
-    <w:basedOn w:val="DefaultParagraphFont"/>
-    <w:link w:val="Heading9"/>
+  <w:style w:type="character" w:customStyle="1" w:styleId="Ttulo9Car">
+    <w:name w:val="Título 9 Car"/>
+    <w:basedOn w:val="Fuentedeprrafopredeter"/>
+    <w:link w:val="Ttulo9"/>
     <w:uiPriority w:val="9"/>
     <w:semiHidden/>
     <w:rsid w:val="00123A8E"/>
@@ -5075,11 +5492,11 @@
       <w:color w:val="272727" w:themeColor="text1" w:themeTint="D8"/>
     </w:rPr>
   </w:style>
-  <w:style w:type="paragraph" w:styleId="Title">
+  <w:style w:type="paragraph" w:styleId="Ttulo">
     <w:name w:val="Title"/>
     <w:basedOn w:val="Normal"/>
     <w:next w:val="Normal"/>
-    <w:link w:val="TitleChar"/>
+    <w:link w:val="TtuloCar"/>
     <w:uiPriority w:val="10"/>
     <w:qFormat/>
     <w:rsid w:val="00123A8E"/>
@@ -5095,10 +5512,10 @@
       <w:szCs w:val="56"/>
     </w:rPr>
   </w:style>
-  <w:style w:type="character" w:customStyle="1" w:styleId="TitleChar">
-    <w:name w:val="Title Char"/>
-    <w:basedOn w:val="DefaultParagraphFont"/>
-    <w:link w:val="Title"/>
+  <w:style w:type="character" w:customStyle="1" w:styleId="TtuloCar">
+    <w:name w:val="Título Car"/>
+    <w:basedOn w:val="Fuentedeprrafopredeter"/>
+    <w:link w:val="Ttulo"/>
     <w:uiPriority w:val="10"/>
     <w:rsid w:val="00123A8E"/>
     <w:rPr>
@@ -5109,11 +5526,11 @@
       <w:szCs w:val="56"/>
     </w:rPr>
   </w:style>
-  <w:style w:type="paragraph" w:styleId="Subtitle">
+  <w:style w:type="paragraph" w:styleId="Subttulo">
     <w:name w:val="Subtitle"/>
     <w:basedOn w:val="Normal"/>
     <w:next w:val="Normal"/>
-    <w:link w:val="SubtitleChar"/>
+    <w:link w:val="SubttuloCar"/>
     <w:uiPriority w:val="11"/>
     <w:qFormat/>
     <w:rsid w:val="00123A8E"/>
@@ -5130,10 +5547,10 @@
       <w:szCs w:val="28"/>
     </w:rPr>
   </w:style>
-  <w:style w:type="character" w:customStyle="1" w:styleId="SubtitleChar">
-    <w:name w:val="Subtitle Char"/>
-    <w:basedOn w:val="DefaultParagraphFont"/>
-    <w:link w:val="Subtitle"/>
+  <w:style w:type="character" w:customStyle="1" w:styleId="SubttuloCar">
+    <w:name w:val="Subtítulo Car"/>
+    <w:basedOn w:val="Fuentedeprrafopredeter"/>
+    <w:link w:val="Subttulo"/>
     <w:uiPriority w:val="11"/>
     <w:rsid w:val="00123A8E"/>
     <w:rPr>
@@ -5144,11 +5561,11 @@
       <w:szCs w:val="28"/>
     </w:rPr>
   </w:style>
-  <w:style w:type="paragraph" w:styleId="Quote">
+  <w:style w:type="paragraph" w:styleId="Cita">
     <w:name w:val="Quote"/>
     <w:basedOn w:val="Normal"/>
     <w:next w:val="Normal"/>
-    <w:link w:val="QuoteChar"/>
+    <w:link w:val="CitaCar"/>
     <w:uiPriority w:val="29"/>
     <w:qFormat/>
     <w:rsid w:val="00123A8E"/>
@@ -5162,10 +5579,10 @@
       <w:color w:val="404040" w:themeColor="text1" w:themeTint="BF"/>
     </w:rPr>
   </w:style>
-  <w:style w:type="character" w:customStyle="1" w:styleId="QuoteChar">
-    <w:name w:val="Quote Char"/>
-    <w:basedOn w:val="DefaultParagraphFont"/>
-    <w:link w:val="Quote"/>
+  <w:style w:type="character" w:customStyle="1" w:styleId="CitaCar">
+    <w:name w:val="Cita Car"/>
+    <w:basedOn w:val="Fuentedeprrafopredeter"/>
+    <w:link w:val="Cita"/>
     <w:uiPriority w:val="29"/>
     <w:rsid w:val="00123A8E"/>
     <w:rPr>
@@ -5174,7 +5591,7 @@
       <w:color w:val="404040" w:themeColor="text1" w:themeTint="BF"/>
     </w:rPr>
   </w:style>
-  <w:style w:type="paragraph" w:styleId="ListParagraph">
+  <w:style w:type="paragraph" w:styleId="Prrafodelista">
     <w:name w:val="List Paragraph"/>
     <w:basedOn w:val="Normal"/>
     <w:uiPriority w:val="34"/>
@@ -5185,9 +5602,9 @@
       <w:contextualSpacing/>
     </w:pPr>
   </w:style>
-  <w:style w:type="character" w:styleId="IntenseEmphasis">
+  <w:style w:type="character" w:styleId="nfasisintenso">
     <w:name w:val="Intense Emphasis"/>
-    <w:basedOn w:val="DefaultParagraphFont"/>
+    <w:basedOn w:val="Fuentedeprrafopredeter"/>
     <w:uiPriority w:val="21"/>
     <w:qFormat/>
     <w:rsid w:val="00123A8E"/>
@@ -5197,11 +5614,11 @@
       <w:color w:val="0F4761" w:themeColor="accent1" w:themeShade="BF"/>
     </w:rPr>
   </w:style>
-  <w:style w:type="paragraph" w:styleId="IntenseQuote">
+  <w:style w:type="paragraph" w:styleId="Citadestacada">
     <w:name w:val="Intense Quote"/>
     <w:basedOn w:val="Normal"/>
     <w:next w:val="Normal"/>
-    <w:link w:val="IntenseQuoteChar"/>
+    <w:link w:val="CitadestacadaCar"/>
     <w:uiPriority w:val="30"/>
     <w:qFormat/>
     <w:rsid w:val="00123A8E"/>
@@ -5220,10 +5637,10 @@
       <w:color w:val="0F4761" w:themeColor="accent1" w:themeShade="BF"/>
     </w:rPr>
   </w:style>
-  <w:style w:type="character" w:customStyle="1" w:styleId="IntenseQuoteChar">
-    <w:name w:val="Intense Quote Char"/>
-    <w:basedOn w:val="DefaultParagraphFont"/>
-    <w:link w:val="IntenseQuote"/>
+  <w:style w:type="character" w:customStyle="1" w:styleId="CitadestacadaCar">
+    <w:name w:val="Cita destacada Car"/>
+    <w:basedOn w:val="Fuentedeprrafopredeter"/>
+    <w:link w:val="Citadestacada"/>
     <w:uiPriority w:val="30"/>
     <w:rsid w:val="00123A8E"/>
     <w:rPr>
@@ -5232,9 +5649,9 @@
       <w:color w:val="0F4761" w:themeColor="accent1" w:themeShade="BF"/>
     </w:rPr>
   </w:style>
-  <w:style w:type="character" w:styleId="IntenseReference">
+  <w:style w:type="character" w:styleId="Referenciaintensa">
     <w:name w:val="Intense Reference"/>
-    <w:basedOn w:val="DefaultParagraphFont"/>
+    <w:basedOn w:val="Fuentedeprrafopredeter"/>
     <w:uiPriority w:val="32"/>
     <w:qFormat/>
     <w:rsid w:val="00123A8E"/>
@@ -5246,9 +5663,9 @@
       <w:spacing w:val="5"/>
     </w:rPr>
   </w:style>
-  <w:style w:type="table" w:styleId="TableGrid">
+  <w:style w:type="table" w:styleId="Tablaconcuadrcula">
     <w:name w:val="Table Grid"/>
-    <w:basedOn w:val="TableNormal"/>
+    <w:basedOn w:val="Tablanormal"/>
     <w:uiPriority w:val="39"/>
     <w:rsid w:val="003F480B"/>
     <w:pPr>
@@ -5265,9 +5682,9 @@
       </w:tblBorders>
     </w:tblPr>
   </w:style>
-  <w:style w:type="paragraph" w:styleId="TOCHeading">
+  <w:style w:type="paragraph" w:styleId="TtuloTDC">
     <w:name w:val="TOC Heading"/>
-    <w:basedOn w:val="Heading1"/>
+    <w:basedOn w:val="Ttulo1"/>
     <w:next w:val="Normal"/>
     <w:uiPriority w:val="39"/>
     <w:unhideWhenUsed/>
@@ -5291,7 +5708,7 @@
       <w14:ligatures w14:val="none"/>
     </w:rPr>
   </w:style>
-  <w:style w:type="paragraph" w:styleId="TOC1">
+  <w:style w:type="paragraph" w:styleId="TDC1">
     <w:name w:val="toc 1"/>
     <w:basedOn w:val="Normal"/>
     <w:next w:val="Normal"/>
@@ -5303,9 +5720,9 @@
       <w:spacing w:after="100"/>
     </w:pPr>
   </w:style>
-  <w:style w:type="character" w:styleId="Hyperlink">
+  <w:style w:type="character" w:styleId="Hipervnculo">
     <w:name w:val="Hyperlink"/>
-    <w:basedOn w:val="DefaultParagraphFont"/>
+    <w:basedOn w:val="Fuentedeprrafopredeter"/>
     <w:uiPriority w:val="99"/>
     <w:unhideWhenUsed/>
     <w:rsid w:val="00E45456"/>
@@ -5314,7 +5731,7 @@
       <w:u w:val="single"/>
     </w:rPr>
   </w:style>
-  <w:style w:type="paragraph" w:styleId="TOC2">
+  <w:style w:type="paragraph" w:styleId="TDC2">
     <w:name w:val="toc 2"/>
     <w:basedOn w:val="Normal"/>
     <w:next w:val="Normal"/>
@@ -5327,10 +5744,10 @@
       <w:ind w:left="240"/>
     </w:pPr>
   </w:style>
-  <w:style w:type="paragraph" w:styleId="Header">
+  <w:style w:type="paragraph" w:styleId="Encabezado">
     <w:name w:val="header"/>
     <w:basedOn w:val="Normal"/>
-    <w:link w:val="HeaderChar"/>
+    <w:link w:val="EncabezadoCar"/>
     <w:uiPriority w:val="99"/>
     <w:unhideWhenUsed/>
     <w:rsid w:val="00925DD8"/>
@@ -5342,17 +5759,17 @@
       <w:spacing w:after="0" w:line="240" w:lineRule="auto"/>
     </w:pPr>
   </w:style>
-  <w:style w:type="character" w:customStyle="1" w:styleId="HeaderChar">
-    <w:name w:val="Header Char"/>
-    <w:basedOn w:val="DefaultParagraphFont"/>
-    <w:link w:val="Header"/>
+  <w:style w:type="character" w:customStyle="1" w:styleId="EncabezadoCar">
+    <w:name w:val="Encabezado Car"/>
+    <w:basedOn w:val="Fuentedeprrafopredeter"/>
+    <w:link w:val="Encabezado"/>
     <w:uiPriority w:val="99"/>
     <w:rsid w:val="00925DD8"/>
   </w:style>
-  <w:style w:type="paragraph" w:styleId="Footer">
+  <w:style w:type="paragraph" w:styleId="Piedepgina">
     <w:name w:val="footer"/>
     <w:basedOn w:val="Normal"/>
-    <w:link w:val="FooterChar"/>
+    <w:link w:val="PiedepginaCar"/>
     <w:uiPriority w:val="99"/>
     <w:unhideWhenUsed/>
     <w:rsid w:val="00925DD8"/>
@@ -5364,14 +5781,14 @@
       <w:spacing w:after="0" w:line="240" w:lineRule="auto"/>
     </w:pPr>
   </w:style>
-  <w:style w:type="character" w:customStyle="1" w:styleId="FooterChar">
-    <w:name w:val="Footer Char"/>
-    <w:basedOn w:val="DefaultParagraphFont"/>
-    <w:link w:val="Footer"/>
+  <w:style w:type="character" w:customStyle="1" w:styleId="PiedepginaCar">
+    <w:name w:val="Pie de página Car"/>
+    <w:basedOn w:val="Fuentedeprrafopredeter"/>
+    <w:link w:val="Piedepgina"/>
     <w:uiPriority w:val="99"/>
     <w:rsid w:val="00925DD8"/>
   </w:style>
-  <w:style w:type="paragraph" w:styleId="TOC3">
+  <w:style w:type="paragraph" w:styleId="TDC3">
     <w:name w:val="toc 3"/>
     <w:basedOn w:val="Normal"/>
     <w:next w:val="Normal"/>
@@ -5384,9 +5801,9 @@
       <w:ind w:left="480"/>
     </w:pPr>
   </w:style>
-  <w:style w:type="table" w:styleId="ListTable3-Accent1">
+  <w:style w:type="table" w:styleId="Tabladelista3-nfasis1">
     <w:name w:val="List Table 3 Accent 1"/>
-    <w:basedOn w:val="TableNormal"/>
+    <w:basedOn w:val="Tablanormal"/>
     <w:uiPriority w:val="48"/>
     <w:rsid w:val="0027198A"/>
     <w:pPr>
@@ -5512,7 +5929,6 @@
     <w:name w:val="Normal (Web)"/>
     <w:basedOn w:val="Normal"/>
     <w:uiPriority w:val="99"/>
-    <w:semiHidden/>
     <w:unhideWhenUsed/>
     <w:rsid w:val="001B6276"/>
     <w:pPr>
@@ -5523,6 +5939,18 @@
       <w:kern w:val="0"/>
       <w:lang w:val="es-PE" w:eastAsia="es-PE"/>
       <w14:ligatures w14:val="none"/>
+    </w:rPr>
+  </w:style>
+  <w:style w:type="character" w:styleId="Mencinsinresolver">
+    <w:name w:val="Unresolved Mention"/>
+    <w:basedOn w:val="Fuentedeprrafopredeter"/>
+    <w:uiPriority w:val="99"/>
+    <w:semiHidden/>
+    <w:unhideWhenUsed/>
+    <w:rsid w:val="006B4159"/>
+    <w:rPr>
+      <w:color w:val="605E5C"/>
+      <w:shd w:val="clear" w:color="auto" w:fill="E1DFDD"/>
     </w:rPr>
   </w:style>
 </w:styles>

</xml_diff>

<commit_message>
docs(informe): agregar prototipo de solicitud de afiliación + integracion de su parte de Franco
Falta: antecendente de Franco
</commit_message>
<xml_diff>
--- a/docs/informe/Informe_Primer_Avance_SalvemosLaComida.docx
+++ b/docs/informe/Informe_Primer_Avance_SalvemosLaComida.docx
@@ -2548,13 +2548,6 @@
     </w:p>
     <w:p>
       <w:pPr>
-        <w:rPr>
-          <w:lang w:val="es-PE"/>
-        </w:rPr>
-      </w:pPr>
-    </w:p>
-    <w:p>
-      <w:pPr>
         <w:pStyle w:val="Ttulo2"/>
         <w:rPr>
           <w:rFonts w:cs="Times New Roman"/>
@@ -2601,13 +2594,6 @@
       <w:r>
         <w:t>Diseñar y desarrollar una plataforma web mobile-first que conecte a establecimientos de alimentos con excedentes aptos para el consumo y a consumidores interesados en adquirirlos mediante packs sorpresa a precios reducidos, facilitando su publicación, compra y recojo presencial para contribuir a la disminución del desperdicio alimentario.</w:t>
       </w:r>
-    </w:p>
-    <w:p>
-      <w:pPr>
-        <w:rPr>
-          <w:lang w:val="es-PE"/>
-        </w:rPr>
-      </w:pPr>
     </w:p>
     <w:p>
       <w:pPr>
@@ -2715,29 +2701,22 @@
         <w:jc w:val="both"/>
       </w:pPr>
       <w:r>
+        <w:t>Incorporar reseñas e indicadores que permitan consultar los resultados comerciales y representar el impacto generado por la recuperación de alimentos.</w:t>
+      </w:r>
+    </w:p>
+    <w:p>
+      <w:pPr>
+        <w:pStyle w:val="Ttulo2"/>
+        <w:rPr>
+          <w:rFonts w:cs="Times New Roman"/>
+        </w:rPr>
+      </w:pPr>
+      <w:bookmarkStart w:id="5" w:name="_Toc239694141"/>
+      <w:r>
+        <w:rPr>
+          <w:rFonts w:cs="Times New Roman"/>
+        </w:rPr>
         <w:lastRenderedPageBreak/>
-        <w:t>Incorporar reseñas e indicadores que permitan consultar los resultados comerciales y representar el impacto generado por la recuperación de alimentos.</w:t>
-      </w:r>
-    </w:p>
-    <w:p>
-      <w:pPr>
-        <w:rPr>
-          <w:lang w:val="es-PE"/>
-        </w:rPr>
-      </w:pPr>
-    </w:p>
-    <w:p>
-      <w:pPr>
-        <w:pStyle w:val="Ttulo2"/>
-        <w:rPr>
-          <w:rFonts w:cs="Times New Roman"/>
-        </w:rPr>
-      </w:pPr>
-      <w:bookmarkStart w:id="5" w:name="_Toc239694141"/>
-      <w:r>
-        <w:rPr>
-          <w:rFonts w:cs="Times New Roman"/>
-        </w:rPr>
         <w:t>Alcance</w:t>
       </w:r>
       <w:bookmarkEnd w:id="5"/>
@@ -2802,13 +2781,6 @@
       <w:r>
         <w:t xml:space="preserve"> basado en HTML, CSS, JavaScript y Tailwind CSS, y una base de datos MySQL gestionada mediante Spring Data JPA.</w:t>
       </w:r>
-    </w:p>
-    <w:p>
-      <w:pPr>
-        <w:rPr>
-          <w:lang w:val="es-PE"/>
-        </w:rPr>
-      </w:pPr>
     </w:p>
     <w:p>
       <w:pPr>
@@ -2873,21 +2845,7 @@
         <w:rPr>
           <w:lang w:val="es-PE"/>
         </w:rPr>
-        <w:t xml:space="preserve">La plataforma no ofrecerá servicio de </w:t>
-      </w:r>
-      <w:proofErr w:type="spellStart"/>
-      <w:r>
-        <w:rPr>
-          <w:lang w:val="es-PE"/>
-        </w:rPr>
-        <w:t>delivery</w:t>
-      </w:r>
-      <w:proofErr w:type="spellEnd"/>
-      <w:r>
-        <w:rPr>
-          <w:lang w:val="es-PE"/>
-        </w:rPr>
-        <w:t>. El consumidor deberá acudir personalmente al establecimiento para recoger su compra.</w:t>
+        <w:t>La plataforma no ofrecerá servicio de delivery. El consumidor deberá acudir personalmente al establecimiento para recoger su compra.</w:t>
       </w:r>
     </w:p>
     <w:p>
@@ -2923,7 +2881,6 @@
         <w:rPr>
           <w:lang w:val="es-PE"/>
         </w:rPr>
-        <w:lastRenderedPageBreak/>
         <w:t>La revisión de los documentos presentados por cada establecimiento será realizada manualmente por un administrador. No se utilizará reconocimiento óptico de caracteres ni validación automática mediante OCR.</w:t>
       </w:r>
     </w:p>
@@ -2960,6 +2917,7 @@
         <w:rPr>
           <w:lang w:val="es-PE"/>
         </w:rPr>
+        <w:lastRenderedPageBreak/>
         <w:t>Cada establecimiento utilizará una cuenta operativa compartida. Por ello, la primera versión no permitirá identificar individualmente al trabajador que realizó cada operación.</w:t>
       </w:r>
     </w:p>
@@ -3060,6 +3018,34 @@
         </w:rPr>
         <w:t>permiten concentrar el desarrollo en las funciones principales del marketplace y mantener un alcance viable para el periodo académico establecido.</w:t>
       </w:r>
+    </w:p>
+    <w:p>
+      <w:pPr>
+        <w:rPr>
+          <w:lang w:val="es-PE"/>
+        </w:rPr>
+      </w:pPr>
+    </w:p>
+    <w:p>
+      <w:pPr>
+        <w:rPr>
+          <w:lang w:val="es-PE"/>
+        </w:rPr>
+      </w:pPr>
+    </w:p>
+    <w:p>
+      <w:pPr>
+        <w:rPr>
+          <w:lang w:val="es-PE"/>
+        </w:rPr>
+      </w:pPr>
+    </w:p>
+    <w:p>
+      <w:pPr>
+        <w:rPr>
+          <w:lang w:val="es-PE"/>
+        </w:rPr>
+      </w:pPr>
     </w:p>
     <w:p>
       <w:pPr>
@@ -3241,24 +3227,13 @@
         <w:jc w:val="both"/>
       </w:pPr>
       <w:r>
-        <w:t xml:space="preserve">Esta solución constituye el antecedente más cercano a </w:t>
-      </w:r>
-      <w:r>
-        <w:t>MealFlow</w:t>
-      </w:r>
-      <w:r>
-        <w:t xml:space="preserve">, debido a que ambos proyectos proponen comercializar excedentes alimentarios mediante packs sorpresa con descuento y recojo presencial. Sin embargo, </w:t>
-      </w:r>
-      <w:r>
-        <w:t>MealFlow</w:t>
-      </w:r>
-      <w:r>
-        <w:t xml:space="preserve"> plantea una implementación adaptada a su primera versión académica y al contexto peruano, incorporando el registro de empresas con múltiples establecimientos, la revisión manual de documentos por cada local, pagos simulados mediante tarjeta de débito y Yape, pago presencial en efectivo mediante código QR y la confirmación del recojo mediante un código incluido en una boleta simulada.</w:t>
-      </w:r>
-    </w:p>
-    <w:p>
-      <w:pPr>
-        <w:pStyle w:val="Prrafodelista"/>
+        <w:t>Esta solución constituye el antecedente más cercano a MealFlow, debido a que ambos proyectos proponen comercializar excedentes alimentarios mediante packs sorpresa con descuento y recojo presencial. Sin embargo, MealFlow plantea una implementación adaptada a su primera versión académica y al contexto peruano, incorporando el registro de empresas con múltiples establecimientos, la revisión manual de documentos por cada local, pagos simulados mediante tarjeta de débito y Yape, pago presencial en efectivo mediante código QR y la confirmación del recojo mediante un código incluido en una boleta simulada.</w:t>
+      </w:r>
+    </w:p>
+    <w:p>
+      <w:pPr>
+        <w:pStyle w:val="NormalWeb"/>
+        <w:jc w:val="both"/>
       </w:pPr>
     </w:p>
     <w:p>
@@ -3408,22 +3383,74 @@
         <w:rPr>
           <w:rFonts w:cs="Times New Roman"/>
         </w:rPr>
+        <w:t>Diagrama de clases</w:t>
+      </w:r>
+      <w:bookmarkEnd w:id="19"/>
+    </w:p>
+    <w:p/>
+    <w:p>
+      <w:pPr>
+        <w:pStyle w:val="Ttulo2"/>
+        <w:rPr>
+          <w:rFonts w:cs="Times New Roman"/>
+        </w:rPr>
+      </w:pPr>
+      <w:bookmarkStart w:id="20" w:name="_Toc239694153"/>
+      <w:r>
+        <w:rPr>
+          <w:rFonts w:cs="Times New Roman"/>
+        </w:rPr>
         <w:lastRenderedPageBreak/>
-        <w:t>Diagrama de clases</w:t>
-      </w:r>
-      <w:bookmarkEnd w:id="19"/>
-    </w:p>
-    <w:p>
+        <w:t>Diagrama ER de base de datos</w:t>
+      </w:r>
+      <w:bookmarkEnd w:id="20"/>
+    </w:p>
+    <w:p>
+      <w:pPr>
+        <w:pStyle w:val="Prrafodelista"/>
+        <w:numPr>
+          <w:ilvl w:val="0"/>
+          <w:numId w:val="6"/>
+        </w:numPr>
+        <w:ind w:hanging="720"/>
+        <w:jc w:val="both"/>
+        <w:rPr>
+          <w:b/>
+          <w:bCs/>
+        </w:rPr>
+      </w:pPr>
+      <w:r>
+        <w:rPr>
+          <w:b/>
+          <w:bCs/>
+        </w:rPr>
+        <w:t>Criterio de persistencia</w:t>
+      </w:r>
+    </w:p>
+    <w:p>
+      <w:pPr>
+        <w:jc w:val="both"/>
+      </w:pPr>
+      <w:r>
+        <w:t>El módulo de ofertas se estructura en cinco entidades principales y dos tablas intermedias para resolver las relaciones muchos a muchos. Establecimiento se considera únicamente como una entidad externa relacionada, ya que pertenece a otro módulo del sistema.</w:t>
+      </w:r>
+    </w:p>
+    <w:p>
+      <w:pPr>
+        <w:jc w:val="both"/>
+      </w:pPr>
+      <w:r>
+        <w:t xml:space="preserve"> </w:t>
+      </w:r>
       <w:r>
         <w:rPr>
           <w:noProof/>
-          <w:lang w:val="es-PE" w:eastAsia="es-PE"/>
         </w:rPr>
         <w:drawing>
-          <wp:inline distT="0" distB="0" distL="0" distR="0" wp14:anchorId="00E98EBF" wp14:editId="1B15D3BC">
-            <wp:extent cx="4791075" cy="4000500"/>
-            <wp:effectExtent l="0" t="0" r="9525" b="0"/>
-            <wp:docPr id="1849890437" name="Imagen 1"/>
+          <wp:inline distT="0" distB="0" distL="0" distR="0" wp14:anchorId="691F3B6B" wp14:editId="6E37778C">
+            <wp:extent cx="4853262" cy="2426630"/>
+            <wp:effectExtent l="0" t="0" r="0" b="0"/>
+            <wp:docPr id="204475204" name="drawing"/>
             <wp:cNvGraphicFramePr>
               <a:graphicFrameLocks xmlns:a="http://schemas.openxmlformats.org/drawingml/2006/main" noChangeAspect="1"/>
             </wp:cNvGraphicFramePr>
@@ -3431,11 +3458,528 @@
               <a:graphicData uri="http://schemas.openxmlformats.org/drawingml/2006/picture">
                 <pic:pic xmlns:pic="http://schemas.openxmlformats.org/drawingml/2006/picture">
                   <pic:nvPicPr>
-                    <pic:cNvPr id="1849890437" name="Imagen 1849890437"/>
+                    <pic:cNvPr id="204475204" name="Picture 204475204"/>
                     <pic:cNvPicPr/>
                   </pic:nvPicPr>
                   <pic:blipFill>
                     <a:blip r:embed="rId9">
+                      <a:extLst>
+                        <a:ext uri="{28A0092B-C50C-407E-A947-70E740481C1C}">
+                          <a14:useLocalDpi xmlns:a14="http://schemas.microsoft.com/office/drawing/2010/main"/>
+                        </a:ext>
+                      </a:extLst>
+                    </a:blip>
+                    <a:stretch>
+                      <a:fillRect/>
+                    </a:stretch>
+                  </pic:blipFill>
+                  <pic:spPr>
+                    <a:xfrm>
+                      <a:off x="0" y="0"/>
+                      <a:ext cx="4853262" cy="2426630"/>
+                    </a:xfrm>
+                    <a:prstGeom prst="rect">
+                      <a:avLst/>
+                    </a:prstGeom>
+                  </pic:spPr>
+                </pic:pic>
+              </a:graphicData>
+            </a:graphic>
+          </wp:inline>
+        </w:drawing>
+      </w:r>
+    </w:p>
+    <w:p>
+      <w:pPr>
+        <w:pStyle w:val="Prrafodelista"/>
+        <w:numPr>
+          <w:ilvl w:val="0"/>
+          <w:numId w:val="6"/>
+        </w:numPr>
+        <w:ind w:hanging="720"/>
+        <w:jc w:val="both"/>
+        <w:rPr>
+          <w:b/>
+          <w:bCs/>
+        </w:rPr>
+      </w:pPr>
+      <w:r>
+        <w:rPr>
+          <w:b/>
+          <w:bCs/>
+        </w:rPr>
+        <w:t>Claves primarias y foráneas propuestas</w:t>
+      </w:r>
+    </w:p>
+    <w:p>
+      <w:pPr>
+        <w:jc w:val="both"/>
+      </w:pPr>
+      <w:r>
+        <w:t>En la siguiente tabla se presentan las claves primarias y foráneas definidas para las entidades del módulo de ofertas. Estas claves permiten identificar cada registro de forma única y establecer las relaciones entre las tablas de acuerdo con el modelo entidad-relación propuesto.</w:t>
+      </w:r>
+    </w:p>
+    <w:p>
+      <w:pPr>
+        <w:jc w:val="both"/>
+      </w:pPr>
+      <w:r>
+        <w:t xml:space="preserve"> </w:t>
+      </w:r>
+      <w:r>
+        <w:rPr>
+          <w:noProof/>
+        </w:rPr>
+        <w:drawing>
+          <wp:inline distT="0" distB="0" distL="0" distR="0" wp14:anchorId="32235EEA" wp14:editId="10760D5B">
+            <wp:extent cx="5400040" cy="2509634"/>
+            <wp:effectExtent l="0" t="0" r="0" b="5080"/>
+            <wp:docPr id="1254641933" name="drawing"/>
+            <wp:cNvGraphicFramePr>
+              <a:graphicFrameLocks xmlns:a="http://schemas.openxmlformats.org/drawingml/2006/main" noChangeAspect="1"/>
+            </wp:cNvGraphicFramePr>
+            <a:graphic xmlns:a="http://schemas.openxmlformats.org/drawingml/2006/main">
+              <a:graphicData uri="http://schemas.openxmlformats.org/drawingml/2006/picture">
+                <pic:pic xmlns:pic="http://schemas.openxmlformats.org/drawingml/2006/picture">
+                  <pic:nvPicPr>
+                    <pic:cNvPr id="1254641933" name="Picture 1254641933"/>
+                    <pic:cNvPicPr/>
+                  </pic:nvPicPr>
+                  <pic:blipFill>
+                    <a:blip r:embed="rId10">
+                      <a:extLst>
+                        <a:ext uri="{28A0092B-C50C-407E-A947-70E740481C1C}">
+                          <a14:useLocalDpi xmlns:a14="http://schemas.microsoft.com/office/drawing/2010/main"/>
+                        </a:ext>
+                      </a:extLst>
+                    </a:blip>
+                    <a:stretch>
+                      <a:fillRect/>
+                    </a:stretch>
+                  </pic:blipFill>
+                  <pic:spPr>
+                    <a:xfrm>
+                      <a:off x="0" y="0"/>
+                      <a:ext cx="5400040" cy="2509634"/>
+                    </a:xfrm>
+                    <a:prstGeom prst="rect">
+                      <a:avLst/>
+                    </a:prstGeom>
+                  </pic:spPr>
+                </pic:pic>
+              </a:graphicData>
+            </a:graphic>
+          </wp:inline>
+        </w:drawing>
+      </w:r>
+    </w:p>
+    <w:p>
+      <w:pPr>
+        <w:pStyle w:val="Prrafodelista"/>
+        <w:numPr>
+          <w:ilvl w:val="0"/>
+          <w:numId w:val="6"/>
+        </w:numPr>
+        <w:ind w:hanging="720"/>
+        <w:jc w:val="both"/>
+        <w:rPr>
+          <w:b/>
+          <w:bCs/>
+        </w:rPr>
+      </w:pPr>
+      <w:r>
+        <w:rPr>
+          <w:b/>
+          <w:bCs/>
+        </w:rPr>
+        <w:t>Cardinalidades</w:t>
+      </w:r>
+    </w:p>
+    <w:p>
+      <w:pPr>
+        <w:jc w:val="both"/>
+      </w:pPr>
+      <w:r>
+        <w:t>En esta ocasión se presentan las cardinalidades entre las entidades del módulo de ofertas, indicando cuántos registros de una entidad pueden relacionarse con otra dentro del modelo entidad-relación.</w:t>
+      </w:r>
+    </w:p>
+    <w:p>
+      <w:pPr>
+        <w:jc w:val="both"/>
+      </w:pPr>
+      <w:r>
+        <w:rPr>
+          <w:noProof/>
+        </w:rPr>
+        <w:lastRenderedPageBreak/>
+        <w:drawing>
+          <wp:inline distT="0" distB="0" distL="0" distR="0" wp14:anchorId="0B0D9B8D" wp14:editId="428444EC">
+            <wp:extent cx="5400040" cy="2379825"/>
+            <wp:effectExtent l="0" t="0" r="0" b="1905"/>
+            <wp:docPr id="372155108" name="drawing"/>
+            <wp:cNvGraphicFramePr>
+              <a:graphicFrameLocks xmlns:a="http://schemas.openxmlformats.org/drawingml/2006/main" noChangeAspect="1"/>
+            </wp:cNvGraphicFramePr>
+            <a:graphic xmlns:a="http://schemas.openxmlformats.org/drawingml/2006/main">
+              <a:graphicData uri="http://schemas.openxmlformats.org/drawingml/2006/picture">
+                <pic:pic xmlns:pic="http://schemas.openxmlformats.org/drawingml/2006/picture">
+                  <pic:nvPicPr>
+                    <pic:cNvPr id="372155108" name="Picture 372155108"/>
+                    <pic:cNvPicPr/>
+                  </pic:nvPicPr>
+                  <pic:blipFill>
+                    <a:blip r:embed="rId11">
+                      <a:extLst>
+                        <a:ext uri="{28A0092B-C50C-407E-A947-70E740481C1C}">
+                          <a14:useLocalDpi xmlns:a14="http://schemas.microsoft.com/office/drawing/2010/main"/>
+                        </a:ext>
+                      </a:extLst>
+                    </a:blip>
+                    <a:stretch>
+                      <a:fillRect/>
+                    </a:stretch>
+                  </pic:blipFill>
+                  <pic:spPr>
+                    <a:xfrm>
+                      <a:off x="0" y="0"/>
+                      <a:ext cx="5400040" cy="2379825"/>
+                    </a:xfrm>
+                    <a:prstGeom prst="rect">
+                      <a:avLst/>
+                    </a:prstGeom>
+                  </pic:spPr>
+                </pic:pic>
+              </a:graphicData>
+            </a:graphic>
+          </wp:inline>
+        </w:drawing>
+      </w:r>
+    </w:p>
+    <w:p>
+      <w:pPr>
+        <w:jc w:val="both"/>
+      </w:pPr>
+      <w:r>
+        <w:t xml:space="preserve">El modelo establece relaciones 1: N entre Establecimiento y </w:t>
+      </w:r>
+      <w:proofErr w:type="spellStart"/>
+      <w:r>
+        <w:t>PackSorpresa</w:t>
+      </w:r>
+      <w:proofErr w:type="spellEnd"/>
+      <w:r>
+        <w:t xml:space="preserve">, entre </w:t>
+      </w:r>
+      <w:proofErr w:type="spellStart"/>
+      <w:r>
+        <w:t>PackSorpresa</w:t>
+      </w:r>
+      <w:proofErr w:type="spellEnd"/>
+      <w:r>
+        <w:t xml:space="preserve"> y </w:t>
+      </w:r>
+      <w:proofErr w:type="spellStart"/>
+      <w:r>
+        <w:t>OfertaPack</w:t>
+      </w:r>
+      <w:proofErr w:type="spellEnd"/>
+      <w:r>
+        <w:t xml:space="preserve">, y entre </w:t>
+      </w:r>
+      <w:proofErr w:type="spellStart"/>
+      <w:r>
+        <w:t>OfertaPack</w:t>
+      </w:r>
+      <w:proofErr w:type="spellEnd"/>
+      <w:r>
+        <w:t xml:space="preserve"> y </w:t>
+      </w:r>
+      <w:proofErr w:type="spellStart"/>
+      <w:r>
+        <w:t>VariantePack</w:t>
+      </w:r>
+      <w:proofErr w:type="spellEnd"/>
+      <w:r>
+        <w:t xml:space="preserve">. Por otro lado, </w:t>
+      </w:r>
+      <w:proofErr w:type="spellStart"/>
+      <w:r>
+        <w:t>PackSorpresa</w:t>
+      </w:r>
+      <w:proofErr w:type="spellEnd"/>
+      <w:r>
+        <w:t xml:space="preserve"> mantiene relaciones N:M con Alergeno y </w:t>
+      </w:r>
+      <w:proofErr w:type="spellStart"/>
+      <w:r>
+        <w:t>RestriccionAlimentaria</w:t>
+      </w:r>
+      <w:proofErr w:type="spellEnd"/>
+      <w:r>
+        <w:t xml:space="preserve">, resueltas mediante las tablas intermedias </w:t>
+      </w:r>
+      <w:proofErr w:type="spellStart"/>
+      <w:r>
+        <w:t>pack_alergeno</w:t>
+      </w:r>
+      <w:proofErr w:type="spellEnd"/>
+      <w:r>
+        <w:t xml:space="preserve"> y </w:t>
+      </w:r>
+      <w:proofErr w:type="spellStart"/>
+      <w:r>
+        <w:t>pack_restriccion</w:t>
+      </w:r>
+      <w:proofErr w:type="spellEnd"/>
+      <w:r>
+        <w:t>. Además, la condición de mantener como máximo una oferta activa debe considerarse una regla de negocio, no una cardinalidad del modelo, y su implementación deberá definirse posteriormente en JPA o MySQL</w:t>
+      </w:r>
+    </w:p>
+    <w:p>
+      <w:pPr>
+        <w:pStyle w:val="Prrafodelista"/>
+        <w:numPr>
+          <w:ilvl w:val="0"/>
+          <w:numId w:val="6"/>
+        </w:numPr>
+        <w:ind w:hanging="720"/>
+        <w:jc w:val="both"/>
+        <w:rPr>
+          <w:b/>
+          <w:bCs/>
+        </w:rPr>
+      </w:pPr>
+      <w:r>
+        <w:rPr>
+          <w:b/>
+          <w:bCs/>
+        </w:rPr>
+        <w:t>Diagrama entidad-relación</w:t>
+      </w:r>
+    </w:p>
+    <w:p>
+      <w:pPr>
+        <w:jc w:val="both"/>
+        <w:rPr>
+          <w:b/>
+          <w:bCs/>
+        </w:rPr>
+      </w:pPr>
+      <w:r>
+        <w:rPr>
+          <w:noProof/>
+        </w:rPr>
+        <w:drawing>
+          <wp:inline distT="0" distB="0" distL="0" distR="0" wp14:anchorId="0342E3A9" wp14:editId="4F3B1694">
+            <wp:extent cx="5400040" cy="2102438"/>
+            <wp:effectExtent l="76200" t="76200" r="124460" b="127000"/>
+            <wp:docPr id="990660499" name="drawing"/>
+            <wp:cNvGraphicFramePr>
+              <a:graphicFrameLocks xmlns:a="http://schemas.openxmlformats.org/drawingml/2006/main" noChangeAspect="1"/>
+            </wp:cNvGraphicFramePr>
+            <a:graphic xmlns:a="http://schemas.openxmlformats.org/drawingml/2006/main">
+              <a:graphicData uri="http://schemas.openxmlformats.org/drawingml/2006/picture">
+                <pic:pic xmlns:pic="http://schemas.openxmlformats.org/drawingml/2006/picture">
+                  <pic:nvPicPr>
+                    <pic:cNvPr id="990660499" name="Picture 990660499"/>
+                    <pic:cNvPicPr/>
+                  </pic:nvPicPr>
+                  <pic:blipFill>
+                    <a:blip r:embed="rId12">
+                      <a:extLst>
+                        <a:ext uri="{28A0092B-C50C-407E-A947-70E740481C1C}">
+                          <a14:useLocalDpi xmlns:a14="http://schemas.microsoft.com/office/drawing/2010/main"/>
+                        </a:ext>
+                      </a:extLst>
+                    </a:blip>
+                    <a:srcRect/>
+                    <a:stretch>
+                      <a:fillRect/>
+                    </a:stretch>
+                  </pic:blipFill>
+                  <pic:spPr>
+                    <a:xfrm>
+                      <a:off x="0" y="0"/>
+                      <a:ext cx="5400040" cy="2102438"/>
+                    </a:xfrm>
+                    <a:prstGeom prst="rect">
+                      <a:avLst/>
+                    </a:prstGeom>
+                    <a:ln w="38100" cap="sq">
+                      <a:solidFill>
+                        <a:srgbClr val="000000"/>
+                      </a:solidFill>
+                      <a:prstDash val="solid"/>
+                      <a:miter lim="800000"/>
+                    </a:ln>
+                    <a:effectLst>
+                      <a:outerShdw blurRad="50800" dist="38100" dir="2700000" algn="tl" rotWithShape="0">
+                        <a:srgbClr val="000000">
+                          <a:alpha val="43000"/>
+                        </a:srgbClr>
+                      </a:outerShdw>
+                    </a:effectLst>
+                  </pic:spPr>
+                </pic:pic>
+              </a:graphicData>
+            </a:graphic>
+          </wp:inline>
+        </w:drawing>
+      </w:r>
+    </w:p>
+    <w:p>
+      <w:pPr>
+        <w:jc w:val="both"/>
+      </w:pPr>
+      <w:r>
+        <w:t>El siguiente diagrama entidad-relación representa la estructura de persistencia propuesta para el módulo de ofertas. Se muestran las entidades principales, sus claves primarias y foráneas, así como las relaciones y cardinalidades definidas entre ellas.</w:t>
+      </w:r>
+    </w:p>
+    <w:p>
+      <w:pPr>
+        <w:jc w:val="both"/>
+      </w:pPr>
+      <w:r>
+        <w:t xml:space="preserve"> El modelo muestra que un establecimiento puede tener varios </w:t>
+      </w:r>
+      <w:proofErr w:type="spellStart"/>
+      <w:r>
+        <w:t>PackSorpresa</w:t>
+      </w:r>
+      <w:proofErr w:type="spellEnd"/>
+      <w:r>
+        <w:t xml:space="preserve">, y cada pack puede generar distintas </w:t>
+      </w:r>
+      <w:proofErr w:type="spellStart"/>
+      <w:r>
+        <w:t>OfertaPack</w:t>
+      </w:r>
+      <w:proofErr w:type="spellEnd"/>
+      <w:r>
+        <w:t xml:space="preserve">. A su vez, cada oferta puede contener una o más </w:t>
+      </w:r>
+      <w:proofErr w:type="spellStart"/>
+      <w:r>
+        <w:t>VariantePack</w:t>
+      </w:r>
+      <w:proofErr w:type="spellEnd"/>
+      <w:r>
+        <w:t xml:space="preserve">. Las relaciones de muchos a muchos entre </w:t>
+      </w:r>
+      <w:proofErr w:type="spellStart"/>
+      <w:r>
+        <w:t>PackSorpresa</w:t>
+      </w:r>
+      <w:proofErr w:type="spellEnd"/>
+      <w:r>
+        <w:t xml:space="preserve"> y Alergeno, y entre </w:t>
+      </w:r>
+      <w:proofErr w:type="spellStart"/>
+      <w:r>
+        <w:t>PackSorpresa</w:t>
+      </w:r>
+      <w:proofErr w:type="spellEnd"/>
+      <w:r>
+        <w:t xml:space="preserve"> y </w:t>
+      </w:r>
+      <w:proofErr w:type="spellStart"/>
+      <w:r>
+        <w:t>RestriccionAlimentaria</w:t>
+      </w:r>
+      <w:proofErr w:type="spellEnd"/>
+      <w:r>
+        <w:t xml:space="preserve">, se resuelven mediante las tablas intermedias </w:t>
+      </w:r>
+      <w:proofErr w:type="spellStart"/>
+      <w:r>
+        <w:t>pack_alergeno</w:t>
+      </w:r>
+      <w:proofErr w:type="spellEnd"/>
+      <w:r>
+        <w:t xml:space="preserve"> y </w:t>
+      </w:r>
+      <w:proofErr w:type="spellStart"/>
+      <w:r>
+        <w:t>pack_restriccion</w:t>
+      </w:r>
+      <w:proofErr w:type="spellEnd"/>
+      <w:r>
+        <w:t>. De esta manera, el modelo mantiene separadas las entidades principales y evita duplicar información en la base de datos.</w:t>
+      </w:r>
+    </w:p>
+    <w:p>
+      <w:pPr>
+        <w:pStyle w:val="Ttulo2"/>
+        <w:rPr>
+          <w:rFonts w:cs="Times New Roman"/>
+        </w:rPr>
+      </w:pPr>
+      <w:bookmarkStart w:id="21" w:name="_Toc239694154"/>
+      <w:r>
+        <w:rPr>
+          <w:rFonts w:cs="Times New Roman"/>
+        </w:rPr>
+        <w:lastRenderedPageBreak/>
+        <w:t>Presentación del prototipo</w:t>
+      </w:r>
+      <w:bookmarkEnd w:id="21"/>
+      <w:r>
+        <w:rPr>
+          <w:rFonts w:cs="Times New Roman"/>
+        </w:rPr>
+        <w:t xml:space="preserve"> </w:t>
+      </w:r>
+    </w:p>
+    <w:p>
+      <w:pPr>
+        <w:jc w:val="both"/>
+        <w:rPr>
+          <w:lang w:val="es-PE"/>
+        </w:rPr>
+      </w:pPr>
+      <w:r>
+        <w:rPr>
+          <w:lang w:val="es-PE"/>
+        </w:rPr>
+        <w:t>A continuación, se presenta el prototipo del formulario de solicitud de afiliación de MealFlow en sus versiones web y móvil. Este flujo permite que el propietario registre los datos de su empresa y establecimiento, adjunte la documentación requerida y revise la información antes de enviar la solicitud. Asimismo, se informa que los documentos serán evaluados manualmente por un administrador y que el establecimiento no podrá publicar packs sorpresa hasta obtener la aprobación correspondiente.</w:t>
+      </w:r>
+    </w:p>
+    <w:p>
+      <w:pPr>
+        <w:jc w:val="both"/>
+        <w:rPr>
+          <w:lang w:val="es-PE"/>
+        </w:rPr>
+      </w:pPr>
+      <w:r>
+        <w:rPr>
+          <w:lang w:val="en-US"/>
+        </w:rPr>
+        <w:drawing>
+          <wp:anchor distT="0" distB="0" distL="114300" distR="114300" simplePos="0" relativeHeight="251658240" behindDoc="0" locked="0" layoutInCell="1" allowOverlap="1" wp14:anchorId="533F5DA9" wp14:editId="114F3E03">
+            <wp:simplePos x="0" y="0"/>
+            <wp:positionH relativeFrom="margin">
+              <wp:align>center</wp:align>
+            </wp:positionH>
+            <wp:positionV relativeFrom="paragraph">
+              <wp:posOffset>3281643</wp:posOffset>
+            </wp:positionV>
+            <wp:extent cx="3860800" cy="3088640"/>
+            <wp:effectExtent l="76200" t="76200" r="139700" b="130810"/>
+            <wp:wrapSquare wrapText="bothSides"/>
+            <wp:docPr id="1393973104" name="Imagen 1"/>
+            <wp:cNvGraphicFramePr>
+              <a:graphicFrameLocks xmlns:a="http://schemas.openxmlformats.org/drawingml/2006/main" noChangeAspect="1"/>
+            </wp:cNvGraphicFramePr>
+            <a:graphic xmlns:a="http://schemas.openxmlformats.org/drawingml/2006/main">
+              <a:graphicData uri="http://schemas.openxmlformats.org/drawingml/2006/picture">
+                <pic:pic xmlns:pic="http://schemas.openxmlformats.org/drawingml/2006/picture">
+                  <pic:nvPicPr>
+                    <pic:cNvPr id="1393973104" name=""/>
+                    <pic:cNvPicPr/>
+                  </pic:nvPicPr>
+                  <pic:blipFill>
+                    <a:blip r:embed="rId13" cstate="print">
                       <a:extLst>
                         <a:ext uri="{28A0092B-C50C-407E-A947-70E740481C1C}">
                           <a14:useLocalDpi xmlns:a14="http://schemas.microsoft.com/office/drawing/2010/main" val="0"/>
@@ -3449,7 +3993,702 @@
                   <pic:spPr>
                     <a:xfrm>
                       <a:off x="0" y="0"/>
-                      <a:ext cx="4791075" cy="4000500"/>
+                      <a:ext cx="3860800" cy="3088640"/>
+                    </a:xfrm>
+                    <a:prstGeom prst="rect">
+                      <a:avLst/>
+                    </a:prstGeom>
+                    <a:ln w="38100" cap="sq">
+                      <a:solidFill>
+                        <a:srgbClr val="000000"/>
+                      </a:solidFill>
+                      <a:prstDash val="solid"/>
+                      <a:miter lim="800000"/>
+                    </a:ln>
+                    <a:effectLst>
+                      <a:outerShdw blurRad="50800" dist="38100" dir="2700000" algn="tl" rotWithShape="0">
+                        <a:srgbClr val="000000">
+                          <a:alpha val="43000"/>
+                        </a:srgbClr>
+                      </a:outerShdw>
+                    </a:effectLst>
+                  </pic:spPr>
+                </pic:pic>
+              </a:graphicData>
+            </a:graphic>
+            <wp14:sizeRelH relativeFrom="margin">
+              <wp14:pctWidth>0</wp14:pctWidth>
+            </wp14:sizeRelH>
+            <wp14:sizeRelV relativeFrom="margin">
+              <wp14:pctHeight>0</wp14:pctHeight>
+            </wp14:sizeRelV>
+          </wp:anchor>
+        </w:drawing>
+      </w:r>
+      <w:r>
+        <w:rPr>
+          <w:noProof/>
+          <w:lang w:val="es-PE"/>
+        </w:rPr>
+        <w:drawing>
+          <wp:inline distT="0" distB="0" distL="0" distR="0" wp14:anchorId="2616518D" wp14:editId="3EAD16C4">
+            <wp:extent cx="5399442" cy="2968737"/>
+            <wp:effectExtent l="76200" t="76200" r="125095" b="136525"/>
+            <wp:docPr id="79623167" name="Imagen 1"/>
+            <wp:cNvGraphicFramePr>
+              <a:graphicFrameLocks xmlns:a="http://schemas.openxmlformats.org/drawingml/2006/main" noChangeAspect="1"/>
+            </wp:cNvGraphicFramePr>
+            <a:graphic xmlns:a="http://schemas.openxmlformats.org/drawingml/2006/main">
+              <a:graphicData uri="http://schemas.openxmlformats.org/drawingml/2006/picture">
+                <pic:pic xmlns:pic="http://schemas.openxmlformats.org/drawingml/2006/picture">
+                  <pic:nvPicPr>
+                    <pic:cNvPr id="79623167" name="Imagen 79623167"/>
+                    <pic:cNvPicPr/>
+                  </pic:nvPicPr>
+                  <pic:blipFill rotWithShape="1">
+                    <a:blip r:embed="rId14" cstate="print">
+                      <a:extLst>
+                        <a:ext uri="{28A0092B-C50C-407E-A947-70E740481C1C}">
+                          <a14:useLocalDpi xmlns:a14="http://schemas.microsoft.com/office/drawing/2010/main" val="0"/>
+                        </a:ext>
+                      </a:extLst>
+                    </a:blip>
+                    <a:srcRect t="10426" b="11815"/>
+                    <a:stretch>
+                      <a:fillRect/>
+                    </a:stretch>
+                  </pic:blipFill>
+                  <pic:spPr bwMode="auto">
+                    <a:xfrm>
+                      <a:off x="0" y="0"/>
+                      <a:ext cx="5400040" cy="2969066"/>
+                    </a:xfrm>
+                    <a:prstGeom prst="rect">
+                      <a:avLst/>
+                    </a:prstGeom>
+                    <a:ln w="38100" cap="sq">
+                      <a:solidFill>
+                        <a:srgbClr val="000000"/>
+                      </a:solidFill>
+                      <a:prstDash val="solid"/>
+                      <a:miter lim="800000"/>
+                    </a:ln>
+                    <a:effectLst>
+                      <a:outerShdw blurRad="50800" dist="38100" dir="2700000" algn="tl" rotWithShape="0">
+                        <a:srgbClr val="000000">
+                          <a:alpha val="43000"/>
+                        </a:srgbClr>
+                      </a:outerShdw>
+                    </a:effectLst>
+                    <a:extLst>
+                      <a:ext uri="{53640926-AAD7-44D8-BBD7-CCE9431645EC}">
+                        <a14:shadowObscured xmlns:a14="http://schemas.microsoft.com/office/drawing/2010/main"/>
+                      </a:ext>
+                    </a:extLst>
+                  </pic:spPr>
+                </pic:pic>
+              </a:graphicData>
+            </a:graphic>
+          </wp:inline>
+        </w:drawing>
+      </w:r>
+    </w:p>
+    <w:p>
+      <w:pPr>
+        <w:jc w:val="both"/>
+        <w:rPr>
+          <w:lang w:val="en-US"/>
+        </w:rPr>
+      </w:pPr>
+    </w:p>
+    <w:p>
+      <w:pPr>
+        <w:jc w:val="both"/>
+        <w:rPr>
+          <w:lang w:val="en-US"/>
+        </w:rPr>
+      </w:pPr>
+    </w:p>
+    <w:p>
+      <w:pPr>
+        <w:rPr>
+          <w:lang w:val="en-US"/>
+        </w:rPr>
+      </w:pPr>
+    </w:p>
+    <w:p>
+      <w:pPr>
+        <w:rPr>
+          <w:lang w:val="en-US"/>
+        </w:rPr>
+      </w:pPr>
+    </w:p>
+    <w:p>
+      <w:pPr>
+        <w:rPr>
+          <w:lang w:val="en-US"/>
+        </w:rPr>
+      </w:pPr>
+    </w:p>
+    <w:p>
+      <w:pPr>
+        <w:rPr>
+          <w:lang w:val="en-US"/>
+        </w:rPr>
+      </w:pPr>
+    </w:p>
+    <w:p>
+      <w:pPr>
+        <w:rPr>
+          <w:lang w:val="en-US"/>
+        </w:rPr>
+      </w:pPr>
+    </w:p>
+    <w:p>
+      <w:pPr>
+        <w:rPr>
+          <w:lang w:val="en-US"/>
+        </w:rPr>
+      </w:pPr>
+    </w:p>
+    <w:p>
+      <w:pPr>
+        <w:rPr>
+          <w:lang w:val="en-US"/>
+        </w:rPr>
+      </w:pPr>
+    </w:p>
+    <w:p>
+      <w:pPr>
+        <w:rPr>
+          <w:lang w:val="en-US"/>
+        </w:rPr>
+      </w:pPr>
+    </w:p>
+    <w:p>
+      <w:pPr>
+        <w:rPr>
+          <w:lang w:val="en-US"/>
+        </w:rPr>
+      </w:pPr>
+    </w:p>
+    <w:p>
+      <w:pPr>
+        <w:rPr>
+          <w:lang w:val="en-US"/>
+        </w:rPr>
+      </w:pPr>
+    </w:p>
+    <w:p>
+      <w:pPr>
+        <w:rPr>
+          <w:lang w:val="en-US"/>
+        </w:rPr>
+      </w:pPr>
+    </w:p>
+    <w:p>
+      <w:pPr>
+        <w:rPr>
+          <w:lang w:val="en-US"/>
+        </w:rPr>
+      </w:pPr>
+      <w:r>
+        <w:rPr>
+          <w:lang w:val="en-US"/>
+        </w:rPr>
+        <w:lastRenderedPageBreak/>
+        <w:drawing>
+          <wp:anchor distT="0" distB="0" distL="114300" distR="114300" simplePos="0" relativeHeight="251660288" behindDoc="0" locked="0" layoutInCell="1" allowOverlap="1" wp14:anchorId="4A092B4F" wp14:editId="0F580464">
+            <wp:simplePos x="0" y="0"/>
+            <wp:positionH relativeFrom="margin">
+              <wp:align>center</wp:align>
+            </wp:positionH>
+            <wp:positionV relativeFrom="paragraph">
+              <wp:posOffset>4621432</wp:posOffset>
+            </wp:positionV>
+            <wp:extent cx="4778604" cy="4127334"/>
+            <wp:effectExtent l="76200" t="76200" r="136525" b="140335"/>
+            <wp:wrapSquare wrapText="bothSides"/>
+            <wp:docPr id="1840926403" name="Imagen 1"/>
+            <wp:cNvGraphicFramePr>
+              <a:graphicFrameLocks xmlns:a="http://schemas.openxmlformats.org/drawingml/2006/main" noChangeAspect="1"/>
+            </wp:cNvGraphicFramePr>
+            <a:graphic xmlns:a="http://schemas.openxmlformats.org/drawingml/2006/main">
+              <a:graphicData uri="http://schemas.openxmlformats.org/drawingml/2006/picture">
+                <pic:pic xmlns:pic="http://schemas.openxmlformats.org/drawingml/2006/picture">
+                  <pic:nvPicPr>
+                    <pic:cNvPr id="1840926403" name=""/>
+                    <pic:cNvPicPr/>
+                  </pic:nvPicPr>
+                  <pic:blipFill>
+                    <a:blip r:embed="rId15" cstate="print">
+                      <a:extLst>
+                        <a:ext uri="{28A0092B-C50C-407E-A947-70E740481C1C}">
+                          <a14:useLocalDpi xmlns:a14="http://schemas.microsoft.com/office/drawing/2010/main" val="0"/>
+                        </a:ext>
+                      </a:extLst>
+                    </a:blip>
+                    <a:stretch>
+                      <a:fillRect/>
+                    </a:stretch>
+                  </pic:blipFill>
+                  <pic:spPr>
+                    <a:xfrm>
+                      <a:off x="0" y="0"/>
+                      <a:ext cx="4778604" cy="4127334"/>
+                    </a:xfrm>
+                    <a:prstGeom prst="rect">
+                      <a:avLst/>
+                    </a:prstGeom>
+                    <a:ln w="38100" cap="sq">
+                      <a:solidFill>
+                        <a:srgbClr val="000000"/>
+                      </a:solidFill>
+                      <a:prstDash val="solid"/>
+                      <a:miter lim="800000"/>
+                    </a:ln>
+                    <a:effectLst>
+                      <a:outerShdw blurRad="50800" dist="38100" dir="2700000" algn="tl" rotWithShape="0">
+                        <a:srgbClr val="000000">
+                          <a:alpha val="43000"/>
+                        </a:srgbClr>
+                      </a:outerShdw>
+                    </a:effectLst>
+                  </pic:spPr>
+                </pic:pic>
+              </a:graphicData>
+            </a:graphic>
+            <wp14:sizeRelH relativeFrom="margin">
+              <wp14:pctWidth>0</wp14:pctWidth>
+            </wp14:sizeRelH>
+            <wp14:sizeRelV relativeFrom="margin">
+              <wp14:pctHeight>0</wp14:pctHeight>
+            </wp14:sizeRelV>
+          </wp:anchor>
+        </w:drawing>
+      </w:r>
+      <w:r>
+        <w:rPr>
+          <w:lang w:val="en-US"/>
+        </w:rPr>
+        <w:drawing>
+          <wp:anchor distT="0" distB="0" distL="114300" distR="114300" simplePos="0" relativeHeight="251659264" behindDoc="0" locked="0" layoutInCell="1" allowOverlap="1" wp14:anchorId="1B5F572D" wp14:editId="0B10674F">
+            <wp:simplePos x="0" y="0"/>
+            <wp:positionH relativeFrom="margin">
+              <wp:align>center</wp:align>
+            </wp:positionH>
+            <wp:positionV relativeFrom="paragraph">
+              <wp:posOffset>76298</wp:posOffset>
+            </wp:positionV>
+            <wp:extent cx="4795520" cy="4382135"/>
+            <wp:effectExtent l="76200" t="76200" r="138430" b="132715"/>
+            <wp:wrapSquare wrapText="bothSides"/>
+            <wp:docPr id="1414574992" name="Imagen 1"/>
+            <wp:cNvGraphicFramePr>
+              <a:graphicFrameLocks xmlns:a="http://schemas.openxmlformats.org/drawingml/2006/main" noChangeAspect="1"/>
+            </wp:cNvGraphicFramePr>
+            <a:graphic xmlns:a="http://schemas.openxmlformats.org/drawingml/2006/main">
+              <a:graphicData uri="http://schemas.openxmlformats.org/drawingml/2006/picture">
+                <pic:pic xmlns:pic="http://schemas.openxmlformats.org/drawingml/2006/picture">
+                  <pic:nvPicPr>
+                    <pic:cNvPr id="1414574992" name=""/>
+                    <pic:cNvPicPr/>
+                  </pic:nvPicPr>
+                  <pic:blipFill>
+                    <a:blip r:embed="rId16" cstate="print">
+                      <a:extLst>
+                        <a:ext uri="{28A0092B-C50C-407E-A947-70E740481C1C}">
+                          <a14:useLocalDpi xmlns:a14="http://schemas.microsoft.com/office/drawing/2010/main" val="0"/>
+                        </a:ext>
+                      </a:extLst>
+                    </a:blip>
+                    <a:stretch>
+                      <a:fillRect/>
+                    </a:stretch>
+                  </pic:blipFill>
+                  <pic:spPr>
+                    <a:xfrm>
+                      <a:off x="0" y="0"/>
+                      <a:ext cx="4795520" cy="4382135"/>
+                    </a:xfrm>
+                    <a:prstGeom prst="rect">
+                      <a:avLst/>
+                    </a:prstGeom>
+                    <a:ln w="38100" cap="sq">
+                      <a:solidFill>
+                        <a:srgbClr val="000000"/>
+                      </a:solidFill>
+                      <a:prstDash val="solid"/>
+                      <a:miter lim="800000"/>
+                    </a:ln>
+                    <a:effectLst>
+                      <a:outerShdw blurRad="50800" dist="38100" dir="2700000" algn="tl" rotWithShape="0">
+                        <a:srgbClr val="000000">
+                          <a:alpha val="43000"/>
+                        </a:srgbClr>
+                      </a:outerShdw>
+                    </a:effectLst>
+                  </pic:spPr>
+                </pic:pic>
+              </a:graphicData>
+            </a:graphic>
+            <wp14:sizeRelH relativeFrom="margin">
+              <wp14:pctWidth>0</wp14:pctWidth>
+            </wp14:sizeRelH>
+            <wp14:sizeRelV relativeFrom="margin">
+              <wp14:pctHeight>0</wp14:pctHeight>
+            </wp14:sizeRelV>
+          </wp:anchor>
+        </w:drawing>
+      </w:r>
+      <w:r>
+        <w:rPr>
+          <w:lang w:val="en-US"/>
+        </w:rPr>
+        <w:br w:type="page"/>
+      </w:r>
+    </w:p>
+    <w:p>
+      <w:pPr>
+        <w:rPr>
+          <w:lang w:val="en-US"/>
+        </w:rPr>
+      </w:pPr>
+      <w:r>
+        <w:rPr>
+          <w:lang w:val="en-US"/>
+        </w:rPr>
+        <w:lastRenderedPageBreak/>
+        <w:drawing>
+          <wp:anchor distT="0" distB="0" distL="114300" distR="114300" simplePos="0" relativeHeight="251661312" behindDoc="0" locked="0" layoutInCell="1" allowOverlap="1" wp14:anchorId="32F4B75D" wp14:editId="5A7E500A">
+            <wp:simplePos x="0" y="0"/>
+            <wp:positionH relativeFrom="margin">
+              <wp:align>center</wp:align>
+            </wp:positionH>
+            <wp:positionV relativeFrom="paragraph">
+              <wp:posOffset>76298</wp:posOffset>
+            </wp:positionV>
+            <wp:extent cx="4448175" cy="4667250"/>
+            <wp:effectExtent l="76200" t="76200" r="142875" b="133350"/>
+            <wp:wrapSquare wrapText="bothSides"/>
+            <wp:docPr id="176803439" name="Imagen 1"/>
+            <wp:cNvGraphicFramePr>
+              <a:graphicFrameLocks xmlns:a="http://schemas.openxmlformats.org/drawingml/2006/main" noChangeAspect="1"/>
+            </wp:cNvGraphicFramePr>
+            <a:graphic xmlns:a="http://schemas.openxmlformats.org/drawingml/2006/main">
+              <a:graphicData uri="http://schemas.openxmlformats.org/drawingml/2006/picture">
+                <pic:pic xmlns:pic="http://schemas.openxmlformats.org/drawingml/2006/picture">
+                  <pic:nvPicPr>
+                    <pic:cNvPr id="176803439" name=""/>
+                    <pic:cNvPicPr/>
+                  </pic:nvPicPr>
+                  <pic:blipFill>
+                    <a:blip r:embed="rId17" cstate="print">
+                      <a:extLst>
+                        <a:ext uri="{28A0092B-C50C-407E-A947-70E740481C1C}">
+                          <a14:useLocalDpi xmlns:a14="http://schemas.microsoft.com/office/drawing/2010/main" val="0"/>
+                        </a:ext>
+                      </a:extLst>
+                    </a:blip>
+                    <a:stretch>
+                      <a:fillRect/>
+                    </a:stretch>
+                  </pic:blipFill>
+                  <pic:spPr>
+                    <a:xfrm>
+                      <a:off x="0" y="0"/>
+                      <a:ext cx="4448175" cy="4667250"/>
+                    </a:xfrm>
+                    <a:prstGeom prst="rect">
+                      <a:avLst/>
+                    </a:prstGeom>
+                    <a:ln w="38100" cap="sq">
+                      <a:solidFill>
+                        <a:srgbClr val="000000"/>
+                      </a:solidFill>
+                      <a:prstDash val="solid"/>
+                      <a:miter lim="800000"/>
+                    </a:ln>
+                    <a:effectLst>
+                      <a:outerShdw blurRad="50800" dist="38100" dir="2700000" algn="tl" rotWithShape="0">
+                        <a:srgbClr val="000000">
+                          <a:alpha val="43000"/>
+                        </a:srgbClr>
+                      </a:outerShdw>
+                    </a:effectLst>
+                  </pic:spPr>
+                </pic:pic>
+              </a:graphicData>
+            </a:graphic>
+            <wp14:sizeRelH relativeFrom="margin">
+              <wp14:pctWidth>0</wp14:pctWidth>
+            </wp14:sizeRelH>
+            <wp14:sizeRelV relativeFrom="margin">
+              <wp14:pctHeight>0</wp14:pctHeight>
+            </wp14:sizeRelV>
+          </wp:anchor>
+        </w:drawing>
+      </w:r>
+    </w:p>
+    <w:p>
+      <w:pPr>
+        <w:rPr>
+          <w:lang w:val="en-US"/>
+        </w:rPr>
+      </w:pPr>
+    </w:p>
+    <w:p>
+      <w:pPr>
+        <w:rPr>
+          <w:lang w:val="en-US"/>
+        </w:rPr>
+      </w:pPr>
+    </w:p>
+    <w:p>
+      <w:pPr>
+        <w:rPr>
+          <w:lang w:val="en-US"/>
+        </w:rPr>
+      </w:pPr>
+    </w:p>
+    <w:p>
+      <w:pPr>
+        <w:rPr>
+          <w:lang w:val="en-US"/>
+        </w:rPr>
+      </w:pPr>
+    </w:p>
+    <w:p>
+      <w:pPr>
+        <w:rPr>
+          <w:lang w:val="en-US"/>
+        </w:rPr>
+      </w:pPr>
+    </w:p>
+    <w:p>
+      <w:pPr>
+        <w:rPr>
+          <w:lang w:val="en-US"/>
+        </w:rPr>
+      </w:pPr>
+    </w:p>
+    <w:p>
+      <w:r>
+        <w:rPr>
+          <w:noProof/>
+        </w:rPr>
+        <w:drawing>
+          <wp:inline distT="0" distB="0" distL="0" distR="0" wp14:anchorId="1130F8FD" wp14:editId="2F2FC07B">
+            <wp:extent cx="5400040" cy="2675255"/>
+            <wp:effectExtent l="76200" t="76200" r="124460" b="125095"/>
+            <wp:docPr id="1874365192" name="Imagen 3"/>
+            <wp:cNvGraphicFramePr>
+              <a:graphicFrameLocks xmlns:a="http://schemas.openxmlformats.org/drawingml/2006/main" noChangeAspect="1"/>
+            </wp:cNvGraphicFramePr>
+            <a:graphic xmlns:a="http://schemas.openxmlformats.org/drawingml/2006/main">
+              <a:graphicData uri="http://schemas.openxmlformats.org/drawingml/2006/picture">
+                <pic:pic xmlns:pic="http://schemas.openxmlformats.org/drawingml/2006/picture">
+                  <pic:nvPicPr>
+                    <pic:cNvPr id="1874365192" name="Imagen 1874365192"/>
+                    <pic:cNvPicPr/>
+                  </pic:nvPicPr>
+                  <pic:blipFill>
+                    <a:blip r:embed="rId18">
+                      <a:extLst>
+                        <a:ext uri="{28A0092B-C50C-407E-A947-70E740481C1C}">
+                          <a14:useLocalDpi xmlns:a14="http://schemas.microsoft.com/office/drawing/2010/main" val="0"/>
+                        </a:ext>
+                      </a:extLst>
+                    </a:blip>
+                    <a:stretch>
+                      <a:fillRect/>
+                    </a:stretch>
+                  </pic:blipFill>
+                  <pic:spPr>
+                    <a:xfrm>
+                      <a:off x="0" y="0"/>
+                      <a:ext cx="5400040" cy="2675255"/>
+                    </a:xfrm>
+                    <a:prstGeom prst="rect">
+                      <a:avLst/>
+                    </a:prstGeom>
+                    <a:ln w="38100" cap="sq">
+                      <a:solidFill>
+                        <a:srgbClr val="000000"/>
+                      </a:solidFill>
+                      <a:prstDash val="solid"/>
+                      <a:miter lim="800000"/>
+                    </a:ln>
+                    <a:effectLst>
+                      <a:outerShdw blurRad="50800" dist="38100" dir="2700000" algn="tl" rotWithShape="0">
+                        <a:srgbClr val="000000">
+                          <a:alpha val="43000"/>
+                        </a:srgbClr>
+                      </a:outerShdw>
+                    </a:effectLst>
+                  </pic:spPr>
+                </pic:pic>
+              </a:graphicData>
+            </a:graphic>
+          </wp:inline>
+        </w:drawing>
+      </w:r>
+    </w:p>
+    <w:p>
+      <w:pPr>
+        <w:spacing w:line="360" w:lineRule="auto"/>
+        <w:jc w:val="both"/>
+        <w:rPr>
+          <w:sz w:val="20"/>
+          <w:szCs w:val="20"/>
+          <w:lang w:val="es-PE"/>
+        </w:rPr>
+      </w:pPr>
+      <w:r>
+        <w:rPr>
+          <w:sz w:val="22"/>
+          <w:szCs w:val="22"/>
+          <w:lang w:val="es-PE"/>
+        </w:rPr>
+        <w:t xml:space="preserve">El prototipo presenta la pantalla de búsqueda y confirmación de recojo de una reserva. El encargado ingresa el código proporcionado por el consumidor y, al realizar la búsqueda, se muestran los datos principales asociados a la reserva. Posteriormente, mediante el botón de </w:t>
+      </w:r>
+      <w:r>
+        <w:rPr>
+          <w:sz w:val="22"/>
+          <w:szCs w:val="22"/>
+          <w:lang w:val="es-PE"/>
+        </w:rPr>
+        <w:lastRenderedPageBreak/>
+        <w:t>confirmación, se registra la entrega y el estado cambia a entregado. Una vez utilizado, el código queda identificado como no disponible para un nuevo recojo, evitando su reutilización.</w:t>
+      </w:r>
+    </w:p>
+    <w:p>
+      <w:pPr>
+        <w:pStyle w:val="Ttulo2"/>
+        <w:rPr>
+          <w:rFonts w:cs="Times New Roman"/>
+        </w:rPr>
+      </w:pPr>
+      <w:bookmarkStart w:id="22" w:name="_Toc239694155"/>
+      <w:r>
+        <w:rPr>
+          <w:rFonts w:cs="Times New Roman"/>
+        </w:rPr>
+        <w:t>Componentes de la aplicación</w:t>
+      </w:r>
+      <w:bookmarkEnd w:id="22"/>
+      <w:r>
+        <w:rPr>
+          <w:rFonts w:cs="Times New Roman"/>
+        </w:rPr>
+        <w:t xml:space="preserve"> (MySQL + Spring Data JPA)</w:t>
+      </w:r>
+    </w:p>
+    <w:p>
+      <w:pPr>
+        <w:spacing w:line="360" w:lineRule="auto"/>
+        <w:jc w:val="both"/>
+        <w:rPr>
+          <w:lang w:val="es-PE"/>
+        </w:rPr>
+      </w:pPr>
+      <w:r>
+        <w:rPr>
+          <w:sz w:val="22"/>
+          <w:szCs w:val="22"/>
+        </w:rPr>
+        <w:t xml:space="preserve">El material establece MySQL + Spring Data JPA como requerimiento técnico, pero el </w:t>
+      </w:r>
+      <w:proofErr w:type="spellStart"/>
+      <w:r>
+        <w:rPr>
+          <w:sz w:val="22"/>
+          <w:szCs w:val="22"/>
+        </w:rPr>
+        <w:t>backend</w:t>
+      </w:r>
+      <w:proofErr w:type="spellEnd"/>
+      <w:r>
+        <w:rPr>
+          <w:sz w:val="22"/>
+          <w:szCs w:val="22"/>
+        </w:rPr>
+        <w:t xml:space="preserve"> base, la versión de Spring Boot, el nombre de la base de datos y la política </w:t>
+      </w:r>
+      <w:proofErr w:type="spellStart"/>
+      <w:r>
+        <w:rPr>
+          <w:sz w:val="22"/>
+          <w:szCs w:val="22"/>
+        </w:rPr>
+        <w:t>ddl</w:t>
+      </w:r>
+      <w:proofErr w:type="spellEnd"/>
+      <w:r>
+        <w:rPr>
+          <w:sz w:val="22"/>
+          <w:szCs w:val="22"/>
+        </w:rPr>
+        <w:t xml:space="preserve">-auto aún no estaban determinados. Por ello, esta sección debe describir el rol de cada componente y una plantilla de configuración, sin presentarla como evidencia de que el </w:t>
+      </w:r>
+      <w:proofErr w:type="spellStart"/>
+      <w:r>
+        <w:rPr>
+          <w:sz w:val="22"/>
+          <w:szCs w:val="22"/>
+        </w:rPr>
+        <w:t>backend</w:t>
+      </w:r>
+      <w:proofErr w:type="spellEnd"/>
+      <w:r>
+        <w:rPr>
+          <w:sz w:val="22"/>
+          <w:szCs w:val="22"/>
+        </w:rPr>
+        <w:t xml:space="preserve"> ya está integrado.</w:t>
+      </w:r>
+    </w:p>
+    <w:p>
+      <w:pPr>
+        <w:rPr>
+          <w:lang w:val="es-PE"/>
+        </w:rPr>
+      </w:pPr>
+      <w:r>
+        <w:rPr>
+          <w:noProof/>
+        </w:rPr>
+        <w:drawing>
+          <wp:inline distT="0" distB="0" distL="0" distR="0" wp14:anchorId="0046EA61" wp14:editId="354B52A2">
+            <wp:extent cx="5400040" cy="1090393"/>
+            <wp:effectExtent l="0" t="0" r="0" b="0"/>
+            <wp:docPr id="565277133" name="drawing"/>
+            <wp:cNvGraphicFramePr>
+              <a:graphicFrameLocks xmlns:a="http://schemas.openxmlformats.org/drawingml/2006/main" noChangeAspect="1"/>
+            </wp:cNvGraphicFramePr>
+            <a:graphic xmlns:a="http://schemas.openxmlformats.org/drawingml/2006/main">
+              <a:graphicData uri="http://schemas.openxmlformats.org/drawingml/2006/picture">
+                <pic:pic xmlns:pic="http://schemas.openxmlformats.org/drawingml/2006/picture">
+                  <pic:nvPicPr>
+                    <pic:cNvPr id="565277133" name="Picture 565277133"/>
+                    <pic:cNvPicPr/>
+                  </pic:nvPicPr>
+                  <pic:blipFill>
+                    <a:blip r:embed="rId19">
+                      <a:extLst>
+                        <a:ext uri="{28A0092B-C50C-407E-A947-70E740481C1C}">
+                          <a14:useLocalDpi xmlns:a14="http://schemas.microsoft.com/office/drawing/2010/main"/>
+                        </a:ext>
+                      </a:extLst>
+                    </a:blip>
+                    <a:stretch>
+                      <a:fillRect/>
+                    </a:stretch>
+                  </pic:blipFill>
+                  <pic:spPr>
+                    <a:xfrm>
+                      <a:off x="0" y="0"/>
+                      <a:ext cx="5400040" cy="1090393"/>
                     </a:xfrm>
                     <a:prstGeom prst="rect">
                       <a:avLst/>
@@ -3469,60 +4708,6 @@
           <w:rFonts w:cs="Times New Roman"/>
         </w:rPr>
       </w:pPr>
-      <w:bookmarkStart w:id="20" w:name="_Toc239694153"/>
-      <w:r>
-        <w:rPr>
-          <w:rFonts w:cs="Times New Roman"/>
-        </w:rPr>
-        <w:t>Diagrama ER de base de datos</w:t>
-      </w:r>
-      <w:bookmarkEnd w:id="20"/>
-    </w:p>
-    <w:p>
-      <w:pPr>
-        <w:pStyle w:val="Ttulo2"/>
-        <w:rPr>
-          <w:rFonts w:cs="Times New Roman"/>
-        </w:rPr>
-      </w:pPr>
-      <w:bookmarkStart w:id="21" w:name="_Toc239694154"/>
-      <w:r>
-        <w:rPr>
-          <w:rFonts w:cs="Times New Roman"/>
-        </w:rPr>
-        <w:t>Presentación del prototipo</w:t>
-      </w:r>
-      <w:bookmarkEnd w:id="21"/>
-      <w:r>
-        <w:rPr>
-          <w:rFonts w:cs="Times New Roman"/>
-        </w:rPr>
-        <w:t xml:space="preserve"> </w:t>
-      </w:r>
-    </w:p>
-    <w:p>
-      <w:pPr>
-        <w:pStyle w:val="Ttulo2"/>
-        <w:rPr>
-          <w:rFonts w:cs="Times New Roman"/>
-        </w:rPr>
-      </w:pPr>
-      <w:bookmarkStart w:id="22" w:name="_Toc239694155"/>
-      <w:r>
-        <w:rPr>
-          <w:rFonts w:cs="Times New Roman"/>
-        </w:rPr>
-        <w:t>Componentes de la aplicación</w:t>
-      </w:r>
-      <w:bookmarkEnd w:id="22"/>
-    </w:p>
-    <w:p>
-      <w:pPr>
-        <w:pStyle w:val="Ttulo2"/>
-        <w:rPr>
-          <w:rFonts w:cs="Times New Roman"/>
-        </w:rPr>
-      </w:pPr>
       <w:bookmarkStart w:id="23" w:name="_Toc239694156"/>
       <w:r>
         <w:rPr>
@@ -3539,6 +4724,47 @@
           <w:rFonts w:cs="Times New Roman"/>
         </w:rPr>
       </w:pPr>
+    </w:p>
+    <w:p>
+      <w:pPr>
+        <w:rPr>
+          <w:rFonts w:cs="Times New Roman"/>
+        </w:rPr>
+      </w:pPr>
+    </w:p>
+    <w:p>
+      <w:pPr>
+        <w:rPr>
+          <w:rFonts w:cs="Times New Roman"/>
+        </w:rPr>
+      </w:pPr>
+    </w:p>
+    <w:p>
+      <w:pPr>
+        <w:rPr>
+          <w:rFonts w:cs="Times New Roman"/>
+        </w:rPr>
+      </w:pPr>
+      <w:r>
+        <w:rPr>
+          <w:rFonts w:cs="Times New Roman"/>
+        </w:rPr>
+        <w:br w:type="page"/>
+      </w:r>
+    </w:p>
+    <w:p>
+      <w:pPr>
+        <w:rPr>
+          <w:rFonts w:cs="Times New Roman"/>
+        </w:rPr>
+      </w:pPr>
+      <w:r>
+        <w:rPr>
+          <w:rFonts w:cs="Times New Roman"/>
+        </w:rPr>
+        <w:lastRenderedPageBreak/>
+        <w:br w:type="page"/>
+      </w:r>
     </w:p>
     <w:p>
       <w:pPr>
@@ -3557,6 +4783,7 @@
         <w:rPr>
           <w:rFonts w:cs="Times New Roman"/>
         </w:rPr>
+        <w:lastRenderedPageBreak/>
         <w:t>CONCLUSIONES</w:t>
       </w:r>
       <w:r>
@@ -3640,6 +4867,24 @@
     <w:p/>
     <w:p/>
     <w:p/>
+    <w:p/>
+    <w:p/>
+    <w:p/>
+    <w:p/>
+    <w:p/>
+    <w:p/>
+    <w:p/>
+    <w:p/>
+    <w:p/>
+    <w:p/>
+    <w:p/>
+    <w:p/>
+    <w:p/>
+    <w:p/>
+    <w:p/>
+    <w:p/>
+    <w:p/>
+    <w:p/>
     <w:p>
       <w:pPr>
         <w:pStyle w:val="Ttulo1"/>
@@ -3712,7 +4957,7 @@
         </w:rPr>
         <w:t xml:space="preserve">[En línea]. Disponible en: </w:t>
       </w:r>
-      <w:hyperlink r:id="rId10" w:history="1">
+      <w:hyperlink r:id="rId20" w:history="1">
         <w:r>
           <w:rPr>
             <w:rStyle w:val="Hipervnculo"/>
@@ -3822,7 +5067,7 @@
         </w:rPr>
         <w:t xml:space="preserve">[En línea]. Disponible en: </w:t>
       </w:r>
-      <w:hyperlink r:id="rId11" w:history="1">
+      <w:hyperlink r:id="rId21" w:history="1">
         <w:r>
           <w:rPr>
             <w:rStyle w:val="Hipervnculo"/>
@@ -3839,6 +5084,28 @@
       </w:r>
     </w:p>
     <w:p/>
+    <w:p/>
+    <w:p/>
+    <w:p/>
+    <w:p/>
+    <w:p/>
+    <w:p/>
+    <w:p/>
+    <w:p/>
+    <w:p/>
+    <w:p/>
+    <w:p/>
+    <w:p/>
+    <w:p/>
+    <w:p/>
+    <w:p/>
+    <w:p/>
+    <w:p/>
+    <w:p/>
+    <w:p/>
+    <w:p/>
+    <w:p/>
+    <w:p/>
     <w:p>
       <w:pPr>
         <w:pStyle w:val="Ttulo1"/>
@@ -3858,6 +5125,7 @@
         <w:rPr>
           <w:rFonts w:cs="Times New Roman"/>
         </w:rPr>
+        <w:lastRenderedPageBreak/>
         <w:t>ANEXOS</w:t>
       </w:r>
       <w:bookmarkEnd w:id="31"/>
@@ -4032,7 +5300,7 @@
       </w:pPr>
     </w:p>
     <w:sectPr>
-      <w:footerReference w:type="default" r:id="rId12"/>
+      <w:footerReference w:type="default" r:id="rId22"/>
       <w:pgSz w:w="11906" w:h="16838" w:code="9"/>
       <w:pgMar w:top="1418" w:right="1701" w:bottom="1418" w:left="1701" w:header="709" w:footer="709" w:gutter="0"/>
       <w:cols w:space="708"/>
@@ -4491,6 +5759,95 @@
     </w:lvl>
   </w:abstractNum>
   <w:abstractNum w:abstractNumId="3" w15:restartNumberingAfterBreak="0">
+    <w:nsid w:val="50B02BE7"/>
+    <w:multiLevelType w:val="hybridMultilevel"/>
+    <w:tmpl w:val="67128DF2"/>
+    <w:lvl w:ilvl="0" w:tplc="159EC3CE">
+      <w:start w:val="1"/>
+      <w:numFmt w:val="decimal"/>
+      <w:lvlText w:val="3.5.%1"/>
+      <w:lvlJc w:val="left"/>
+      <w:pPr>
+        <w:ind w:left="720" w:hanging="360"/>
+      </w:pPr>
+      <w:rPr>
+        <w:rFonts w:hint="default"/>
+      </w:rPr>
+    </w:lvl>
+    <w:lvl w:ilvl="1" w:tplc="280A0019" w:tentative="1">
+      <w:start w:val="1"/>
+      <w:numFmt w:val="lowerLetter"/>
+      <w:lvlText w:val="%2."/>
+      <w:lvlJc w:val="left"/>
+      <w:pPr>
+        <w:ind w:left="1440" w:hanging="360"/>
+      </w:pPr>
+    </w:lvl>
+    <w:lvl w:ilvl="2" w:tplc="280A001B" w:tentative="1">
+      <w:start w:val="1"/>
+      <w:numFmt w:val="lowerRoman"/>
+      <w:lvlText w:val="%3."/>
+      <w:lvlJc w:val="right"/>
+      <w:pPr>
+        <w:ind w:left="2160" w:hanging="180"/>
+      </w:pPr>
+    </w:lvl>
+    <w:lvl w:ilvl="3" w:tplc="280A000F" w:tentative="1">
+      <w:start w:val="1"/>
+      <w:numFmt w:val="decimal"/>
+      <w:lvlText w:val="%4."/>
+      <w:lvlJc w:val="left"/>
+      <w:pPr>
+        <w:ind w:left="2880" w:hanging="360"/>
+      </w:pPr>
+    </w:lvl>
+    <w:lvl w:ilvl="4" w:tplc="280A0019" w:tentative="1">
+      <w:start w:val="1"/>
+      <w:numFmt w:val="lowerLetter"/>
+      <w:lvlText w:val="%5."/>
+      <w:lvlJc w:val="left"/>
+      <w:pPr>
+        <w:ind w:left="3600" w:hanging="360"/>
+      </w:pPr>
+    </w:lvl>
+    <w:lvl w:ilvl="5" w:tplc="280A001B" w:tentative="1">
+      <w:start w:val="1"/>
+      <w:numFmt w:val="lowerRoman"/>
+      <w:lvlText w:val="%6."/>
+      <w:lvlJc w:val="right"/>
+      <w:pPr>
+        <w:ind w:left="4320" w:hanging="180"/>
+      </w:pPr>
+    </w:lvl>
+    <w:lvl w:ilvl="6" w:tplc="280A000F" w:tentative="1">
+      <w:start w:val="1"/>
+      <w:numFmt w:val="decimal"/>
+      <w:lvlText w:val="%7."/>
+      <w:lvlJc w:val="left"/>
+      <w:pPr>
+        <w:ind w:left="5040" w:hanging="360"/>
+      </w:pPr>
+    </w:lvl>
+    <w:lvl w:ilvl="7" w:tplc="280A0019" w:tentative="1">
+      <w:start w:val="1"/>
+      <w:numFmt w:val="lowerLetter"/>
+      <w:lvlText w:val="%8."/>
+      <w:lvlJc w:val="left"/>
+      <w:pPr>
+        <w:ind w:left="5760" w:hanging="360"/>
+      </w:pPr>
+    </w:lvl>
+    <w:lvl w:ilvl="8" w:tplc="280A001B" w:tentative="1">
+      <w:start w:val="1"/>
+      <w:numFmt w:val="lowerRoman"/>
+      <w:lvlText w:val="%9."/>
+      <w:lvlJc w:val="right"/>
+      <w:pPr>
+        <w:ind w:left="6480" w:hanging="180"/>
+      </w:pPr>
+    </w:lvl>
+  </w:abstractNum>
+  <w:abstractNum w:abstractNumId="4" w15:restartNumberingAfterBreak="0">
     <w:nsid w:val="55014280"/>
     <w:multiLevelType w:val="multilevel"/>
     <w:tmpl w:val="151E8C76"/>
@@ -4588,7 +5945,7 @@
       </w:pPr>
     </w:lvl>
   </w:abstractNum>
-  <w:abstractNum w:abstractNumId="4" w15:restartNumberingAfterBreak="0">
+  <w:abstractNum w:abstractNumId="5" w15:restartNumberingAfterBreak="0">
     <w:nsid w:val="60863327"/>
     <w:multiLevelType w:val="hybridMultilevel"/>
     <w:tmpl w:val="CC126FE2"/>
@@ -4702,10 +6059,10 @@
     </w:lvl>
   </w:abstractNum>
   <w:num w:numId="1" w16cid:durableId="1226794499">
-    <w:abstractNumId w:val="3"/>
+    <w:abstractNumId w:val="4"/>
   </w:num>
   <w:num w:numId="2" w16cid:durableId="1713000286">
-    <w:abstractNumId w:val="4"/>
+    <w:abstractNumId w:val="5"/>
   </w:num>
   <w:num w:numId="3" w16cid:durableId="1176849368">
     <w:abstractNumId w:val="1"/>
@@ -4715,6 +6072,9 @@
   </w:num>
   <w:num w:numId="5" w16cid:durableId="700980336">
     <w:abstractNumId w:val="0"/>
+  </w:num>
+  <w:num w:numId="6" w16cid:durableId="386875247">
+    <w:abstractNumId w:val="3"/>
   </w:num>
   <w:numIdMacAtCleanup w:val="2"/>
 </w:numbering>
@@ -5354,6 +6714,7 @@
   <w:style w:type="character" w:default="1" w:styleId="Fuentedeprrafopredeter">
     <w:name w:val="Default Paragraph Font"/>
     <w:uiPriority w:val="1"/>
+    <w:semiHidden/>
     <w:unhideWhenUsed/>
   </w:style>
   <w:style w:type="table" w:default="1" w:styleId="Tablanormal">

</xml_diff>